<commit_message>
Physics-based bearing disturbance model: stiffness from geometry and preload, specified imperfections per bearing, waviness selection rule, rotor-bearing transmissibility; white paper updated
Co-Authored-By: Claude Opus 5.5 <noreply@anthropic.com>
Claude-Session: https://claude.ai/code/session_01AcuW3xSnVc4HeTATtgPH4G
</commit_message>
<xml_diff>
--- a/white_paper/Induced_Vibration_White_Paper.docx
+++ b/white_paper/Induced_Vibration_White_Paper.docx
@@ -41,7 +41,7 @@
         <w:pStyle w:val="BodyText"/>
       </w:pPr>
       <w:r>
-        <w:t xml:space="preserve">The second part applies those ideas to our assembly, which consists of two momentum wheels and a rotating arm, each on its own stationary shaft with a pair of tapered roller bearings. With no test data available, a purely analytical method was developed that estimates the six load components Fx, Fy, Fz, Mx, My and Mz from CAD mass properties, the eccentricity specification, the operating speeds and the bearing catalog. The paper describes the model, the choices made along the way and the reasons for them, and what the method does not cover. The resulting loads are conservative, hard-mounted estimates intended for early design, and they are meant to be refined as balance data, supplier data and test results become available.</w:t>
+        <w:t xml:space="preserve">The second part applies those ideas to our assembly, which consists of two momentum wheels and a rotating arm, each on its own stationary shaft with a pair of tapered roller bearings. With no test data available, a purely analytical method was developed that estimates the six load components Fx, Fy, Fz, Mx, My and Mz from CAD mass properties, the eccentricity specification, the operating speeds, and the bearing geometry, preload and specified imperfections. The paper describes the model, the choices made along the way and the reasons for them, and what the method does not cover. The resulting loads are conservative, hard-mounted estimates intended for early design, and they are meant to be refined as balance data, supplier data and test results become available.</w:t>
       </w:r>
     </w:p>
     <w:bookmarkEnd w:id="20"/>
@@ -2115,19 +2115,49 @@
         <w:pStyle w:val="BodyText"/>
       </w:pPr>
       <w:r>
-        <w:t xml:space="preserve">The frequencies can be calculated exactly from catalog data. The size of the disturbances cannot, since it depends on surface finish, roundness, preload, lubrication and wear, and in practice it is measured. In tapered roller bearings and other angular contact bearings, the rolling elements sit at the contact angle, so each lateral kick F</w:t>
+        <w:t xml:space="preserve">The frequencies can be calculated exactly from catalog data. The size of the disturbances depends on how large the imperfections are and how stiff the bearing is, and both can be estimated from geometry, preload and specified tolerances, as follows.</w:t>
+      </w:r>
+    </w:p>
+    <w:p>
+      <w:pPr>
+        <w:pStyle w:val="BodyText"/>
+      </w:pPr>
+      <w:r>
+        <w:rPr>
+          <w:bCs/>
+          <w:b/>
+        </w:rPr>
+        <w:t xml:space="preserve">Contact stiffness from preload.</w:t>
+      </w:r>
+      <w:r>
+        <w:t xml:space="preserve"> </w:t>
+      </w:r>
+      <w:r>
+        <w:t xml:space="preserve">An axial preload F</w:t>
       </w:r>
       <w:r>
         <w:rPr>
           <w:vertAlign w:val="subscript"/>
         </w:rPr>
-        <w:t xml:space="preserve">lat</w:t>
+        <w:t xml:space="preserve">pre</w:t>
       </w:r>
       <w:r>
         <w:t xml:space="preserve"> </w:t>
       </w:r>
       <w:r>
-        <w:t xml:space="preserve">also has a component along the shaft:</w:t>
+        <w:t xml:space="preserve">on an angular contact or tapered bearing is shared by the Z rolling elements, each carrying a load Q</w:t>
+      </w:r>
+      <w:r>
+        <w:rPr>
+          <w:vertAlign w:val="subscript"/>
+        </w:rPr>
+        <w:t xml:space="preserve">0</w:t>
+      </w:r>
+      <w:r>
+        <w:t xml:space="preserve"> </w:t>
+      </w:r>
+      <w:r>
+        <w:t xml:space="preserve">along its contact line. For roller (line) contacts, the deflection at each contact follows Palmgren’s empirical relation, in which δ is in millimeters, Q in newtons and the effective roller length l in millimeters. A roller has two contacts, one on each race, in series:</w:t>
       </w:r>
     </w:p>
     <w:p>
@@ -2145,21 +2175,12 @@
         <m:sSub>
           <m:e>
             <m:r>
-              <m:t>F</m:t>
+              <m:t>Q</m:t>
             </m:r>
           </m:e>
           <m:sub>
             <m:r>
-              <m:rPr>
-                <m:sty m:val="p"/>
-              </m:rPr>
-              <m:t>a</m:t>
-            </m:r>
-            <m:r>
-              <m:rPr>
-                <m:sty m:val="p"/>
-              </m:rPr>
-              <m:t>x</m:t>
+              <m:t>0</m:t>
             </m:r>
           </m:sub>
         </m:sSub>
@@ -2169,80 +2190,49 @@
           </m:rPr>
           <m:t>=</m:t>
         </m:r>
-        <m:sSub>
-          <m:e>
-            <m:r>
-              <m:t>F</m:t>
-            </m:r>
-          </m:e>
-          <m:sub>
-            <m:r>
-              <m:rPr>
-                <m:sty m:val="p"/>
-              </m:rPr>
-              <m:t>l</m:t>
-            </m:r>
-            <m:r>
-              <m:rPr>
-                <m:sty m:val="p"/>
-              </m:rPr>
-              <m:t>a</m:t>
-            </m:r>
-            <m:r>
-              <m:rPr>
-                <m:sty m:val="p"/>
-              </m:rPr>
-              <m:t>t</m:t>
-            </m:r>
-          </m:sub>
-        </m:sSub>
-        <m:r>
-          <m:rPr>
-            <m:sty m:val="p"/>
-          </m:rPr>
-          <m:t>tan</m:t>
-        </m:r>
-        <m:r>
-          <m:t>α</m:t>
-        </m:r>
+        <m:f>
+          <m:fPr>
+            <m:type m:val="bar"/>
+          </m:fPr>
+          <m:num>
+            <m:sSub>
+              <m:e>
+                <m:r>
+                  <m:t>F</m:t>
+                </m:r>
+              </m:e>
+              <m:sub>
+                <m:r>
+                  <m:t>p</m:t>
+                </m:r>
+                <m:r>
+                  <m:t>r</m:t>
+                </m:r>
+                <m:r>
+                  <m:t>e</m:t>
+                </m:r>
+              </m:sub>
+            </m:sSub>
+          </m:num>
+          <m:den>
+            <m:r>
+              <m:t>Z</m:t>
+            </m:r>
+            <m:r>
+              <m:rPr>
+                <m:sty m:val="p"/>
+              </m:rPr>
+              <m:t>sin</m:t>
+            </m:r>
+            <m:r>
+              <m:t>α</m:t>
+            </m:r>
+          </m:den>
+        </m:f>
       </m:oMath>
       <w:r>
         <w:tab/>
         <w:t>(17)</w:t>
-      </w:r>
-    </w:p>
-    <w:p>
-      <w:pPr>
-        <w:pStyle w:val="FirstParagraph"/>
-      </w:pPr>
-      <w:r>
-        <w:t xml:space="preserve">Bearings with a contact angle are therefore one of the few sources of axial force in a rotating assembly.</w:t>
-      </w:r>
-    </w:p>
-    <w:bookmarkEnd w:id="25"/>
-    <w:bookmarkStart w:id="26" w:name="motor-induced-vibration"/>
-    <w:p>
-      <w:pPr>
-        <w:pStyle w:val="Heading3"/>
-      </w:pPr>
-      <w:r>
-        <w:t xml:space="preserve">2.5 Motor-induced vibration</w:t>
-      </w:r>
-    </w:p>
-    <w:p>
-      <w:pPr>
-        <w:pStyle w:val="FirstParagraph"/>
-      </w:pPr>
-      <w:r>
-        <w:t xml:space="preserve">The motor that drives a rotor produces its own disturbances, all of them acting mainly as twisting moments about the spin axis.</w:t>
-      </w:r>
-    </w:p>
-    <w:p>
-      <w:pPr>
-        <w:pStyle w:val="BodyText"/>
-      </w:pPr>
-      <w:r>
-        <w:t xml:space="preserve">The largest is the reaction torque during speed changes. To accelerate the rotor, the motor applies a torque to it, and the motor’s stator, which is fixed to the structure, receives the same torque in the opposite direction. For a rotor accelerating at Ω̇, the torque on the mount is:</w:t>
       </w:r>
     </w:p>
     <w:p>
@@ -2257,6 +2247,1531 @@
         <w:tab/>
       </w:r>
       <m:oMath>
+        <m:sSub>
+          <m:e>
+            <m:r>
+              <m:t>δ</m:t>
+            </m:r>
+          </m:e>
+          <m:sub>
+            <m:r>
+              <m:t>c</m:t>
+            </m:r>
+          </m:sub>
+        </m:sSub>
+        <m:r>
+          <m:rPr>
+            <m:sty m:val="p"/>
+          </m:rPr>
+          <m:t>=</m:t>
+        </m:r>
+        <m:r>
+          <m:t>3.84</m:t>
+        </m:r>
+        <m:r>
+          <m:rPr>
+            <m:sty m:val="p"/>
+          </m:rPr>
+          <m:t>×</m:t>
+        </m:r>
+        <m:sSup>
+          <m:e>
+            <m:r>
+              <m:t>10</m:t>
+            </m:r>
+          </m:e>
+          <m:sup>
+            <m:r>
+              <m:rPr>
+                <m:sty m:val="p"/>
+              </m:rPr>
+              <m:t>−</m:t>
+            </m:r>
+            <m:r>
+              <m:t>5</m:t>
+            </m:r>
+          </m:sup>
+        </m:sSup>
+        <m:r>
+          <m:t> </m:t>
+        </m:r>
+        <m:f>
+          <m:fPr>
+            <m:type m:val="bar"/>
+          </m:fPr>
+          <m:num>
+            <m:sSubSup>
+              <m:e>
+                <m:r>
+                  <m:t>Q</m:t>
+                </m:r>
+              </m:e>
+              <m:sub>
+                <m:r>
+                  <m:t>0</m:t>
+                </m:r>
+              </m:sub>
+              <m:sup>
+                <m:r>
+                  <m:t>0.9</m:t>
+                </m:r>
+              </m:sup>
+            </m:sSubSup>
+          </m:num>
+          <m:den>
+            <m:sSup>
+              <m:e>
+                <m:r>
+                  <m:t>l</m:t>
+                </m:r>
+              </m:e>
+              <m:sup>
+                <m:r>
+                  <m:t>0.8</m:t>
+                </m:r>
+              </m:sup>
+            </m:sSup>
+          </m:den>
+        </m:f>
+        <m:r>
+          <m:rPr>
+            <m:sty m:val="p"/>
+          </m:rPr>
+          <m:t>,</m:t>
+        </m:r>
+        <m:r>
+          <m:t>  </m:t>
+        </m:r>
+        <m:sSub>
+          <m:e>
+            <m:r>
+              <m:t>δ</m:t>
+            </m:r>
+          </m:e>
+          <m:sub>
+            <m:r>
+              <m:t>0</m:t>
+            </m:r>
+          </m:sub>
+        </m:sSub>
+        <m:r>
+          <m:rPr>
+            <m:sty m:val="p"/>
+          </m:rPr>
+          <m:t>=</m:t>
+        </m:r>
+        <m:r>
+          <m:t>2</m:t>
+        </m:r>
+        <m:r>
+          <m:t> </m:t>
+        </m:r>
+        <m:sSub>
+          <m:e>
+            <m:r>
+              <m:t>δ</m:t>
+            </m:r>
+          </m:e>
+          <m:sub>
+            <m:r>
+              <m:t>c</m:t>
+            </m:r>
+          </m:sub>
+        </m:sSub>
+      </m:oMath>
+      <w:r>
+        <w:tab/>
+        <w:t>(18)</w:t>
+      </w:r>
+    </w:p>
+    <w:p>
+      <w:pPr>
+        <w:pStyle w:val="FirstParagraph"/>
+      </w:pPr>
+      <w:r>
+        <w:t xml:space="preserve">Because the load grows as δ^(10/9), the stiffness of one roller about the preloaded state, and the resulting radial and axial stiffness of the whole bearing, are:</w:t>
+      </w:r>
+    </w:p>
+    <w:p>
+      <w:pPr>
+        <w:tabs>
+          <w:tab w:val="center" w:pos="4680"/>
+          <w:tab w:val="right" w:pos="9360"/>
+        </w:tabs>
+        <w:spacing w:before="120" w:after="120"/>
+      </w:pPr>
+      <w:r>
+        <w:tab/>
+      </w:r>
+      <m:oMath>
+        <m:sSub>
+          <m:e>
+            <m:r>
+              <m:t>k</m:t>
+            </m:r>
+          </m:e>
+          <m:sub>
+            <m:r>
+              <m:t>r</m:t>
+            </m:r>
+          </m:sub>
+        </m:sSub>
+        <m:r>
+          <m:rPr>
+            <m:sty m:val="p"/>
+          </m:rPr>
+          <m:t>=</m:t>
+        </m:r>
+        <m:f>
+          <m:fPr>
+            <m:type m:val="bar"/>
+          </m:fPr>
+          <m:num>
+            <m:r>
+              <m:t>d</m:t>
+            </m:r>
+            <m:r>
+              <m:t>Q</m:t>
+            </m:r>
+          </m:num>
+          <m:den>
+            <m:r>
+              <m:t>d</m:t>
+            </m:r>
+            <m:r>
+              <m:t>δ</m:t>
+            </m:r>
+          </m:den>
+        </m:f>
+        <m:r>
+          <m:rPr>
+            <m:sty m:val="p"/>
+          </m:rPr>
+          <m:t>=</m:t>
+        </m:r>
+        <m:f>
+          <m:fPr>
+            <m:type m:val="bar"/>
+          </m:fPr>
+          <m:num>
+            <m:r>
+              <m:t>10</m:t>
+            </m:r>
+          </m:num>
+          <m:den>
+            <m:r>
+              <m:t>9</m:t>
+            </m:r>
+          </m:den>
+        </m:f>
+        <m:r>
+          <m:t> </m:t>
+        </m:r>
+        <m:f>
+          <m:fPr>
+            <m:type m:val="bar"/>
+          </m:fPr>
+          <m:num>
+            <m:sSub>
+              <m:e>
+                <m:r>
+                  <m:t>Q</m:t>
+                </m:r>
+              </m:e>
+              <m:sub>
+                <m:r>
+                  <m:t>0</m:t>
+                </m:r>
+              </m:sub>
+            </m:sSub>
+          </m:num>
+          <m:den>
+            <m:sSub>
+              <m:e>
+                <m:r>
+                  <m:t>δ</m:t>
+                </m:r>
+              </m:e>
+              <m:sub>
+                <m:r>
+                  <m:t>0</m:t>
+                </m:r>
+              </m:sub>
+            </m:sSub>
+          </m:den>
+        </m:f>
+      </m:oMath>
+      <w:r>
+        <w:tab/>
+        <w:t>(19)</w:t>
+      </w:r>
+    </w:p>
+    <w:p>
+      <w:pPr>
+        <w:tabs>
+          <w:tab w:val="center" w:pos="4680"/>
+          <w:tab w:val="right" w:pos="9360"/>
+        </w:tabs>
+        <w:spacing w:before="120" w:after="120"/>
+      </w:pPr>
+      <w:r>
+        <w:tab/>
+      </w:r>
+      <m:oMath>
+        <m:sSub>
+          <m:e>
+            <m:r>
+              <m:t>K</m:t>
+            </m:r>
+          </m:e>
+          <m:sub>
+            <m:r>
+              <m:t>r</m:t>
+            </m:r>
+            <m:r>
+              <m:t>a</m:t>
+            </m:r>
+            <m:r>
+              <m:t>d</m:t>
+            </m:r>
+          </m:sub>
+        </m:sSub>
+        <m:r>
+          <m:rPr>
+            <m:sty m:val="p"/>
+          </m:rPr>
+          <m:t>=</m:t>
+        </m:r>
+        <m:f>
+          <m:fPr>
+            <m:type m:val="bar"/>
+          </m:fPr>
+          <m:num>
+            <m:r>
+              <m:t>Z</m:t>
+            </m:r>
+          </m:num>
+          <m:den>
+            <m:r>
+              <m:t>2</m:t>
+            </m:r>
+          </m:den>
+        </m:f>
+        <m:r>
+          <m:t> </m:t>
+        </m:r>
+        <m:sSub>
+          <m:e>
+            <m:r>
+              <m:t>k</m:t>
+            </m:r>
+          </m:e>
+          <m:sub>
+            <m:r>
+              <m:t>r</m:t>
+            </m:r>
+          </m:sub>
+        </m:sSub>
+        <m:sSup>
+          <m:e>
+            <m:r>
+              <m:rPr>
+                <m:sty m:val="p"/>
+              </m:rPr>
+              <m:t>cos</m:t>
+            </m:r>
+          </m:e>
+          <m:sup>
+            <m:r>
+              <m:t>2</m:t>
+            </m:r>
+          </m:sup>
+        </m:sSup>
+        <m:r>
+          <m:t>α</m:t>
+        </m:r>
+      </m:oMath>
+      <w:r>
+        <w:tab/>
+        <w:t>(20)</w:t>
+      </w:r>
+    </w:p>
+    <w:p>
+      <w:pPr>
+        <w:tabs>
+          <w:tab w:val="center" w:pos="4680"/>
+          <w:tab w:val="right" w:pos="9360"/>
+        </w:tabs>
+        <w:spacing w:before="120" w:after="120"/>
+      </w:pPr>
+      <w:r>
+        <w:tab/>
+      </w:r>
+      <m:oMath>
+        <m:sSub>
+          <m:e>
+            <m:r>
+              <m:t>K</m:t>
+            </m:r>
+          </m:e>
+          <m:sub>
+            <m:r>
+              <m:rPr>
+                <m:sty m:val="p"/>
+              </m:rPr>
+              <m:t>a</m:t>
+            </m:r>
+            <m:r>
+              <m:rPr>
+                <m:sty m:val="p"/>
+              </m:rPr>
+              <m:t>x</m:t>
+            </m:r>
+          </m:sub>
+        </m:sSub>
+        <m:r>
+          <m:rPr>
+            <m:sty m:val="p"/>
+          </m:rPr>
+          <m:t>=</m:t>
+        </m:r>
+        <m:r>
+          <m:t>Z</m:t>
+        </m:r>
+        <m:r>
+          <m:t> </m:t>
+        </m:r>
+        <m:sSub>
+          <m:e>
+            <m:r>
+              <m:t>k</m:t>
+            </m:r>
+          </m:e>
+          <m:sub>
+            <m:r>
+              <m:t>r</m:t>
+            </m:r>
+          </m:sub>
+        </m:sSub>
+        <m:sSup>
+          <m:e>
+            <m:r>
+              <m:rPr>
+                <m:sty m:val="p"/>
+              </m:rPr>
+              <m:t>sin</m:t>
+            </m:r>
+          </m:e>
+          <m:sup>
+            <m:r>
+              <m:t>2</m:t>
+            </m:r>
+          </m:sup>
+        </m:sSup>
+        <m:r>
+          <m:t>α</m:t>
+        </m:r>
+      </m:oMath>
+      <w:r>
+        <w:tab/>
+        <w:t>(21)</w:t>
+      </w:r>
+    </w:p>
+    <w:p>
+      <w:pPr>
+        <w:pStyle w:val="FirstParagraph"/>
+      </w:pPr>
+      <w:r>
+        <w:rPr>
+          <w:bCs/>
+          <w:b/>
+        </w:rPr>
+        <w:t xml:space="preserve">Which imperfections produce a net force.</w:t>
+      </w:r>
+      <w:r>
+        <w:t xml:space="preserve"> </w:t>
+      </w:r>
+      <w:r>
+        <w:t xml:space="preserve">A race with waviness of order q (q lobes around its circumference) and amplitude A pushes each rolling element in or out by A cos(qψ), where ψ is the element’s angular position. The forces of all Z elements add up to a net load only for particular orders, because the sum over equally spaced elements cancels otherwise:</w:t>
+      </w:r>
+    </w:p>
+    <w:p>
+      <w:pPr>
+        <w:tabs>
+          <w:tab w:val="center" w:pos="4680"/>
+          <w:tab w:val="right" w:pos="9360"/>
+        </w:tabs>
+        <w:spacing w:before="120" w:after="120"/>
+      </w:pPr>
+      <w:r>
+        <w:tab/>
+      </w:r>
+      <m:oMath>
+        <m:nary>
+          <m:naryPr>
+            <m:chr m:val="∑"/>
+            <m:limLoc m:val="undOvr"/>
+            <m:subHide m:val="off"/>
+            <m:supHide m:val="off"/>
+          </m:naryPr>
+          <m:sub>
+            <m:r>
+              <m:t>j</m:t>
+            </m:r>
+            <m:r>
+              <m:rPr>
+                <m:sty m:val="p"/>
+              </m:rPr>
+              <m:t>=</m:t>
+            </m:r>
+            <m:r>
+              <m:t>1</m:t>
+            </m:r>
+          </m:sub>
+          <m:sup>
+            <m:r>
+              <m:t>Z</m:t>
+            </m:r>
+          </m:sup>
+          <m:e>
+            <m:r>
+              <m:rPr>
+                <m:sty m:val="p"/>
+              </m:rPr>
+              <m:t>cos</m:t>
+            </m:r>
+          </m:e>
+        </m:nary>
+        <m:d>
+          <m:dPr>
+            <m:begChr m:val="("/>
+            <m:endChr m:val=")"/>
+            <m:sepChr m:val=""/>
+            <m:grow/>
+          </m:dPr>
+          <m:e>
+            <m:r>
+              <m:t>q</m:t>
+            </m:r>
+            <m:sSub>
+              <m:e>
+                <m:r>
+                  <m:t>ψ</m:t>
+                </m:r>
+              </m:e>
+              <m:sub>
+                <m:r>
+                  <m:t>j</m:t>
+                </m:r>
+              </m:sub>
+            </m:sSub>
+          </m:e>
+        </m:d>
+        <m:r>
+          <m:rPr>
+            <m:sty m:val="p"/>
+          </m:rPr>
+          <m:t>cos</m:t>
+        </m:r>
+        <m:sSub>
+          <m:e>
+            <m:r>
+              <m:t>ψ</m:t>
+            </m:r>
+          </m:e>
+          <m:sub>
+            <m:r>
+              <m:t>j</m:t>
+            </m:r>
+          </m:sub>
+        </m:sSub>
+        <m:r>
+          <m:rPr>
+            <m:sty m:val="p"/>
+          </m:rPr>
+          <m:t>=</m:t>
+        </m:r>
+        <m:f>
+          <m:fPr>
+            <m:type m:val="bar"/>
+          </m:fPr>
+          <m:num>
+            <m:r>
+              <m:t>Z</m:t>
+            </m:r>
+          </m:num>
+          <m:den>
+            <m:r>
+              <m:t>2</m:t>
+            </m:r>
+          </m:den>
+        </m:f>
+        <m:r>
+          <m:t> </m:t>
+        </m:r>
+        <m:r>
+          <m:t> </m:t>
+        </m:r>
+        <m:r>
+          <m:rPr>
+            <m:nor/>
+            <m:sty m:val="p"/>
+          </m:rPr>
+          <m:t>if </m:t>
+        </m:r>
+        <m:r>
+          <m:t>q</m:t>
+        </m:r>
+        <m:r>
+          <m:rPr>
+            <m:sty m:val="p"/>
+          </m:rPr>
+          <m:t>=</m:t>
+        </m:r>
+        <m:r>
+          <m:t>k</m:t>
+        </m:r>
+        <m:r>
+          <m:t>Z</m:t>
+        </m:r>
+        <m:r>
+          <m:rPr>
+            <m:sty m:val="p"/>
+          </m:rPr>
+          <m:t>±</m:t>
+        </m:r>
+        <m:r>
+          <m:t>1</m:t>
+        </m:r>
+        <m:r>
+          <m:rPr>
+            <m:sty m:val="p"/>
+          </m:rPr>
+          <m:t>,</m:t>
+        </m:r>
+        <m:r>
+          <m:t>  </m:t>
+        </m:r>
+        <m:nary>
+          <m:naryPr>
+            <m:chr m:val="∑"/>
+            <m:limLoc m:val="undOvr"/>
+            <m:subHide m:val="off"/>
+            <m:supHide m:val="off"/>
+          </m:naryPr>
+          <m:sub>
+            <m:r>
+              <m:t>j</m:t>
+            </m:r>
+            <m:r>
+              <m:rPr>
+                <m:sty m:val="p"/>
+              </m:rPr>
+              <m:t>=</m:t>
+            </m:r>
+            <m:r>
+              <m:t>1</m:t>
+            </m:r>
+          </m:sub>
+          <m:sup>
+            <m:r>
+              <m:t>Z</m:t>
+            </m:r>
+          </m:sup>
+          <m:e>
+            <m:r>
+              <m:rPr>
+                <m:sty m:val="p"/>
+              </m:rPr>
+              <m:t>cos</m:t>
+            </m:r>
+          </m:e>
+        </m:nary>
+        <m:d>
+          <m:dPr>
+            <m:begChr m:val="("/>
+            <m:endChr m:val=")"/>
+            <m:sepChr m:val=""/>
+            <m:grow/>
+          </m:dPr>
+          <m:e>
+            <m:r>
+              <m:t>q</m:t>
+            </m:r>
+            <m:sSub>
+              <m:e>
+                <m:r>
+                  <m:t>ψ</m:t>
+                </m:r>
+              </m:e>
+              <m:sub>
+                <m:r>
+                  <m:t>j</m:t>
+                </m:r>
+              </m:sub>
+            </m:sSub>
+          </m:e>
+        </m:d>
+        <m:r>
+          <m:rPr>
+            <m:sty m:val="p"/>
+          </m:rPr>
+          <m:t>=</m:t>
+        </m:r>
+        <m:r>
+          <m:t>Z</m:t>
+        </m:r>
+        <m:r>
+          <m:t> </m:t>
+        </m:r>
+        <m:r>
+          <m:t> </m:t>
+        </m:r>
+        <m:r>
+          <m:rPr>
+            <m:nor/>
+            <m:sty m:val="p"/>
+          </m:rPr>
+          <m:t>if </m:t>
+        </m:r>
+        <m:r>
+          <m:t>q</m:t>
+        </m:r>
+        <m:r>
+          <m:rPr>
+            <m:sty m:val="p"/>
+          </m:rPr>
+          <m:t>=</m:t>
+        </m:r>
+        <m:r>
+          <m:t>k</m:t>
+        </m:r>
+        <m:r>
+          <m:t>Z</m:t>
+        </m:r>
+      </m:oMath>
+      <w:r>
+        <w:tab/>
+        <w:t>(22)</w:t>
+      </w:r>
+    </w:p>
+    <w:p>
+      <w:pPr>
+        <w:pStyle w:val="FirstParagraph"/>
+      </w:pPr>
+      <w:r>
+        <w:t xml:space="preserve">Orders q = kZ ± 1 therefore produce a lateral force and q = kZ an axial force, each of a size set by the contact stiffness. For a race:</w:t>
+      </w:r>
+    </w:p>
+    <w:p>
+      <w:pPr>
+        <w:tabs>
+          <w:tab w:val="center" w:pos="4680"/>
+          <w:tab w:val="right" w:pos="9360"/>
+        </w:tabs>
+        <w:spacing w:before="120" w:after="120"/>
+      </w:pPr>
+      <w:r>
+        <w:tab/>
+      </w:r>
+      <m:oMath>
+        <m:sSub>
+          <m:e>
+            <m:r>
+              <m:t>F</m:t>
+            </m:r>
+          </m:e>
+          <m:sub>
+            <m:r>
+              <m:rPr>
+                <m:sty m:val="p"/>
+              </m:rPr>
+              <m:t>l</m:t>
+            </m:r>
+            <m:r>
+              <m:rPr>
+                <m:sty m:val="p"/>
+              </m:rPr>
+              <m:t>a</m:t>
+            </m:r>
+            <m:r>
+              <m:rPr>
+                <m:sty m:val="p"/>
+              </m:rPr>
+              <m:t>t</m:t>
+            </m:r>
+          </m:sub>
+        </m:sSub>
+        <m:r>
+          <m:rPr>
+            <m:sty m:val="p"/>
+          </m:rPr>
+          <m:t>=</m:t>
+        </m:r>
+        <m:f>
+          <m:fPr>
+            <m:type m:val="bar"/>
+          </m:fPr>
+          <m:num>
+            <m:r>
+              <m:t>Z</m:t>
+            </m:r>
+          </m:num>
+          <m:den>
+            <m:r>
+              <m:t>2</m:t>
+            </m:r>
+          </m:den>
+        </m:f>
+        <m:r>
+          <m:t> </m:t>
+        </m:r>
+        <m:sSub>
+          <m:e>
+            <m:r>
+              <m:t>k</m:t>
+            </m:r>
+          </m:e>
+          <m:sub>
+            <m:r>
+              <m:t>r</m:t>
+            </m:r>
+          </m:sub>
+        </m:sSub>
+        <m:r>
+          <m:t>A</m:t>
+        </m:r>
+        <m:r>
+          <m:rPr>
+            <m:sty m:val="p"/>
+          </m:rPr>
+          <m:t>cos</m:t>
+        </m:r>
+        <m:r>
+          <m:t>α</m:t>
+        </m:r>
+        <m:r>
+          <m:t> </m:t>
+        </m:r>
+        <m:r>
+          <m:t> </m:t>
+        </m:r>
+        <m:d>
+          <m:dPr>
+            <m:begChr m:val="("/>
+            <m:endChr m:val=")"/>
+            <m:sepChr m:val=""/>
+            <m:grow/>
+          </m:dPr>
+          <m:e>
+            <m:r>
+              <m:rPr>
+                <m:nor/>
+                <m:sty m:val="p"/>
+              </m:rPr>
+              <m:t>each order </m:t>
+            </m:r>
+            <m:r>
+              <m:t>k</m:t>
+            </m:r>
+            <m:r>
+              <m:t>Z</m:t>
+            </m:r>
+            <m:r>
+              <m:rPr>
+                <m:sty m:val="p"/>
+              </m:rPr>
+              <m:t>±</m:t>
+            </m:r>
+            <m:r>
+              <m:t>1</m:t>
+            </m:r>
+          </m:e>
+        </m:d>
+        <m:r>
+          <m:rPr>
+            <m:sty m:val="p"/>
+          </m:rPr>
+          <m:t>,</m:t>
+        </m:r>
+        <m:r>
+          <m:t>  </m:t>
+        </m:r>
+        <m:sSub>
+          <m:e>
+            <m:r>
+              <m:t>F</m:t>
+            </m:r>
+          </m:e>
+          <m:sub>
+            <m:r>
+              <m:rPr>
+                <m:sty m:val="p"/>
+              </m:rPr>
+              <m:t>a</m:t>
+            </m:r>
+            <m:r>
+              <m:rPr>
+                <m:sty m:val="p"/>
+              </m:rPr>
+              <m:t>x</m:t>
+            </m:r>
+          </m:sub>
+        </m:sSub>
+        <m:r>
+          <m:rPr>
+            <m:sty m:val="p"/>
+          </m:rPr>
+          <m:t>=</m:t>
+        </m:r>
+        <m:r>
+          <m:t>Z</m:t>
+        </m:r>
+        <m:r>
+          <m:t> </m:t>
+        </m:r>
+        <m:sSub>
+          <m:e>
+            <m:r>
+              <m:t>k</m:t>
+            </m:r>
+          </m:e>
+          <m:sub>
+            <m:r>
+              <m:t>r</m:t>
+            </m:r>
+          </m:sub>
+        </m:sSub>
+        <m:r>
+          <m:t>A</m:t>
+        </m:r>
+        <m:r>
+          <m:rPr>
+            <m:sty m:val="p"/>
+          </m:rPr>
+          <m:t>sin</m:t>
+        </m:r>
+        <m:r>
+          <m:t>α</m:t>
+        </m:r>
+        <m:r>
+          <m:t> </m:t>
+        </m:r>
+        <m:r>
+          <m:t> </m:t>
+        </m:r>
+        <m:d>
+          <m:dPr>
+            <m:begChr m:val="("/>
+            <m:endChr m:val=")"/>
+            <m:sepChr m:val=""/>
+            <m:grow/>
+          </m:dPr>
+          <m:e>
+            <m:r>
+              <m:t>q</m:t>
+            </m:r>
+            <m:r>
+              <m:rPr>
+                <m:sty m:val="p"/>
+              </m:rPr>
+              <m:t>=</m:t>
+            </m:r>
+            <m:r>
+              <m:t>k</m:t>
+            </m:r>
+            <m:r>
+              <m:t>Z</m:t>
+            </m:r>
+          </m:e>
+        </m:d>
+      </m:oMath>
+      <w:r>
+        <w:tab/>
+        <w:t>(23)</w:t>
+      </w:r>
+    </w:p>
+    <w:p>
+      <w:pPr>
+        <w:pStyle w:val="FirstParagraph"/>
+      </w:pPr>
+      <w:r>
+        <w:t xml:space="preserve">On a stationary race these lines fall at k times its race pass frequency. On a rotating race they fall at k times its race pass frequency plus or minus the shaft frequency for the lateral lines, and at k times the race pass frequency for the axial line. Waviness on the rolling elements matters for even orders q = 2k, which change the element diameter by 2A; it gives lateral lines at 2k f</w:t>
+      </w:r>
+      <w:r>
+        <w:rPr>
+          <w:vertAlign w:val="subscript"/>
+        </w:rPr>
+        <w:t xml:space="preserve">b</w:t>
+      </w:r>
+      <w:r>
+        <w:t xml:space="preserve"> </w:t>
+      </w:r>
+      <w:r>
+        <w:t xml:space="preserve">± f</w:t>
+      </w:r>
+      <w:r>
+        <w:rPr>
+          <w:vertAlign w:val="subscript"/>
+        </w:rPr>
+        <w:t xml:space="preserve">c</w:t>
+      </w:r>
+      <w:r>
+        <w:t xml:space="preserve"> </w:t>
+      </w:r>
+      <w:r>
+        <w:t xml:space="preserve">and an axial line at 2k f</w:t>
+      </w:r>
+      <w:r>
+        <w:rPr>
+          <w:vertAlign w:val="subscript"/>
+        </w:rPr>
+        <w:t xml:space="preserve">b</w:t>
+      </w:r>
+      <w:r>
+        <w:t xml:space="preserve">. An element that is oversize by Δ carries extra load and travels with the cage, giving a lateral force k</w:t>
+      </w:r>
+      <w:r>
+        <w:rPr>
+          <w:vertAlign w:val="subscript"/>
+        </w:rPr>
+        <w:t xml:space="preserve">r</w:t>
+      </w:r>
+      <w:r>
+        <w:t xml:space="preserve"> </w:t>
+      </w:r>
+      <w:r>
+        <w:t xml:space="preserve">Δ cos α at the cage frequency. Because the elements sit at the contact angle, every lateral disturbance has an axial partner:</w:t>
+      </w:r>
+    </w:p>
+    <w:p>
+      <w:pPr>
+        <w:tabs>
+          <w:tab w:val="center" w:pos="4680"/>
+          <w:tab w:val="right" w:pos="9360"/>
+        </w:tabs>
+        <w:spacing w:before="120" w:after="120"/>
+      </w:pPr>
+      <w:r>
+        <w:tab/>
+      </w:r>
+      <m:oMath>
+        <m:sSub>
+          <m:e>
+            <m:r>
+              <m:t>F</m:t>
+            </m:r>
+          </m:e>
+          <m:sub>
+            <m:r>
+              <m:rPr>
+                <m:sty m:val="p"/>
+              </m:rPr>
+              <m:t>a</m:t>
+            </m:r>
+            <m:r>
+              <m:rPr>
+                <m:sty m:val="p"/>
+              </m:rPr>
+              <m:t>x</m:t>
+            </m:r>
+          </m:sub>
+        </m:sSub>
+        <m:r>
+          <m:rPr>
+            <m:sty m:val="p"/>
+          </m:rPr>
+          <m:t>=</m:t>
+        </m:r>
+        <m:sSub>
+          <m:e>
+            <m:r>
+              <m:t>F</m:t>
+            </m:r>
+          </m:e>
+          <m:sub>
+            <m:r>
+              <m:rPr>
+                <m:sty m:val="p"/>
+              </m:rPr>
+              <m:t>l</m:t>
+            </m:r>
+            <m:r>
+              <m:rPr>
+                <m:sty m:val="p"/>
+              </m:rPr>
+              <m:t>a</m:t>
+            </m:r>
+            <m:r>
+              <m:rPr>
+                <m:sty m:val="p"/>
+              </m:rPr>
+              <m:t>t</m:t>
+            </m:r>
+          </m:sub>
+        </m:sSub>
+        <m:r>
+          <m:rPr>
+            <m:sty m:val="p"/>
+          </m:rPr>
+          <m:t>tan</m:t>
+        </m:r>
+        <m:r>
+          <m:t>α</m:t>
+        </m:r>
+      </m:oMath>
+      <w:r>
+        <w:tab/>
+        <w:t>(24)</w:t>
+      </w:r>
+    </w:p>
+    <w:p>
+      <w:pPr>
+        <w:pStyle w:val="FirstParagraph"/>
+      </w:pPr>
+      <w:r>
+        <w:t xml:space="preserve">Bearings with a contact angle are therefore one of the few sources of axial force in a rotating assembly.</w:t>
+      </w:r>
+    </w:p>
+    <w:p>
+      <w:pPr>
+        <w:pStyle w:val="BodyText"/>
+      </w:pPr>
+      <w:r>
+        <w:rPr>
+          <w:bCs/>
+          <w:b/>
+        </w:rPr>
+        <w:t xml:space="preserve">Force that reaches the structure.</w:t>
+      </w:r>
+      <w:r>
+        <w:t xml:space="preserve"> </w:t>
+      </w:r>
+      <w:r>
+        <w:t xml:space="preserve">The forces above are</w:t>
+      </w:r>
+      <w:r>
+        <w:t xml:space="preserve"> </w:t>
+      </w:r>
+      <w:r>
+        <w:t xml:space="preserve">“</w:t>
+      </w:r>
+      <w:r>
+        <w:t xml:space="preserve">blocked</w:t>
+      </w:r>
+      <w:r>
+        <w:t xml:space="preserve">”</w:t>
+      </w:r>
+      <w:r>
+        <w:t xml:space="preserve"> </w:t>
+      </w:r>
+      <w:r>
+        <w:t xml:space="preserve">forces: what the bearing would apply if the rotor could not move. In reality the rotor sits on its bearings as a mass m on a spring of stiffness K, with a natural frequency f</w:t>
+      </w:r>
+      <w:r>
+        <w:rPr>
+          <w:vertAlign w:val="subscript"/>
+        </w:rPr>
+        <w:t xml:space="preserve">n</w:t>
+      </w:r>
+      <w:r>
+        <w:t xml:space="preserve">. Well below f</w:t>
+      </w:r>
+      <w:r>
+        <w:rPr>
+          <w:vertAlign w:val="subscript"/>
+        </w:rPr>
+        <w:t xml:space="preserve">n</w:t>
+      </w:r>
+      <w:r>
+        <w:t xml:space="preserve"> </w:t>
+      </w:r>
+      <w:r>
+        <w:t xml:space="preserve">the rotor simply follows the imposed displacement and only its inertia force reaches the shaft; well above f</w:t>
+      </w:r>
+      <w:r>
+        <w:rPr>
+          <w:vertAlign w:val="subscript"/>
+        </w:rPr>
+        <w:t xml:space="preserve">n</w:t>
+      </w:r>
+      <w:r>
+        <w:t xml:space="preserve"> </w:t>
+      </w:r>
+      <w:r>
+        <w:t xml:space="preserve">the full blocked force does. With damping ratio ζ and r the ratio of the line frequency to f</w:t>
+      </w:r>
+      <w:r>
+        <w:rPr>
+          <w:vertAlign w:val="subscript"/>
+        </w:rPr>
+        <w:t xml:space="preserve">n</w:t>
+      </w:r>
+      <w:r>
+        <w:t xml:space="preserve">:</w:t>
+      </w:r>
+    </w:p>
+    <w:p>
+      <w:pPr>
+        <w:tabs>
+          <w:tab w:val="center" w:pos="4680"/>
+          <w:tab w:val="right" w:pos="9360"/>
+        </w:tabs>
+        <w:spacing w:before="120" w:after="120"/>
+      </w:pPr>
+      <w:r>
+        <w:tab/>
+      </w:r>
+      <m:oMath>
+        <m:sSub>
+          <m:e>
+            <m:r>
+              <m:t>f</m:t>
+            </m:r>
+          </m:e>
+          <m:sub>
+            <m:r>
+              <m:t>n</m:t>
+            </m:r>
+          </m:sub>
+        </m:sSub>
+        <m:r>
+          <m:rPr>
+            <m:sty m:val="p"/>
+          </m:rPr>
+          <m:t>=</m:t>
+        </m:r>
+        <m:f>
+          <m:fPr>
+            <m:type m:val="bar"/>
+          </m:fPr>
+          <m:num>
+            <m:r>
+              <m:t>1</m:t>
+            </m:r>
+          </m:num>
+          <m:den>
+            <m:r>
+              <m:t>2</m:t>
+            </m:r>
+            <m:r>
+              <m:t>π</m:t>
+            </m:r>
+          </m:den>
+        </m:f>
+        <m:rad>
+          <m:radPr>
+            <m:degHide m:val="on"/>
+          </m:radPr>
+          <m:deg/>
+          <m:e>
+            <m:f>
+              <m:fPr>
+                <m:type m:val="bar"/>
+              </m:fPr>
+              <m:num>
+                <m:r>
+                  <m:t>K</m:t>
+                </m:r>
+              </m:num>
+              <m:den>
+                <m:r>
+                  <m:t>m</m:t>
+                </m:r>
+              </m:den>
+            </m:f>
+          </m:e>
+        </m:rad>
+      </m:oMath>
+      <w:r>
+        <w:tab/>
+        <w:t>(25)</w:t>
+      </w:r>
+    </w:p>
+    <w:p>
+      <w:pPr>
+        <w:tabs>
+          <w:tab w:val="center" w:pos="4680"/>
+          <w:tab w:val="right" w:pos="9360"/>
+        </w:tabs>
+        <w:spacing w:before="120" w:after="120"/>
+      </w:pPr>
+      <w:r>
+        <w:tab/>
+      </w:r>
+      <m:oMath>
+        <m:sSub>
+          <m:e>
+            <m:r>
+              <m:t>F</m:t>
+            </m:r>
+          </m:e>
+          <m:sub>
+            <m:r>
+              <m:t>s</m:t>
+            </m:r>
+            <m:r>
+              <m:t>h</m:t>
+            </m:r>
+            <m:r>
+              <m:t>a</m:t>
+            </m:r>
+            <m:r>
+              <m:t>f</m:t>
+            </m:r>
+            <m:r>
+              <m:t>t</m:t>
+            </m:r>
+          </m:sub>
+        </m:sSub>
+        <m:r>
+          <m:rPr>
+            <m:sty m:val="p"/>
+          </m:rPr>
+          <m:t>=</m:t>
+        </m:r>
+        <m:sSub>
+          <m:e>
+            <m:r>
+              <m:t>F</m:t>
+            </m:r>
+          </m:e>
+          <m:sub>
+            <m:r>
+              <m:t>b</m:t>
+            </m:r>
+            <m:r>
+              <m:t>l</m:t>
+            </m:r>
+            <m:r>
+              <m:t>o</m:t>
+            </m:r>
+            <m:r>
+              <m:t>c</m:t>
+            </m:r>
+            <m:r>
+              <m:t>k</m:t>
+            </m:r>
+            <m:r>
+              <m:t>e</m:t>
+            </m:r>
+            <m:r>
+              <m:t>d</m:t>
+            </m:r>
+          </m:sub>
+        </m:sSub>
+        <m:r>
+          <m:t> </m:t>
+        </m:r>
+        <m:f>
+          <m:fPr>
+            <m:type m:val="bar"/>
+          </m:fPr>
+          <m:num>
+            <m:sSup>
+              <m:e>
+                <m:r>
+                  <m:t>r</m:t>
+                </m:r>
+              </m:e>
+              <m:sup>
+                <m:r>
+                  <m:t>2</m:t>
+                </m:r>
+              </m:sup>
+            </m:sSup>
+          </m:num>
+          <m:den>
+            <m:rad>
+              <m:radPr>
+                <m:degHide m:val="on"/>
+              </m:radPr>
+              <m:deg/>
+              <m:e>
+                <m:sSup>
+                  <m:e>
+                    <m:d>
+                      <m:dPr>
+                        <m:begChr m:val="("/>
+                        <m:endChr m:val=")"/>
+                        <m:sepChr m:val=""/>
+                        <m:grow/>
+                      </m:dPr>
+                      <m:e>
+                        <m:r>
+                          <m:t>1</m:t>
+                        </m:r>
+                        <m:r>
+                          <m:rPr>
+                            <m:sty m:val="p"/>
+                          </m:rPr>
+                          <m:t>−</m:t>
+                        </m:r>
+                        <m:sSup>
+                          <m:e>
+                            <m:r>
+                              <m:t>r</m:t>
+                            </m:r>
+                          </m:e>
+                          <m:sup>
+                            <m:r>
+                              <m:t>2</m:t>
+                            </m:r>
+                          </m:sup>
+                        </m:sSup>
+                      </m:e>
+                    </m:d>
+                  </m:e>
+                  <m:sup>
+                    <m:r>
+                      <m:t>2</m:t>
+                    </m:r>
+                  </m:sup>
+                </m:sSup>
+                <m:r>
+                  <m:rPr>
+                    <m:sty m:val="p"/>
+                  </m:rPr>
+                  <m:t>+</m:t>
+                </m:r>
+                <m:sSup>
+                  <m:e>
+                    <m:d>
+                      <m:dPr>
+                        <m:begChr m:val="("/>
+                        <m:endChr m:val=")"/>
+                        <m:sepChr m:val=""/>
+                        <m:grow/>
+                      </m:dPr>
+                      <m:e>
+                        <m:r>
+                          <m:t>2</m:t>
+                        </m:r>
+                        <m:r>
+                          <m:t>ζ</m:t>
+                        </m:r>
+                        <m:r>
+                          <m:t>r</m:t>
+                        </m:r>
+                      </m:e>
+                    </m:d>
+                  </m:e>
+                  <m:sup>
+                    <m:r>
+                      <m:t>2</m:t>
+                    </m:r>
+                  </m:sup>
+                </m:sSup>
+              </m:e>
+            </m:rad>
+          </m:den>
+        </m:f>
+        <m:r>
+          <m:rPr>
+            <m:sty m:val="p"/>
+          </m:rPr>
+          <m:t>,</m:t>
+        </m:r>
+        <m:r>
+          <m:t>  </m:t>
+        </m:r>
+        <m:r>
+          <m:t>r</m:t>
+        </m:r>
+        <m:r>
+          <m:rPr>
+            <m:sty m:val="p"/>
+          </m:rPr>
+          <m:t>=</m:t>
+        </m:r>
+        <m:f>
+          <m:fPr>
+            <m:type m:val="bar"/>
+          </m:fPr>
+          <m:num>
+            <m:r>
+              <m:t>f</m:t>
+            </m:r>
+          </m:num>
+          <m:den>
+            <m:sSub>
+              <m:e>
+                <m:r>
+                  <m:t>f</m:t>
+                </m:r>
+              </m:e>
+              <m:sub>
+                <m:r>
+                  <m:t>n</m:t>
+                </m:r>
+              </m:sub>
+            </m:sSub>
+          </m:den>
+        </m:f>
+      </m:oMath>
+      <w:r>
+        <w:tab/>
+        <w:t>(26)</w:t>
+      </w:r>
+    </w:p>
+    <w:p>
+      <w:pPr>
+        <w:pStyle w:val="FirstParagraph"/>
+      </w:pPr>
+      <w:r>
+        <w:t xml:space="preserve">Because bearing contacts are very stiff, f</w:t>
+      </w:r>
+      <w:r>
+        <w:rPr>
+          <w:vertAlign w:val="subscript"/>
+        </w:rPr>
+        <w:t xml:space="preserve">n</w:t>
+      </w:r>
+      <w:r>
+        <w:t xml:space="preserve"> </w:t>
+      </w:r>
+      <w:r>
+        <w:t xml:space="preserve">is usually several kilohertz, far above the bearing frequencies, and the transmitted force is a small fraction of the blocked force. The model is linear about the preloaded state and is valid only while the imperfections are small compared with the preload deflection δ_0, so that no rolling element unloads.</w:t>
+      </w:r>
+    </w:p>
+    <w:bookmarkEnd w:id="25"/>
+    <w:bookmarkStart w:id="26" w:name="motor-induced-vibration"/>
+    <w:p>
+      <w:pPr>
+        <w:pStyle w:val="Heading3"/>
+      </w:pPr>
+      <w:r>
+        <w:t xml:space="preserve">2.5 Motor-induced vibration</w:t>
+      </w:r>
+    </w:p>
+    <w:p>
+      <w:pPr>
+        <w:pStyle w:val="FirstParagraph"/>
+      </w:pPr>
+      <w:r>
+        <w:t xml:space="preserve">The motor that drives a rotor produces its own disturbances, all of them acting mainly as twisting moments about the spin axis.</w:t>
+      </w:r>
+    </w:p>
+    <w:p>
+      <w:pPr>
+        <w:pStyle w:val="BodyText"/>
+      </w:pPr>
+      <w:r>
+        <w:t xml:space="preserve">The largest is the reaction torque during speed changes. To accelerate the rotor, the motor applies a torque to it, and the motor’s stator, which is fixed to the structure, receives the same torque in the opposite direction. For a rotor accelerating at Ω̇, the torque on the mount is:</w:t>
+      </w:r>
+    </w:p>
+    <w:p>
+      <w:pPr>
+        <w:tabs>
+          <w:tab w:val="center" w:pos="4680"/>
+          <w:tab w:val="right" w:pos="9360"/>
+        </w:tabs>
+        <w:spacing w:before="120" w:after="120"/>
+      </w:pPr>
+      <w:r>
+        <w:tab/>
+      </w:r>
+      <m:oMath>
         <m:r>
           <m:t>T</m:t>
         </m:r>
@@ -2306,7 +3821,7 @@
       </m:oMath>
       <w:r>
         <w:tab/>
-        <w:t>(18)</w:t>
+        <w:t>(27)</w:t>
       </w:r>
     </w:p>
     <w:p>
@@ -2363,7 +3878,7 @@
       </m:oMath>
       <w:r>
         <w:tab/>
-        <w:t>(19)</w:t>
+        <w:t>(28)</w:t>
       </w:r>
     </w:p>
     <w:p>
@@ -2536,7 +4051,7 @@
       </m:oMath>
       <w:r>
         <w:tab/>
-        <w:t>(20)</w:t>
+        <w:t>(29)</w:t>
       </w:r>
     </w:p>
     <w:p>
@@ -2663,7 +4178,7 @@
       </m:oMath>
       <w:r>
         <w:tab/>
-        <w:t>(21)</w:t>
+        <w:t>(30)</w:t>
       </w:r>
     </w:p>
     <w:p>
@@ -2838,7 +4353,7 @@
       </m:oMath>
       <w:r>
         <w:tab/>
-        <w:t>(22)</w:t>
+        <w:t>(31)</w:t>
       </w:r>
     </w:p>
     <w:p>
@@ -2995,7 +4510,7 @@
       </m:oMath>
       <w:r>
         <w:tab/>
-        <w:t>(23)</w:t>
+        <w:t>(32)</w:t>
       </w:r>
     </w:p>
     <w:p>
@@ -3088,7 +4603,7 @@
       </m:oMath>
       <w:r>
         <w:tab/>
-        <w:t>(24)</w:t>
+        <w:t>(33)</w:t>
       </w:r>
     </w:p>
     <w:p>
@@ -3204,7 +4719,7 @@
       </m:oMath>
       <w:r>
         <w:tab/>
-        <w:t>(25)</w:t>
+        <w:t>(34)</w:t>
       </w:r>
     </w:p>
     <w:p>
@@ -3377,7 +4892,7 @@
       </m:oMath>
       <w:r>
         <w:tab/>
-        <w:t>(26)</w:t>
+        <w:t>(35)</w:t>
       </w:r>
     </w:p>
     <w:p>
@@ -3403,7 +4918,7 @@
         <w:pStyle w:val="FirstParagraph"/>
       </w:pPr>
       <w:r>
-        <w:t xml:space="preserve">Imbalance loads, and bearing loads that are tied to them, grow with the square of the speed. A load L known at one speed can therefore be found at any other:</w:t>
+        <w:t xml:space="preserve">Imbalance loads grow with the square of the speed. Bearing loads well below the rotor-bearing natural frequency also grow roughly with the square of speed, through Equation (26), but are recalculated at each speed rather than scaled. An imbalance load L known at one speed can be found at any other:</w:t>
       </w:r>
     </w:p>
     <w:p>
@@ -3528,7 +5043,7 @@
       </m:oMath>
       <w:r>
         <w:tab/>
-        <w:t>(27)</w:t>
+        <w:t>(36)</w:t>
       </w:r>
     </w:p>
     <w:p>
@@ -3631,7 +5146,7 @@
       </m:oMath>
       <w:r>
         <w:tab/>
-        <w:t>(28)</w:t>
+        <w:t>(37)</w:t>
       </w:r>
     </w:p>
     <w:bookmarkEnd w:id="29"/>
@@ -3855,7 +5370,7 @@
               <w:jc w:val="left"/>
             </w:pPr>
             <w:r>
-              <w:t xml:space="preserve">Frequencies yes; amplitudes no</w:t>
+              <w:t xml:space="preserve">Frequencies yes; amplitudes from geometry, preload and specified imperfections</w:t>
             </w:r>
           </w:p>
         </w:tc>
@@ -4238,7 +5753,7 @@
       </m:oMath>
       <w:r>
         <w:tab/>
-        <w:t>(29)</w:t>
+        <w:t>(38)</w:t>
       </w:r>
     </w:p>
     <w:p>
@@ -4577,7 +6092,7 @@
       </m:oMath>
       <w:r>
         <w:tab/>
-        <w:t>(30)</w:t>
+        <w:t>(39)</w:t>
       </w:r>
     </w:p>
     <w:tbl>
@@ -5010,7 +6525,7 @@
       </m:oMath>
       <w:r>
         <w:tab/>
-        <w:t>(31)</w:t>
+        <w:t>(40)</w:t>
       </w:r>
     </w:p>
     <w:p>
@@ -5159,7 +6674,7 @@
       </m:oMath>
       <w:r>
         <w:tab/>
-        <w:t>(32)</w:t>
+        <w:t>(41)</w:t>
       </w:r>
     </w:p>
     <w:p>
@@ -5282,7 +6797,7 @@
       </m:oMath>
       <w:r>
         <w:tab/>
-        <w:t>(33)</w:t>
+        <w:t>(42)</w:t>
       </w:r>
     </w:p>
     <w:p>
@@ -5391,7 +6906,7 @@
       </m:oMath>
       <w:r>
         <w:tab/>
-        <w:t>(34)</w:t>
+        <w:t>(43)</w:t>
       </w:r>
     </w:p>
     <w:p>
@@ -5474,7 +6989,7 @@
       </m:oMath>
       <w:r>
         <w:tab/>
-        <w:t>(35)</w:t>
+        <w:t>(44)</w:t>
       </w:r>
     </w:p>
     <w:p>
@@ -5549,7 +7064,7 @@
       </m:oMath>
       <w:r>
         <w:tab/>
-        <w:t>(36)</w:t>
+        <w:t>(45)</w:t>
       </w:r>
     </w:p>
     <w:p>
@@ -5557,7 +7072,7 @@
         <w:pStyle w:val="FirstParagraph"/>
       </w:pPr>
       <w:r>
-        <w:t xml:space="preserve">For this reason, rotating loads are usually reported as peak amplitudes for each component. Fx and Fy are listed separately because a structural model needs both directions, but they should not be combined as if they happened at the same time, which would overstate the resultant by a factor of √2. The same applies to Mx and My. Where loads from several sources with unknown relative phase are combined, adding their peaks gives the upper bound of Equation (28).</w:t>
+        <w:t xml:space="preserve">For this reason, rotating loads are usually reported as peak amplitudes for each component. Fx and Fy are listed separately because a structural model needs both directions, but they should not be combined as if they happened at the same time, which would overstate the resultant by a factor of √2. The same applies to Mx and My. Where loads from several sources with unknown relative phase are combined, adding their peaks gives the upper bound of Equation (37).</w:t>
       </w:r>
     </w:p>
     <w:bookmarkEnd w:id="38"/>
@@ -6270,7 +7785,776 @@
         <w:pStyle w:val="FirstParagraph"/>
       </w:pPr>
       <w:r>
-        <w:t xml:space="preserve">Each rotating part has its own pair of tapered roller bearings. Their geometry comes from the manufacturer’s catalog for the selected part number.</w:t>
+        <w:t xml:space="preserve">Each rotating part has its own pair of tapered roller bearings, bearing A and bearing B. Their geometry comes from the manufacturer’s catalog for the selected part number, and the imperfection amplitudes are entered separately for each bearing.</w:t>
+      </w:r>
+    </w:p>
+    <w:tbl>
+      <w:tblPr>
+        <w:tblStyle w:val="Table"/>
+        <w:tblW w:type="pct" w:w="5000"/>
+        <w:tblLook w:firstRow="1" w:lastRow="0" w:firstColumn="0" w:lastColumn="0" w:noHBand="0" w:noVBand="0" w:val="0020"/>
+        <w:jc w:val="start"/>
+      </w:tblPr>
+      <w:tblGrid>
+        <w:gridCol w:w="1980"/>
+        <w:gridCol w:w="1980"/>
+        <w:gridCol w:w="1980"/>
+        <w:gridCol w:w="1980"/>
+      </w:tblGrid>
+      <w:tr>
+        <w:trPr>
+          <w:tblHeader w:val="true"/>
+        </w:trPr>
+        <w:tc>
+          <w:tcPr/>
+          <w:p>
+            <w:pPr>
+              <w:pStyle w:val="Compact"/>
+              <w:jc w:val="left"/>
+            </w:pPr>
+            <w:r>
+              <w:t xml:space="preserve">Input</w:t>
+            </w:r>
+          </w:p>
+        </w:tc>
+        <w:tc>
+          <w:tcPr/>
+          <w:p>
+            <w:pPr>
+              <w:pStyle w:val="Compact"/>
+              <w:jc w:val="left"/>
+            </w:pPr>
+            <w:r>
+              <w:t xml:space="preserve">Symbol</w:t>
+            </w:r>
+          </w:p>
+        </w:tc>
+        <w:tc>
+          <w:tcPr/>
+          <w:p>
+            <w:pPr>
+              <w:pStyle w:val="Compact"/>
+              <w:jc w:val="left"/>
+            </w:pPr>
+            <w:r>
+              <w:t xml:space="preserve">Units</w:t>
+            </w:r>
+          </w:p>
+        </w:tc>
+        <w:tc>
+          <w:tcPr/>
+          <w:p>
+            <w:pPr>
+              <w:pStyle w:val="Compact"/>
+              <w:jc w:val="left"/>
+            </w:pPr>
+            <w:r>
+              <w:t xml:space="preserve">Source</w:t>
+            </w:r>
+          </w:p>
+        </w:tc>
+      </w:tr>
+      <w:tr>
+        <w:tc>
+          <w:tcPr/>
+          <w:p>
+            <w:pPr>
+              <w:pStyle w:val="Compact"/>
+              <w:jc w:val="left"/>
+            </w:pPr>
+            <w:r>
+              <w:t xml:space="preserve">Number of rolling elements</w:t>
+            </w:r>
+          </w:p>
+        </w:tc>
+        <w:tc>
+          <w:tcPr/>
+          <w:p>
+            <w:pPr>
+              <w:pStyle w:val="Compact"/>
+              <w:jc w:val="left"/>
+            </w:pPr>
+            <w:r>
+              <w:t xml:space="preserve">Z</w:t>
+            </w:r>
+          </w:p>
+        </w:tc>
+        <w:tc>
+          <w:tcPr/>
+          <w:p>
+            <w:pPr>
+              <w:pStyle w:val="Compact"/>
+              <w:jc w:val="left"/>
+            </w:pPr>
+            <w:r>
+              <w:t xml:space="preserve">–</w:t>
+            </w:r>
+          </w:p>
+        </w:tc>
+        <w:tc>
+          <w:tcPr/>
+          <w:p>
+            <w:pPr>
+              <w:pStyle w:val="Compact"/>
+              <w:jc w:val="left"/>
+            </w:pPr>
+            <w:r>
+              <w:t xml:space="preserve">Bearing catalog</w:t>
+            </w:r>
+          </w:p>
+        </w:tc>
+      </w:tr>
+      <w:tr>
+        <w:tc>
+          <w:tcPr/>
+          <w:p>
+            <w:pPr>
+              <w:pStyle w:val="Compact"/>
+              <w:jc w:val="left"/>
+            </w:pPr>
+            <w:r>
+              <w:t xml:space="preserve">Rolling element (mean roller) diameter</w:t>
+            </w:r>
+          </w:p>
+        </w:tc>
+        <w:tc>
+          <w:tcPr/>
+          <w:p>
+            <w:pPr>
+              <w:pStyle w:val="Compact"/>
+              <w:jc w:val="left"/>
+            </w:pPr>
+            <w:r>
+              <w:t xml:space="preserve">D</w:t>
+            </w:r>
+          </w:p>
+        </w:tc>
+        <w:tc>
+          <w:tcPr/>
+          <w:p>
+            <w:pPr>
+              <w:pStyle w:val="Compact"/>
+              <w:jc w:val="left"/>
+            </w:pPr>
+            <w:r>
+              <w:t xml:space="preserve">mm</w:t>
+            </w:r>
+          </w:p>
+        </w:tc>
+        <w:tc>
+          <w:tcPr/>
+          <w:p>
+            <w:pPr>
+              <w:pStyle w:val="Compact"/>
+              <w:jc w:val="left"/>
+            </w:pPr>
+            <w:r>
+              <w:t xml:space="preserve">Bearing catalog</w:t>
+            </w:r>
+          </w:p>
+        </w:tc>
+      </w:tr>
+      <w:tr>
+        <w:tc>
+          <w:tcPr/>
+          <w:p>
+            <w:pPr>
+              <w:pStyle w:val="Compact"/>
+              <w:jc w:val="left"/>
+            </w:pPr>
+            <w:r>
+              <w:t xml:space="preserve">Pitch diameter</w:t>
+            </w:r>
+          </w:p>
+        </w:tc>
+        <w:tc>
+          <w:tcPr/>
+          <w:p>
+            <w:pPr>
+              <w:pStyle w:val="Compact"/>
+              <w:jc w:val="left"/>
+            </w:pPr>
+            <w:r>
+              <w:t xml:space="preserve">d</w:t>
+            </w:r>
+            <w:r>
+              <w:rPr>
+                <w:vertAlign w:val="subscript"/>
+              </w:rPr>
+              <w:t xml:space="preserve">p</w:t>
+            </w:r>
+          </w:p>
+        </w:tc>
+        <w:tc>
+          <w:tcPr/>
+          <w:p>
+            <w:pPr>
+              <w:pStyle w:val="Compact"/>
+              <w:jc w:val="left"/>
+            </w:pPr>
+            <w:r>
+              <w:t xml:space="preserve">mm</w:t>
+            </w:r>
+          </w:p>
+        </w:tc>
+        <w:tc>
+          <w:tcPr/>
+          <w:p>
+            <w:pPr>
+              <w:pStyle w:val="Compact"/>
+              <w:jc w:val="left"/>
+            </w:pPr>
+            <w:r>
+              <w:t xml:space="preserve">Bearing catalog</w:t>
+            </w:r>
+          </w:p>
+        </w:tc>
+      </w:tr>
+      <w:tr>
+        <w:tc>
+          <w:tcPr/>
+          <w:p>
+            <w:pPr>
+              <w:pStyle w:val="Compact"/>
+              <w:jc w:val="left"/>
+            </w:pPr>
+            <w:r>
+              <w:t xml:space="preserve">Contact (cup) angle</w:t>
+            </w:r>
+          </w:p>
+        </w:tc>
+        <w:tc>
+          <w:tcPr/>
+          <w:p>
+            <w:pPr>
+              <w:pStyle w:val="Compact"/>
+              <w:jc w:val="left"/>
+            </w:pPr>
+            <w:r>
+              <w:t xml:space="preserve">α</w:t>
+            </w:r>
+          </w:p>
+        </w:tc>
+        <w:tc>
+          <w:tcPr/>
+          <w:p>
+            <w:pPr>
+              <w:pStyle w:val="Compact"/>
+              <w:jc w:val="left"/>
+            </w:pPr>
+            <w:r>
+              <w:t xml:space="preserve">deg</w:t>
+            </w:r>
+          </w:p>
+        </w:tc>
+        <w:tc>
+          <w:tcPr/>
+          <w:p>
+            <w:pPr>
+              <w:pStyle w:val="Compact"/>
+              <w:jc w:val="left"/>
+            </w:pPr>
+            <w:r>
+              <w:t xml:space="preserve">Bearing catalog</w:t>
+            </w:r>
+          </w:p>
+        </w:tc>
+      </w:tr>
+      <w:tr>
+        <w:tc>
+          <w:tcPr/>
+          <w:p>
+            <w:pPr>
+              <w:pStyle w:val="Compact"/>
+              <w:jc w:val="left"/>
+            </w:pPr>
+            <w:r>
+              <w:t xml:space="preserve">Effective roller contact length</w:t>
+            </w:r>
+          </w:p>
+        </w:tc>
+        <w:tc>
+          <w:tcPr/>
+          <w:p>
+            <w:pPr>
+              <w:pStyle w:val="Compact"/>
+              <w:jc w:val="left"/>
+            </w:pPr>
+            <w:r>
+              <w:t xml:space="preserve">l</w:t>
+            </w:r>
+          </w:p>
+        </w:tc>
+        <w:tc>
+          <w:tcPr/>
+          <w:p>
+            <w:pPr>
+              <w:pStyle w:val="Compact"/>
+              <w:jc w:val="left"/>
+            </w:pPr>
+            <w:r>
+              <w:t xml:space="preserve">mm</w:t>
+            </w:r>
+          </w:p>
+        </w:tc>
+        <w:tc>
+          <w:tcPr/>
+          <w:p>
+            <w:pPr>
+              <w:pStyle w:val="Compact"/>
+              <w:jc w:val="left"/>
+            </w:pPr>
+            <w:r>
+              <w:t xml:space="preserve">Bearing catalog or drawing</w:t>
+            </w:r>
+          </w:p>
+        </w:tc>
+      </w:tr>
+      <w:tr>
+        <w:tc>
+          <w:tcPr/>
+          <w:p>
+            <w:pPr>
+              <w:pStyle w:val="Compact"/>
+              <w:jc w:val="left"/>
+            </w:pPr>
+            <w:r>
+              <w:t xml:space="preserve">Axial preload on the bearing pair</w:t>
+            </w:r>
+          </w:p>
+        </w:tc>
+        <w:tc>
+          <w:tcPr/>
+          <w:p>
+            <w:pPr>
+              <w:pStyle w:val="Compact"/>
+              <w:jc w:val="left"/>
+            </w:pPr>
+            <w:r>
+              <w:t xml:space="preserve">F</w:t>
+            </w:r>
+            <w:r>
+              <w:rPr>
+                <w:vertAlign w:val="subscript"/>
+              </w:rPr>
+              <w:t xml:space="preserve">pre</w:t>
+            </w:r>
+          </w:p>
+        </w:tc>
+        <w:tc>
+          <w:tcPr/>
+          <w:p>
+            <w:pPr>
+              <w:pStyle w:val="Compact"/>
+              <w:jc w:val="left"/>
+            </w:pPr>
+            <w:r>
+              <w:t xml:space="preserve">N</w:t>
+            </w:r>
+          </w:p>
+        </w:tc>
+        <w:tc>
+          <w:tcPr/>
+          <w:p>
+            <w:pPr>
+              <w:pStyle w:val="Compact"/>
+              <w:jc w:val="left"/>
+            </w:pPr>
+            <w:r>
+              <w:t xml:space="preserve">Assembly specification</w:t>
+            </w:r>
+          </w:p>
+        </w:tc>
+      </w:tr>
+      <w:tr>
+        <w:tc>
+          <w:tcPr/>
+          <w:p>
+            <w:pPr>
+              <w:pStyle w:val="Compact"/>
+              <w:jc w:val="left"/>
+            </w:pPr>
+            <w:r>
+              <w:t xml:space="preserve">Bearing radial stiffness (optional)</w:t>
+            </w:r>
+          </w:p>
+        </w:tc>
+        <w:tc>
+          <w:tcPr/>
+          <w:p>
+            <w:pPr>
+              <w:pStyle w:val="Compact"/>
+              <w:jc w:val="left"/>
+            </w:pPr>
+            <w:r>
+              <w:t xml:space="preserve">K</w:t>
+            </w:r>
+            <w:r>
+              <w:rPr>
+                <w:vertAlign w:val="subscript"/>
+              </w:rPr>
+              <w:t xml:space="preserve">rad</w:t>
+            </w:r>
+          </w:p>
+        </w:tc>
+        <w:tc>
+          <w:tcPr/>
+          <w:p>
+            <w:pPr>
+              <w:pStyle w:val="Compact"/>
+              <w:jc w:val="left"/>
+            </w:pPr>
+            <w:r>
+              <w:t xml:space="preserve">N/m</w:t>
+            </w:r>
+          </w:p>
+        </w:tc>
+        <w:tc>
+          <w:tcPr/>
+          <w:p>
+            <w:pPr>
+              <w:pStyle w:val="Compact"/>
+              <w:jc w:val="left"/>
+            </w:pPr>
+            <w:r>
+              <w:t xml:space="preserve">Supplier, when available</w:t>
+            </w:r>
+          </w:p>
+        </w:tc>
+      </w:tr>
+      <w:tr>
+        <w:tc>
+          <w:tcPr/>
+          <w:p>
+            <w:pPr>
+              <w:pStyle w:val="Compact"/>
+              <w:jc w:val="left"/>
+            </w:pPr>
+            <w:r>
+              <w:t xml:space="preserve">Outer race waviness, bearing A and B</w:t>
+            </w:r>
+          </w:p>
+        </w:tc>
+        <w:tc>
+          <w:tcPr/>
+          <w:p>
+            <w:pPr>
+              <w:pStyle w:val="Compact"/>
+              <w:jc w:val="left"/>
+            </w:pPr>
+            <w:r>
+              <w:t xml:space="preserve">A</w:t>
+            </w:r>
+            <w:r>
+              <w:rPr>
+                <w:vertAlign w:val="subscript"/>
+              </w:rPr>
+              <w:t xml:space="preserve">o</w:t>
+            </w:r>
+          </w:p>
+        </w:tc>
+        <w:tc>
+          <w:tcPr/>
+          <w:p>
+            <w:pPr>
+              <w:pStyle w:val="Compact"/>
+              <w:jc w:val="left"/>
+            </w:pPr>
+            <w:r>
+              <w:t xml:space="preserve">µm</w:t>
+            </w:r>
+          </w:p>
+        </w:tc>
+        <w:tc>
+          <w:tcPr/>
+          <w:p>
+            <w:pPr>
+              <w:pStyle w:val="Compact"/>
+              <w:jc w:val="left"/>
+            </w:pPr>
+            <w:r>
+              <w:t xml:space="preserve">Bearing precision class or drawing</w:t>
+            </w:r>
+          </w:p>
+        </w:tc>
+      </w:tr>
+      <w:tr>
+        <w:tc>
+          <w:tcPr/>
+          <w:p>
+            <w:pPr>
+              <w:pStyle w:val="Compact"/>
+              <w:jc w:val="left"/>
+            </w:pPr>
+            <w:r>
+              <w:t xml:space="preserve">Inner race waviness, bearing A and B</w:t>
+            </w:r>
+          </w:p>
+        </w:tc>
+        <w:tc>
+          <w:tcPr/>
+          <w:p>
+            <w:pPr>
+              <w:pStyle w:val="Compact"/>
+              <w:jc w:val="left"/>
+            </w:pPr>
+            <w:r>
+              <w:t xml:space="preserve">A</w:t>
+            </w:r>
+            <w:r>
+              <w:rPr>
+                <w:vertAlign w:val="subscript"/>
+              </w:rPr>
+              <w:t xml:space="preserve">i</w:t>
+            </w:r>
+          </w:p>
+        </w:tc>
+        <w:tc>
+          <w:tcPr/>
+          <w:p>
+            <w:pPr>
+              <w:pStyle w:val="Compact"/>
+              <w:jc w:val="left"/>
+            </w:pPr>
+            <w:r>
+              <w:t xml:space="preserve">µm</w:t>
+            </w:r>
+          </w:p>
+        </w:tc>
+        <w:tc>
+          <w:tcPr/>
+          <w:p>
+            <w:pPr>
+              <w:pStyle w:val="Compact"/>
+              <w:jc w:val="left"/>
+            </w:pPr>
+            <w:r>
+              <w:t xml:space="preserve">Bearing precision class or drawing</w:t>
+            </w:r>
+          </w:p>
+        </w:tc>
+      </w:tr>
+      <w:tr>
+        <w:tc>
+          <w:tcPr/>
+          <w:p>
+            <w:pPr>
+              <w:pStyle w:val="Compact"/>
+              <w:jc w:val="left"/>
+            </w:pPr>
+            <w:r>
+              <w:t xml:space="preserve">Roller waviness, bearing A and B</w:t>
+            </w:r>
+          </w:p>
+        </w:tc>
+        <w:tc>
+          <w:tcPr/>
+          <w:p>
+            <w:pPr>
+              <w:pStyle w:val="Compact"/>
+              <w:jc w:val="left"/>
+            </w:pPr>
+            <w:r>
+              <w:t xml:space="preserve">A</w:t>
+            </w:r>
+            <w:r>
+              <w:rPr>
+                <w:vertAlign w:val="subscript"/>
+              </w:rPr>
+              <w:t xml:space="preserve">b</w:t>
+            </w:r>
+          </w:p>
+        </w:tc>
+        <w:tc>
+          <w:tcPr/>
+          <w:p>
+            <w:pPr>
+              <w:pStyle w:val="Compact"/>
+              <w:jc w:val="left"/>
+            </w:pPr>
+            <w:r>
+              <w:t xml:space="preserve">µm</w:t>
+            </w:r>
+          </w:p>
+        </w:tc>
+        <w:tc>
+          <w:tcPr/>
+          <w:p>
+            <w:pPr>
+              <w:pStyle w:val="Compact"/>
+              <w:jc w:val="left"/>
+            </w:pPr>
+            <w:r>
+              <w:t xml:space="preserve">Bearing precision class or drawing</w:t>
+            </w:r>
+          </w:p>
+        </w:tc>
+      </w:tr>
+      <w:tr>
+        <w:tc>
+          <w:tcPr/>
+          <w:p>
+            <w:pPr>
+              <w:pStyle w:val="Compact"/>
+              <w:jc w:val="left"/>
+            </w:pPr>
+            <w:r>
+              <w:t xml:space="preserve">Roller diameter variation, bearing A and B</w:t>
+            </w:r>
+          </w:p>
+        </w:tc>
+        <w:tc>
+          <w:tcPr/>
+          <w:p>
+            <w:pPr>
+              <w:pStyle w:val="Compact"/>
+              <w:jc w:val="left"/>
+            </w:pPr>
+            <w:r>
+              <w:t xml:space="preserve">Δ</w:t>
+            </w:r>
+          </w:p>
+        </w:tc>
+        <w:tc>
+          <w:tcPr/>
+          <w:p>
+            <w:pPr>
+              <w:pStyle w:val="Compact"/>
+              <w:jc w:val="left"/>
+            </w:pPr>
+            <w:r>
+              <w:t xml:space="preserve">µm</w:t>
+            </w:r>
+          </w:p>
+        </w:tc>
+        <w:tc>
+          <w:tcPr/>
+          <w:p>
+            <w:pPr>
+              <w:pStyle w:val="Compact"/>
+              <w:jc w:val="left"/>
+            </w:pPr>
+            <w:r>
+              <w:t xml:space="preserve">Bearing precision class or drawing</w:t>
+            </w:r>
+          </w:p>
+        </w:tc>
+      </w:tr>
+      <w:tr>
+        <w:tc>
+          <w:tcPr/>
+          <w:p>
+            <w:pPr>
+              <w:pStyle w:val="Compact"/>
+              <w:jc w:val="left"/>
+            </w:pPr>
+            <w:r>
+              <w:t xml:space="preserve">Number of harmonics included</w:t>
+            </w:r>
+          </w:p>
+        </w:tc>
+        <w:tc>
+          <w:tcPr/>
+          <w:p>
+            <w:pPr>
+              <w:pStyle w:val="Compact"/>
+              <w:jc w:val="left"/>
+            </w:pPr>
+            <w:r>
+              <w:t xml:space="preserve">k</w:t>
+            </w:r>
+            <w:r>
+              <w:rPr>
+                <w:vertAlign w:val="subscript"/>
+              </w:rPr>
+              <w:t xml:space="preserve">max</w:t>
+            </w:r>
+          </w:p>
+        </w:tc>
+        <w:tc>
+          <w:tcPr/>
+          <w:p>
+            <w:pPr>
+              <w:pStyle w:val="Compact"/>
+              <w:jc w:val="left"/>
+            </w:pPr>
+            <w:r>
+              <w:t xml:space="preserve">–</w:t>
+            </w:r>
+          </w:p>
+        </w:tc>
+        <w:tc>
+          <w:tcPr/>
+          <w:p>
+            <w:pPr>
+              <w:pStyle w:val="Compact"/>
+              <w:jc w:val="left"/>
+            </w:pPr>
+            <w:r>
+              <w:t xml:space="preserve">Analysis setting (2)</w:t>
+            </w:r>
+          </w:p>
+        </w:tc>
+      </w:tr>
+      <w:tr>
+        <w:tc>
+          <w:tcPr/>
+          <w:p>
+            <w:pPr>
+              <w:pStyle w:val="Compact"/>
+              <w:jc w:val="left"/>
+            </w:pPr>
+            <w:r>
+              <w:t xml:space="preserve">Damping ratio of the rotor-bearing modes</w:t>
+            </w:r>
+          </w:p>
+        </w:tc>
+        <w:tc>
+          <w:tcPr/>
+          <w:p>
+            <w:pPr>
+              <w:pStyle w:val="Compact"/>
+              <w:jc w:val="left"/>
+            </w:pPr>
+            <w:r>
+              <w:t xml:space="preserve">ζ</w:t>
+            </w:r>
+          </w:p>
+        </w:tc>
+        <w:tc>
+          <w:tcPr/>
+          <w:p>
+            <w:pPr>
+              <w:pStyle w:val="Compact"/>
+              <w:jc w:val="left"/>
+            </w:pPr>
+            <w:r>
+              <w:t xml:space="preserve">–</w:t>
+            </w:r>
+          </w:p>
+        </w:tc>
+        <w:tc>
+          <w:tcPr/>
+          <w:p>
+            <w:pPr>
+              <w:pStyle w:val="Compact"/>
+              <w:jc w:val="left"/>
+            </w:pPr>
+            <w:r>
+              <w:t xml:space="preserve">Assumed (0.03)</w:t>
+            </w:r>
+          </w:p>
+        </w:tc>
+      </w:tr>
+    </w:tbl>
+    <w:bookmarkEnd w:id="41"/>
+    <w:bookmarkStart w:id="42" w:name="operating-and-reporting-inputs"/>
+    <w:p>
+      <w:pPr>
+        <w:pStyle w:val="Heading3"/>
+      </w:pPr>
+      <w:r>
+        <w:t xml:space="preserve">5.3 Operating and reporting inputs</w:t>
       </w:r>
     </w:p>
     <w:tbl>
@@ -6348,339 +8632,6 @@
               <w:jc w:val="left"/>
             </w:pPr>
             <w:r>
-              <w:t xml:space="preserve">Number of rolling elements</w:t>
-            </w:r>
-          </w:p>
-        </w:tc>
-        <w:tc>
-          <w:tcPr/>
-          <w:p>
-            <w:pPr>
-              <w:pStyle w:val="Compact"/>
-              <w:jc w:val="left"/>
-            </w:pPr>
-            <w:r>
-              <w:t xml:space="preserve">Z</w:t>
-            </w:r>
-          </w:p>
-        </w:tc>
-        <w:tc>
-          <w:tcPr/>
-          <w:p>
-            <w:pPr>
-              <w:pStyle w:val="Compact"/>
-              <w:jc w:val="left"/>
-            </w:pPr>
-            <w:r>
-              <w:t xml:space="preserve">–</w:t>
-            </w:r>
-          </w:p>
-        </w:tc>
-        <w:tc>
-          <w:tcPr/>
-          <w:p>
-            <w:pPr>
-              <w:pStyle w:val="Compact"/>
-              <w:jc w:val="left"/>
-            </w:pPr>
-            <w:r>
-              <w:t xml:space="preserve">Bearing catalog</w:t>
-            </w:r>
-          </w:p>
-        </w:tc>
-      </w:tr>
-      <w:tr>
-        <w:tc>
-          <w:tcPr/>
-          <w:p>
-            <w:pPr>
-              <w:pStyle w:val="Compact"/>
-              <w:jc w:val="left"/>
-            </w:pPr>
-            <w:r>
-              <w:t xml:space="preserve">Rolling element (mean roller) diameter</w:t>
-            </w:r>
-          </w:p>
-        </w:tc>
-        <w:tc>
-          <w:tcPr/>
-          <w:p>
-            <w:pPr>
-              <w:pStyle w:val="Compact"/>
-              <w:jc w:val="left"/>
-            </w:pPr>
-            <w:r>
-              <w:t xml:space="preserve">D</w:t>
-            </w:r>
-          </w:p>
-        </w:tc>
-        <w:tc>
-          <w:tcPr/>
-          <w:p>
-            <w:pPr>
-              <w:pStyle w:val="Compact"/>
-              <w:jc w:val="left"/>
-            </w:pPr>
-            <w:r>
-              <w:t xml:space="preserve">mm</w:t>
-            </w:r>
-          </w:p>
-        </w:tc>
-        <w:tc>
-          <w:tcPr/>
-          <w:p>
-            <w:pPr>
-              <w:pStyle w:val="Compact"/>
-              <w:jc w:val="left"/>
-            </w:pPr>
-            <w:r>
-              <w:t xml:space="preserve">Bearing catalog</w:t>
-            </w:r>
-          </w:p>
-        </w:tc>
-      </w:tr>
-      <w:tr>
-        <w:tc>
-          <w:tcPr/>
-          <w:p>
-            <w:pPr>
-              <w:pStyle w:val="Compact"/>
-              <w:jc w:val="left"/>
-            </w:pPr>
-            <w:r>
-              <w:t xml:space="preserve">Pitch diameter</w:t>
-            </w:r>
-          </w:p>
-        </w:tc>
-        <w:tc>
-          <w:tcPr/>
-          <w:p>
-            <w:pPr>
-              <w:pStyle w:val="Compact"/>
-              <w:jc w:val="left"/>
-            </w:pPr>
-            <w:r>
-              <w:t xml:space="preserve">d</w:t>
-            </w:r>
-            <w:r>
-              <w:rPr>
-                <w:vertAlign w:val="subscript"/>
-              </w:rPr>
-              <w:t xml:space="preserve">p</w:t>
-            </w:r>
-          </w:p>
-        </w:tc>
-        <w:tc>
-          <w:tcPr/>
-          <w:p>
-            <w:pPr>
-              <w:pStyle w:val="Compact"/>
-              <w:jc w:val="left"/>
-            </w:pPr>
-            <w:r>
-              <w:t xml:space="preserve">mm</w:t>
-            </w:r>
-          </w:p>
-        </w:tc>
-        <w:tc>
-          <w:tcPr/>
-          <w:p>
-            <w:pPr>
-              <w:pStyle w:val="Compact"/>
-              <w:jc w:val="left"/>
-            </w:pPr>
-            <w:r>
-              <w:t xml:space="preserve">Bearing catalog</w:t>
-            </w:r>
-          </w:p>
-        </w:tc>
-      </w:tr>
-      <w:tr>
-        <w:tc>
-          <w:tcPr/>
-          <w:p>
-            <w:pPr>
-              <w:pStyle w:val="Compact"/>
-              <w:jc w:val="left"/>
-            </w:pPr>
-            <w:r>
-              <w:t xml:space="preserve">Contact (cup) angle</w:t>
-            </w:r>
-          </w:p>
-        </w:tc>
-        <w:tc>
-          <w:tcPr/>
-          <w:p>
-            <w:pPr>
-              <w:pStyle w:val="Compact"/>
-              <w:jc w:val="left"/>
-            </w:pPr>
-            <w:r>
-              <w:t xml:space="preserve">α</w:t>
-            </w:r>
-          </w:p>
-        </w:tc>
-        <w:tc>
-          <w:tcPr/>
-          <w:p>
-            <w:pPr>
-              <w:pStyle w:val="Compact"/>
-              <w:jc w:val="left"/>
-            </w:pPr>
-            <w:r>
-              <w:t xml:space="preserve">deg</w:t>
-            </w:r>
-          </w:p>
-        </w:tc>
-        <w:tc>
-          <w:tcPr/>
-          <w:p>
-            <w:pPr>
-              <w:pStyle w:val="Compact"/>
-              <w:jc w:val="left"/>
-            </w:pPr>
-            <w:r>
-              <w:t xml:space="preserve">Bearing catalog</w:t>
-            </w:r>
-          </w:p>
-        </w:tc>
-      </w:tr>
-      <w:tr>
-        <w:tc>
-          <w:tcPr/>
-          <w:p>
-            <w:pPr>
-              <w:pStyle w:val="Compact"/>
-              <w:jc w:val="left"/>
-            </w:pPr>
-            <w:r>
-              <w:t xml:space="preserve">Bearing kick ratio</w:t>
-            </w:r>
-          </w:p>
-        </w:tc>
-        <w:tc>
-          <w:tcPr/>
-          <w:p>
-            <w:pPr>
-              <w:pStyle w:val="Compact"/>
-              <w:jc w:val="left"/>
-            </w:pPr>
-            <w:r>
-              <w:t xml:space="preserve">k</w:t>
-            </w:r>
-          </w:p>
-        </w:tc>
-        <w:tc>
-          <w:tcPr/>
-          <w:p>
-            <w:pPr>
-              <w:pStyle w:val="Compact"/>
-              <w:jc w:val="left"/>
-            </w:pPr>
-            <w:r>
-              <w:t xml:space="preserve">–</w:t>
-            </w:r>
-          </w:p>
-        </w:tc>
-        <w:tc>
-          <w:tcPr/>
-          <w:p>
-            <w:pPr>
-              <w:pStyle w:val="Compact"/>
-              <w:jc w:val="left"/>
-            </w:pPr>
-            <w:r>
-              <w:t xml:space="preserve">Estimate (1%)</w:t>
-            </w:r>
-          </w:p>
-        </w:tc>
-      </w:tr>
-    </w:tbl>
-    <w:bookmarkEnd w:id="41"/>
-    <w:bookmarkStart w:id="42" w:name="operating-and-reporting-inputs"/>
-    <w:p>
-      <w:pPr>
-        <w:pStyle w:val="Heading3"/>
-      </w:pPr>
-      <w:r>
-        <w:t xml:space="preserve">5.3 Operating and reporting inputs</w:t>
-      </w:r>
-    </w:p>
-    <w:tbl>
-      <w:tblPr>
-        <w:tblStyle w:val="Table"/>
-        <w:tblW w:type="auto" w:w="0"/>
-        <w:tblLook w:firstRow="1" w:lastRow="0" w:firstColumn="0" w:lastColumn="0" w:noHBand="0" w:noVBand="0" w:val="0020"/>
-        <w:jc w:val="start"/>
-      </w:tblPr>
-      <w:tblGrid>
-        <w:gridCol w:w="1980"/>
-        <w:gridCol w:w="1980"/>
-        <w:gridCol w:w="1980"/>
-        <w:gridCol w:w="1980"/>
-      </w:tblGrid>
-      <w:tr>
-        <w:trPr>
-          <w:tblHeader w:val="true"/>
-        </w:trPr>
-        <w:tc>
-          <w:tcPr/>
-          <w:p>
-            <w:pPr>
-              <w:pStyle w:val="Compact"/>
-              <w:jc w:val="left"/>
-            </w:pPr>
-            <w:r>
-              <w:t xml:space="preserve">Input</w:t>
-            </w:r>
-          </w:p>
-        </w:tc>
-        <w:tc>
-          <w:tcPr/>
-          <w:p>
-            <w:pPr>
-              <w:pStyle w:val="Compact"/>
-              <w:jc w:val="left"/>
-            </w:pPr>
-            <w:r>
-              <w:t xml:space="preserve">Symbol</w:t>
-            </w:r>
-          </w:p>
-        </w:tc>
-        <w:tc>
-          <w:tcPr/>
-          <w:p>
-            <w:pPr>
-              <w:pStyle w:val="Compact"/>
-              <w:jc w:val="left"/>
-            </w:pPr>
-            <w:r>
-              <w:t xml:space="preserve">Units</w:t>
-            </w:r>
-          </w:p>
-        </w:tc>
-        <w:tc>
-          <w:tcPr/>
-          <w:p>
-            <w:pPr>
-              <w:pStyle w:val="Compact"/>
-              <w:jc w:val="left"/>
-            </w:pPr>
-            <w:r>
-              <w:t xml:space="preserve">Source</w:t>
-            </w:r>
-          </w:p>
-        </w:tc>
-      </w:tr>
-      <w:tr>
-        <w:tc>
-          <w:tcPr/>
-          <w:p>
-            <w:pPr>
-              <w:pStyle w:val="Compact"/>
-              <w:jc w:val="left"/>
-            </w:pPr>
-            <w:r>
               <w:t xml:space="preserve">Spin-up time</w:t>
             </w:r>
           </w:p>
@@ -6906,7 +8857,7 @@
         <w:pStyle w:val="FirstParagraph"/>
       </w:pPr>
       <w:r>
-        <w:t xml:space="preserve">Most inputs are taken directly from CAD, specifications or catalogs. Two are estimates. The tilt θ has no specified tolerance, so a small value consistent with ordinary machining and assembly practice is used. The bearing kick ratio k stands in for bearing vibration data, which can only come from the supplier or a test.</w:t>
+        <w:t xml:space="preserve">Most inputs are taken directly from CAD, specifications or catalogs. The tilt θ has no specified tolerance, so a small value consistent with ordinary machining and assembly practice is used. The bearing imperfection amplitudes are specified values: they should be taken from the bearing precision class or the drawing tolerances, and replaced with measured values when inspection data is available. The damping ratio is an assumed typical value.</w:t>
       </w:r>
     </w:p>
     <w:p>
@@ -6938,7 +8889,7 @@
         <w:t xml:space="preserve"> </w:t>
       </w:r>
       <w:r>
-        <w:t xml:space="preserve">follows from Equation (38) in Section 6.</w:t>
+        <w:t xml:space="preserve">follows from Equation (47) in Section 6.</w:t>
       </w:r>
     </w:p>
     <w:bookmarkEnd w:id="43"/>
@@ -7112,7 +9063,7 @@
       </m:oMath>
       <w:r>
         <w:tab/>
-        <w:t>(37)</w:t>
+        <w:t>(46)</w:t>
       </w:r>
     </w:p>
     <w:p>
@@ -7184,7 +9135,7 @@
       </m:oMath>
       <w:r>
         <w:tab/>
-        <w:t>(38)</w:t>
+        <w:t>(47)</w:t>
       </w:r>
     </w:p>
     <w:bookmarkEnd w:id="45"/>
@@ -7270,7 +9221,7 @@
       </m:oMath>
       <w:r>
         <w:tab/>
-        <w:t>(39)</w:t>
+        <w:t>(48)</w:t>
       </w:r>
     </w:p>
     <w:p>
@@ -7338,7 +9289,7 @@
       </m:oMath>
       <w:r>
         <w:tab/>
-        <w:t>(40)</w:t>
+        <w:t>(49)</w:t>
       </w:r>
     </w:p>
     <w:p>
@@ -7370,7 +9321,7 @@
         <w:t xml:space="preserve"> </w:t>
       </w:r>
       <w:r>
-        <w:t xml:space="preserve">come from Equations (5) and (10) or from a balance specification. Both loads grow with the square of speed, so doubling the speed quadruples them. Seen from the stationary shaft, each appears on the two sideways axes as a pair of equal sinusoids, 90° apart, as in Equations (34) and (35).</w:t>
+        <w:t xml:space="preserve">come from Equations (5) and (10) or from a balance specification. Both loads grow with the square of speed, so doubling the speed quadruples them. Seen from the stationary shaft, each appears on the two sideways axes as a pair of equal sinusoids, 90° apart, as in Equations (43) and (44).</w:t>
       </w:r>
     </w:p>
     <w:bookmarkEnd w:id="46"/>
@@ -7400,7 +9351,7 @@
         <w:t xml:space="preserve"> </w:t>
       </w:r>
       <w:r>
-        <w:t xml:space="preserve">along the shaft. Following Equation (31), they are moved directly to the reference point in a single step:</w:t>
+        <w:t xml:space="preserve">along the shaft. Following Equation (40), they are moved directly to the reference point in a single step:</w:t>
       </w:r>
     </w:p>
     <w:p>
@@ -7566,7 +9517,7 @@
       </m:oMath>
       <w:r>
         <w:tab/>
-        <w:t>(41)</w:t>
+        <w:t>(50)</w:t>
       </w:r>
     </w:p>
     <w:p>
@@ -7725,7 +9676,7 @@
       </m:oMath>
       <w:r>
         <w:tab/>
-        <w:t>(42)</w:t>
+        <w:t>(51)</w:t>
       </w:r>
     </w:p>
     <w:p>
@@ -7733,7 +9684,7 @@
         <w:pStyle w:val="FirstParagraph"/>
       </w:pPr>
       <w:r>
-        <w:t xml:space="preserve">All shafts are parallel to the structure z axis, so no rotation of axes is needed and R in Equations (32) and (33) is the identity matrix.</w:t>
+        <w:t xml:space="preserve">All shafts are parallel to the structure z axis, so no rotation of axes is needed and R in Equations (41) and (42) is the identity matrix.</w:t>
       </w:r>
     </w:p>
     <w:bookmarkEnd w:id="47"/>
@@ -7751,7 +9702,7 @@
         <w:pStyle w:val="FirstParagraph"/>
       </w:pPr>
       <w:r>
-        <w:t xml:space="preserve">The wheel and the arm also produce quasi-steady loads. Changing a part’s speed takes a torque, which the motor applies to the rotor and the stator passes into the shaft. From Equations (18) and (19), spin-up and spin-down are treated separately:</w:t>
+        <w:t xml:space="preserve">The wheel and the arm also produce quasi-steady loads. Changing a part’s speed takes a torque, which the motor applies to the rotor and the stator passes into the shaft. From Equations (27) and (28), spin-up and spin-down are treated separately:</w:t>
       </w:r>
     </w:p>
     <w:p>
@@ -7865,7 +9816,7 @@
       </m:oMath>
       <w:r>
         <w:tab/>
-        <w:t>(43)</w:t>
+        <w:t>(52)</w:t>
       </w:r>
     </w:p>
     <w:p>
@@ -8003,7 +9954,7 @@
       </m:oMath>
       <w:r>
         <w:tab/>
-        <w:t>(44)</w:t>
+        <w:t>(53)</w:t>
       </w:r>
     </w:p>
     <w:p>
@@ -8019,7 +9970,7 @@
         <w:pStyle w:val="BodyText"/>
       </w:pPr>
       <w:r>
-        <w:t xml:space="preserve">If the support structure rotated, each part would also apply a gyroscopic moment, Equation (25). Because all shafts are stationary, ω</w:t>
+        <w:t xml:space="preserve">If the support structure rotated, each part would also apply a gyroscopic moment, Equation (34). Because all shafts are stationary, ω</w:t>
       </w:r>
       <w:r>
         <w:rPr>
@@ -8031,7 +9982,7 @@
         <w:t xml:space="preserve"> </w:t>
       </w:r>
       <w:r>
-        <w:t xml:space="preserve">is zero and this moment does not arise. The tangential imbalance force of Equation (20) is also neglected, since it is under 1% of the main force for the ramp times used.</w:t>
+        <w:t xml:space="preserve">is zero and this moment does not arise. The tangential imbalance force of Equation (29) is also neglected, since it is under 1% of the main force for the ramp times used.</w:t>
       </w:r>
     </w:p>
     <w:bookmarkEnd w:id="48"/>
@@ -8049,7 +10000,7 @@
         <w:pStyle w:val="FirstParagraph"/>
       </w:pPr>
       <w:r>
-        <w:t xml:space="preserve">The bearing frequencies for each part follow from Equations (11) to (14), using the outer-race-rotating forms, with f</w:t>
+        <w:t xml:space="preserve">Each bearing of each pair is modeled separately. The bearing frequencies follow from Equations (11) to (14), using the outer-race-rotating forms, with f</w:t>
       </w:r>
       <w:r>
         <w:rPr>
@@ -8061,7 +10012,15 @@
         <w:t xml:space="preserve"> </w:t>
       </w:r>
       <w:r>
-        <w:t xml:space="preserve">taken as that part’s own rotor frequency. With no supplier or test data, the size of each bearing harmonic is estimated as a fraction k of the part’s static imbalance force. The four harmonics are added at full value, the axial component follows from Equation (17), and the lateral force acting at the part’s position adds a rocking moment at the reference point:</w:t>
+        <w:t xml:space="preserve">taken as that part’s own rotor frequency. The preload gives the roller load and stiffness through Equations (17) to (19), and the bearing radial and axial stiffness through Equations (20) and (21). If the supplier gives a radial stiffness, it is used instead and the roller stiffness is found from Equation (20).</w:t>
+      </w:r>
+    </w:p>
+    <w:p>
+      <w:pPr>
+        <w:pStyle w:val="BodyText"/>
+      </w:pPr>
+      <w:r>
+        <w:t xml:space="preserve">The rotor sits on both bearings of its pair, so its natural frequencies for lateral and axial motion are:</w:t>
       </w:r>
     </w:p>
     <w:p>
@@ -8079,10 +10038,19 @@
         <m:sSub>
           <m:e>
             <m:r>
-              <m:t>F</m:t>
+              <m:t>f</m:t>
             </m:r>
           </m:e>
           <m:sub>
+            <m:r>
+              <m:t>n</m:t>
+            </m:r>
+            <m:r>
+              <m:rPr>
+                <m:sty m:val="p"/>
+              </m:rPr>
+              <m:t>,</m:t>
+            </m:r>
             <m:r>
               <m:rPr>
                 <m:sty m:val="p"/>
@@ -8109,34 +10077,1013 @@
           </m:rPr>
           <m:t>=</m:t>
         </m:r>
-        <m:r>
-          <m:t>4</m:t>
-        </m:r>
-        <m:r>
-          <m:t> </m:t>
-        </m:r>
-        <m:r>
-          <m:t>k</m:t>
-        </m:r>
-        <m:r>
-          <m:t> </m:t>
+        <m:f>
+          <m:fPr>
+            <m:type m:val="bar"/>
+          </m:fPr>
+          <m:num>
+            <m:r>
+              <m:t>1</m:t>
+            </m:r>
+          </m:num>
+          <m:den>
+            <m:r>
+              <m:t>2</m:t>
+            </m:r>
+            <m:r>
+              <m:t>π</m:t>
+            </m:r>
+          </m:den>
+        </m:f>
+        <m:rad>
+          <m:radPr>
+            <m:degHide m:val="on"/>
+          </m:radPr>
+          <m:deg/>
+          <m:e>
+            <m:f>
+              <m:fPr>
+                <m:type m:val="bar"/>
+              </m:fPr>
+              <m:num>
+                <m:r>
+                  <m:t>2</m:t>
+                </m:r>
+                <m:sSub>
+                  <m:e>
+                    <m:r>
+                      <m:t>K</m:t>
+                    </m:r>
+                  </m:e>
+                  <m:sub>
+                    <m:r>
+                      <m:t>r</m:t>
+                    </m:r>
+                    <m:r>
+                      <m:t>a</m:t>
+                    </m:r>
+                    <m:r>
+                      <m:t>d</m:t>
+                    </m:r>
+                  </m:sub>
+                </m:sSub>
+              </m:num>
+              <m:den>
+                <m:r>
+                  <m:t>m</m:t>
+                </m:r>
+              </m:den>
+            </m:f>
+          </m:e>
+        </m:rad>
+        <m:r>
+          <m:rPr>
+            <m:sty m:val="p"/>
+          </m:rPr>
+          <m:t>,</m:t>
+        </m:r>
+        <m:r>
+          <m:t>  </m:t>
         </m:r>
         <m:sSub>
           <m:e>
             <m:r>
-              <m:t>F</m:t>
+              <m:t>f</m:t>
             </m:r>
           </m:e>
           <m:sub>
             <m:r>
-              <m:t>w</m:t>
+              <m:t>n</m:t>
+            </m:r>
+            <m:r>
+              <m:rPr>
+                <m:sty m:val="p"/>
+              </m:rPr>
+              <m:t>,</m:t>
+            </m:r>
+            <m:r>
+              <m:rPr>
+                <m:sty m:val="p"/>
+              </m:rPr>
+              <m:t>a</m:t>
+            </m:r>
+            <m:r>
+              <m:rPr>
+                <m:sty m:val="p"/>
+              </m:rPr>
+              <m:t>x</m:t>
             </m:r>
           </m:sub>
         </m:sSub>
+        <m:r>
+          <m:rPr>
+            <m:sty m:val="p"/>
+          </m:rPr>
+          <m:t>=</m:t>
+        </m:r>
+        <m:f>
+          <m:fPr>
+            <m:type m:val="bar"/>
+          </m:fPr>
+          <m:num>
+            <m:r>
+              <m:t>1</m:t>
+            </m:r>
+          </m:num>
+          <m:den>
+            <m:r>
+              <m:t>2</m:t>
+            </m:r>
+            <m:r>
+              <m:t>π</m:t>
+            </m:r>
+          </m:den>
+        </m:f>
+        <m:rad>
+          <m:radPr>
+            <m:degHide m:val="on"/>
+          </m:radPr>
+          <m:deg/>
+          <m:e>
+            <m:f>
+              <m:fPr>
+                <m:type m:val="bar"/>
+              </m:fPr>
+              <m:num>
+                <m:r>
+                  <m:t>2</m:t>
+                </m:r>
+                <m:sSub>
+                  <m:e>
+                    <m:r>
+                      <m:t>K</m:t>
+                    </m:r>
+                  </m:e>
+                  <m:sub>
+                    <m:r>
+                      <m:rPr>
+                        <m:sty m:val="p"/>
+                      </m:rPr>
+                      <m:t>a</m:t>
+                    </m:r>
+                    <m:r>
+                      <m:rPr>
+                        <m:sty m:val="p"/>
+                      </m:rPr>
+                      <m:t>x</m:t>
+                    </m:r>
+                  </m:sub>
+                </m:sSub>
+              </m:num>
+              <m:den>
+                <m:r>
+                  <m:t>m</m:t>
+                </m:r>
+              </m:den>
+            </m:f>
+          </m:e>
+        </m:rad>
       </m:oMath>
       <w:r>
         <w:tab/>
-        <w:t>(45)</w:t>
+        <w:t>(54)</w:t>
+      </w:r>
+    </w:p>
+    <w:p>
+      <w:pPr>
+        <w:pStyle w:val="FirstParagraph"/>
+      </w:pPr>
+      <w:r>
+        <w:t xml:space="preserve">For each bearing and each harmonic k = 1 to k</w:t>
+      </w:r>
+      <w:r>
+        <w:rPr>
+          <w:vertAlign w:val="subscript"/>
+        </w:rPr>
+        <w:t xml:space="preserve">max</w:t>
+      </w:r>
+      <w:r>
+        <w:t xml:space="preserve">, the specified imperfections give the following disturbance lines, with f</w:t>
+      </w:r>
+      <w:r>
+        <w:rPr>
+          <w:vertAlign w:val="subscript"/>
+        </w:rPr>
+        <w:t xml:space="preserve">c</w:t>
+      </w:r>
+      <w:r>
+        <w:t xml:space="preserve">, f</w:t>
+      </w:r>
+      <w:r>
+        <w:rPr>
+          <w:vertAlign w:val="subscript"/>
+        </w:rPr>
+        <w:t xml:space="preserve">o</w:t>
+      </w:r>
+      <w:r>
+        <w:t xml:space="preserve">, f</w:t>
+      </w:r>
+      <w:r>
+        <w:rPr>
+          <w:vertAlign w:val="subscript"/>
+        </w:rPr>
+        <w:t xml:space="preserve">i</w:t>
+      </w:r>
+      <w:r>
+        <w:t xml:space="preserve"> </w:t>
+      </w:r>
+      <w:r>
+        <w:t xml:space="preserve">and f</w:t>
+      </w:r>
+      <w:r>
+        <w:rPr>
+          <w:vertAlign w:val="subscript"/>
+        </w:rPr>
+        <w:t xml:space="preserve">b</w:t>
+      </w:r>
+      <w:r>
+        <w:t xml:space="preserve"> </w:t>
+      </w:r>
+      <w:r>
+        <w:t xml:space="preserve">the cage, outer race pass, inner race pass and roller spin frequencies:</w:t>
+      </w:r>
+    </w:p>
+    <w:tbl>
+      <w:tblPr>
+        <w:tblStyle w:val="Table"/>
+        <w:tblW w:type="pct" w:w="5000"/>
+        <w:tblLook w:firstRow="1" w:lastRow="0" w:firstColumn="0" w:lastColumn="0" w:noHBand="0" w:noVBand="0" w:val="0020"/>
+        <w:jc w:val="start"/>
+      </w:tblPr>
+      <w:tblGrid>
+        <w:gridCol w:w="1980"/>
+        <w:gridCol w:w="1980"/>
+        <w:gridCol w:w="1980"/>
+        <w:gridCol w:w="1980"/>
+      </w:tblGrid>
+      <w:tr>
+        <w:trPr>
+          <w:tblHeader w:val="true"/>
+        </w:trPr>
+        <w:tc>
+          <w:tcPr/>
+          <w:p>
+            <w:pPr>
+              <w:pStyle w:val="Compact"/>
+              <w:jc w:val="left"/>
+            </w:pPr>
+            <w:r>
+              <w:t xml:space="preserve">Source</w:t>
+            </w:r>
+          </w:p>
+        </w:tc>
+        <w:tc>
+          <w:tcPr/>
+          <w:p>
+            <w:pPr>
+              <w:pStyle w:val="Compact"/>
+              <w:jc w:val="left"/>
+            </w:pPr>
+            <w:r>
+              <w:t xml:space="preserve">Direction</w:t>
+            </w:r>
+          </w:p>
+        </w:tc>
+        <w:tc>
+          <w:tcPr/>
+          <w:p>
+            <w:pPr>
+              <w:pStyle w:val="Compact"/>
+              <w:jc w:val="left"/>
+            </w:pPr>
+            <w:r>
+              <w:t xml:space="preserve">Frequency</w:t>
+            </w:r>
+          </w:p>
+        </w:tc>
+        <w:tc>
+          <w:tcPr/>
+          <w:p>
+            <w:pPr>
+              <w:pStyle w:val="Compact"/>
+              <w:jc w:val="left"/>
+            </w:pPr>
+            <w:r>
+              <w:t xml:space="preserve">Blocked force</w:t>
+            </w:r>
+          </w:p>
+        </w:tc>
+      </w:tr>
+      <w:tr>
+        <w:tc>
+          <w:tcPr/>
+          <w:p>
+            <w:pPr>
+              <w:pStyle w:val="Compact"/>
+              <w:jc w:val="left"/>
+            </w:pPr>
+            <w:r>
+              <w:t xml:space="preserve">Inner race waviness, q = kZ ± 1</w:t>
+            </w:r>
+          </w:p>
+        </w:tc>
+        <w:tc>
+          <w:tcPr/>
+          <w:p>
+            <w:pPr>
+              <w:pStyle w:val="Compact"/>
+              <w:jc w:val="left"/>
+            </w:pPr>
+            <w:r>
+              <w:t xml:space="preserve">Lateral</w:t>
+            </w:r>
+          </w:p>
+        </w:tc>
+        <w:tc>
+          <w:tcPr/>
+          <w:p>
+            <w:pPr>
+              <w:pStyle w:val="Compact"/>
+              <w:jc w:val="left"/>
+            </w:pPr>
+            <w:r>
+              <w:t xml:space="preserve">k f</w:t>
+            </w:r>
+            <w:r>
+              <w:rPr>
+                <w:vertAlign w:val="subscript"/>
+              </w:rPr>
+              <w:t xml:space="preserve">i</w:t>
+            </w:r>
+          </w:p>
+        </w:tc>
+        <w:tc>
+          <w:tcPr/>
+          <w:p>
+            <w:pPr>
+              <w:pStyle w:val="Compact"/>
+              <w:jc w:val="left"/>
+            </w:pPr>
+            <w:r>
+              <w:t xml:space="preserve">Z k</w:t>
+            </w:r>
+            <w:r>
+              <w:rPr>
+                <w:vertAlign w:val="subscript"/>
+              </w:rPr>
+              <w:t xml:space="preserve">r</w:t>
+            </w:r>
+            <w:r>
+              <w:t xml:space="preserve"> </w:t>
+            </w:r>
+            <w:r>
+              <w:t xml:space="preserve">A</w:t>
+            </w:r>
+            <w:r>
+              <w:rPr>
+                <w:vertAlign w:val="subscript"/>
+              </w:rPr>
+              <w:t xml:space="preserve">i</w:t>
+            </w:r>
+            <w:r>
+              <w:t xml:space="preserve"> </w:t>
+            </w:r>
+            <w:r>
+              <w:t xml:space="preserve">cos α</w:t>
+            </w:r>
+          </w:p>
+        </w:tc>
+      </w:tr>
+      <w:tr>
+        <w:tc>
+          <w:tcPr/>
+          <w:p>
+            <w:pPr>
+              <w:pStyle w:val="Compact"/>
+              <w:jc w:val="left"/>
+            </w:pPr>
+            <w:r>
+              <w:t xml:space="preserve">Inner race waviness, q = kZ</w:t>
+            </w:r>
+          </w:p>
+        </w:tc>
+        <w:tc>
+          <w:tcPr/>
+          <w:p>
+            <w:pPr>
+              <w:pStyle w:val="Compact"/>
+              <w:jc w:val="left"/>
+            </w:pPr>
+            <w:r>
+              <w:t xml:space="preserve">Axial</w:t>
+            </w:r>
+          </w:p>
+        </w:tc>
+        <w:tc>
+          <w:tcPr/>
+          <w:p>
+            <w:pPr>
+              <w:pStyle w:val="Compact"/>
+              <w:jc w:val="left"/>
+            </w:pPr>
+            <w:r>
+              <w:t xml:space="preserve">k f</w:t>
+            </w:r>
+            <w:r>
+              <w:rPr>
+                <w:vertAlign w:val="subscript"/>
+              </w:rPr>
+              <w:t xml:space="preserve">i</w:t>
+            </w:r>
+          </w:p>
+        </w:tc>
+        <w:tc>
+          <w:tcPr/>
+          <w:p>
+            <w:pPr>
+              <w:pStyle w:val="Compact"/>
+              <w:jc w:val="left"/>
+            </w:pPr>
+            <w:r>
+              <w:t xml:space="preserve">Z k</w:t>
+            </w:r>
+            <w:r>
+              <w:rPr>
+                <w:vertAlign w:val="subscript"/>
+              </w:rPr>
+              <w:t xml:space="preserve">r</w:t>
+            </w:r>
+            <w:r>
+              <w:t xml:space="preserve"> </w:t>
+            </w:r>
+            <w:r>
+              <w:t xml:space="preserve">A</w:t>
+            </w:r>
+            <w:r>
+              <w:rPr>
+                <w:vertAlign w:val="subscript"/>
+              </w:rPr>
+              <w:t xml:space="preserve">i</w:t>
+            </w:r>
+            <w:r>
+              <w:t xml:space="preserve"> </w:t>
+            </w:r>
+            <w:r>
+              <w:t xml:space="preserve">sin α</w:t>
+            </w:r>
+          </w:p>
+        </w:tc>
+      </w:tr>
+      <w:tr>
+        <w:tc>
+          <w:tcPr/>
+          <w:p>
+            <w:pPr>
+              <w:pStyle w:val="Compact"/>
+              <w:jc w:val="left"/>
+            </w:pPr>
+            <w:r>
+              <w:t xml:space="preserve">Outer race waviness, q = kZ + 1</w:t>
+            </w:r>
+          </w:p>
+        </w:tc>
+        <w:tc>
+          <w:tcPr/>
+          <w:p>
+            <w:pPr>
+              <w:pStyle w:val="Compact"/>
+              <w:jc w:val="left"/>
+            </w:pPr>
+            <w:r>
+              <w:t xml:space="preserve">Lateral</w:t>
+            </w:r>
+          </w:p>
+        </w:tc>
+        <w:tc>
+          <w:tcPr/>
+          <w:p>
+            <w:pPr>
+              <w:pStyle w:val="Compact"/>
+              <w:jc w:val="left"/>
+            </w:pPr>
+            <w:r>
+              <w:t xml:space="preserve">k f</w:t>
+            </w:r>
+            <w:r>
+              <w:rPr>
+                <w:vertAlign w:val="subscript"/>
+              </w:rPr>
+              <w:t xml:space="preserve">o</w:t>
+            </w:r>
+            <w:r>
+              <w:t xml:space="preserve"> </w:t>
+            </w:r>
+            <w:r>
+              <w:t xml:space="preserve">+ f</w:t>
+            </w:r>
+            <w:r>
+              <w:rPr>
+                <w:vertAlign w:val="subscript"/>
+              </w:rPr>
+              <w:t xml:space="preserve">r</w:t>
+            </w:r>
+          </w:p>
+        </w:tc>
+        <w:tc>
+          <w:tcPr/>
+          <w:p>
+            <w:pPr>
+              <w:pStyle w:val="Compact"/>
+              <w:jc w:val="left"/>
+            </w:pPr>
+            <w:r>
+              <w:t xml:space="preserve">(Z/2) k</w:t>
+            </w:r>
+            <w:r>
+              <w:rPr>
+                <w:vertAlign w:val="subscript"/>
+              </w:rPr>
+              <w:t xml:space="preserve">r</w:t>
+            </w:r>
+            <w:r>
+              <w:t xml:space="preserve"> </w:t>
+            </w:r>
+            <w:r>
+              <w:t xml:space="preserve">A</w:t>
+            </w:r>
+            <w:r>
+              <w:rPr>
+                <w:vertAlign w:val="subscript"/>
+              </w:rPr>
+              <w:t xml:space="preserve">o</w:t>
+            </w:r>
+            <w:r>
+              <w:t xml:space="preserve"> </w:t>
+            </w:r>
+            <w:r>
+              <w:t xml:space="preserve">cos α</w:t>
+            </w:r>
+          </w:p>
+        </w:tc>
+      </w:tr>
+      <w:tr>
+        <w:tc>
+          <w:tcPr/>
+          <w:p>
+            <w:pPr>
+              <w:pStyle w:val="Compact"/>
+              <w:jc w:val="left"/>
+            </w:pPr>
+            <w:r>
+              <w:t xml:space="preserve">Outer race waviness, q = kZ − 1</w:t>
+            </w:r>
+          </w:p>
+        </w:tc>
+        <w:tc>
+          <w:tcPr/>
+          <w:p>
+            <w:pPr>
+              <w:pStyle w:val="Compact"/>
+              <w:jc w:val="left"/>
+            </w:pPr>
+            <w:r>
+              <w:t xml:space="preserve">Lateral</w:t>
+            </w:r>
+          </w:p>
+        </w:tc>
+        <w:tc>
+          <w:tcPr/>
+          <w:p>
+            <w:pPr>
+              <w:pStyle w:val="Compact"/>
+              <w:jc w:val="left"/>
+            </w:pPr>
+            <w:r>
+              <w:t xml:space="preserve">|k f</w:t>
+            </w:r>
+            <w:r>
+              <w:rPr>
+                <w:vertAlign w:val="subscript"/>
+              </w:rPr>
+              <w:t xml:space="preserve">o</w:t>
+            </w:r>
+            <w:r>
+              <w:t xml:space="preserve"> </w:t>
+            </w:r>
+            <w:r>
+              <w:t xml:space="preserve">− f</w:t>
+            </w:r>
+            <w:r>
+              <w:rPr>
+                <w:vertAlign w:val="subscript"/>
+              </w:rPr>
+              <w:t xml:space="preserve">r</w:t>
+            </w:r>
+            <w:r>
+              <w:t xml:space="preserve">|</w:t>
+            </w:r>
+          </w:p>
+        </w:tc>
+        <w:tc>
+          <w:tcPr/>
+          <w:p>
+            <w:pPr>
+              <w:pStyle w:val="Compact"/>
+              <w:jc w:val="left"/>
+            </w:pPr>
+            <w:r>
+              <w:t xml:space="preserve">(Z/2) k</w:t>
+            </w:r>
+            <w:r>
+              <w:rPr>
+                <w:vertAlign w:val="subscript"/>
+              </w:rPr>
+              <w:t xml:space="preserve">r</w:t>
+            </w:r>
+            <w:r>
+              <w:t xml:space="preserve"> </w:t>
+            </w:r>
+            <w:r>
+              <w:t xml:space="preserve">A</w:t>
+            </w:r>
+            <w:r>
+              <w:rPr>
+                <w:vertAlign w:val="subscript"/>
+              </w:rPr>
+              <w:t xml:space="preserve">o</w:t>
+            </w:r>
+            <w:r>
+              <w:t xml:space="preserve"> </w:t>
+            </w:r>
+            <w:r>
+              <w:t xml:space="preserve">cos α</w:t>
+            </w:r>
+          </w:p>
+        </w:tc>
+      </w:tr>
+      <w:tr>
+        <w:tc>
+          <w:tcPr/>
+          <w:p>
+            <w:pPr>
+              <w:pStyle w:val="Compact"/>
+              <w:jc w:val="left"/>
+            </w:pPr>
+            <w:r>
+              <w:t xml:space="preserve">Outer race waviness, q = kZ</w:t>
+            </w:r>
+          </w:p>
+        </w:tc>
+        <w:tc>
+          <w:tcPr/>
+          <w:p>
+            <w:pPr>
+              <w:pStyle w:val="Compact"/>
+              <w:jc w:val="left"/>
+            </w:pPr>
+            <w:r>
+              <w:t xml:space="preserve">Axial</w:t>
+            </w:r>
+          </w:p>
+        </w:tc>
+        <w:tc>
+          <w:tcPr/>
+          <w:p>
+            <w:pPr>
+              <w:pStyle w:val="Compact"/>
+              <w:jc w:val="left"/>
+            </w:pPr>
+            <w:r>
+              <w:t xml:space="preserve">k f</w:t>
+            </w:r>
+            <w:r>
+              <w:rPr>
+                <w:vertAlign w:val="subscript"/>
+              </w:rPr>
+              <w:t xml:space="preserve">o</w:t>
+            </w:r>
+          </w:p>
+        </w:tc>
+        <w:tc>
+          <w:tcPr/>
+          <w:p>
+            <w:pPr>
+              <w:pStyle w:val="Compact"/>
+              <w:jc w:val="left"/>
+            </w:pPr>
+            <w:r>
+              <w:t xml:space="preserve">Z k</w:t>
+            </w:r>
+            <w:r>
+              <w:rPr>
+                <w:vertAlign w:val="subscript"/>
+              </w:rPr>
+              <w:t xml:space="preserve">r</w:t>
+            </w:r>
+            <w:r>
+              <w:t xml:space="preserve"> </w:t>
+            </w:r>
+            <w:r>
+              <w:t xml:space="preserve">A</w:t>
+            </w:r>
+            <w:r>
+              <w:rPr>
+                <w:vertAlign w:val="subscript"/>
+              </w:rPr>
+              <w:t xml:space="preserve">o</w:t>
+            </w:r>
+            <w:r>
+              <w:t xml:space="preserve"> </w:t>
+            </w:r>
+            <w:r>
+              <w:t xml:space="preserve">sin α</w:t>
+            </w:r>
+          </w:p>
+        </w:tc>
+      </w:tr>
+      <w:tr>
+        <w:tc>
+          <w:tcPr/>
+          <w:p>
+            <w:pPr>
+              <w:pStyle w:val="Compact"/>
+              <w:jc w:val="left"/>
+            </w:pPr>
+            <w:r>
+              <w:t xml:space="preserve">Roller waviness, q = 2k</w:t>
+            </w:r>
+          </w:p>
+        </w:tc>
+        <w:tc>
+          <w:tcPr/>
+          <w:p>
+            <w:pPr>
+              <w:pStyle w:val="Compact"/>
+              <w:jc w:val="left"/>
+            </w:pPr>
+            <w:r>
+              <w:t xml:space="preserve">Lateral</w:t>
+            </w:r>
+          </w:p>
+        </w:tc>
+        <w:tc>
+          <w:tcPr/>
+          <w:p>
+            <w:pPr>
+              <w:pStyle w:val="Compact"/>
+              <w:jc w:val="left"/>
+            </w:pPr>
+            <w:r>
+              <w:t xml:space="preserve">2k f</w:t>
+            </w:r>
+            <w:r>
+              <w:rPr>
+                <w:vertAlign w:val="subscript"/>
+              </w:rPr>
+              <w:t xml:space="preserve">b</w:t>
+            </w:r>
+            <w:r>
+              <w:t xml:space="preserve"> </w:t>
+            </w:r>
+            <w:r>
+              <w:t xml:space="preserve">± f</w:t>
+            </w:r>
+            <w:r>
+              <w:rPr>
+                <w:vertAlign w:val="subscript"/>
+              </w:rPr>
+              <w:t xml:space="preserve">c</w:t>
+            </w:r>
+          </w:p>
+        </w:tc>
+        <w:tc>
+          <w:tcPr/>
+          <w:p>
+            <w:pPr>
+              <w:pStyle w:val="Compact"/>
+              <w:jc w:val="left"/>
+            </w:pPr>
+            <w:r>
+              <w:t xml:space="preserve">n</w:t>
+            </w:r>
+            <w:r>
+              <w:rPr>
+                <w:vertAlign w:val="subscript"/>
+              </w:rPr>
+              <w:t xml:space="preserve">b</w:t>
+            </w:r>
+            <w:r>
+              <w:t xml:space="preserve"> </w:t>
+            </w:r>
+            <w:r>
+              <w:t xml:space="preserve">k</w:t>
+            </w:r>
+            <w:r>
+              <w:rPr>
+                <w:vertAlign w:val="subscript"/>
+              </w:rPr>
+              <w:t xml:space="preserve">r</w:t>
+            </w:r>
+            <w:r>
+              <w:t xml:space="preserve"> </w:t>
+            </w:r>
+            <w:r>
+              <w:t xml:space="preserve">A</w:t>
+            </w:r>
+            <w:r>
+              <w:rPr>
+                <w:vertAlign w:val="subscript"/>
+              </w:rPr>
+              <w:t xml:space="preserve">b</w:t>
+            </w:r>
+            <w:r>
+              <w:t xml:space="preserve"> </w:t>
+            </w:r>
+            <w:r>
+              <w:t xml:space="preserve">cos α</w:t>
+            </w:r>
+          </w:p>
+        </w:tc>
+      </w:tr>
+      <w:tr>
+        <w:tc>
+          <w:tcPr/>
+          <w:p>
+            <w:pPr>
+              <w:pStyle w:val="Compact"/>
+              <w:jc w:val="left"/>
+            </w:pPr>
+            <w:r>
+              <w:t xml:space="preserve">Roller waviness, q = 2k</w:t>
+            </w:r>
+          </w:p>
+        </w:tc>
+        <w:tc>
+          <w:tcPr/>
+          <w:p>
+            <w:pPr>
+              <w:pStyle w:val="Compact"/>
+              <w:jc w:val="left"/>
+            </w:pPr>
+            <w:r>
+              <w:t xml:space="preserve">Axial</w:t>
+            </w:r>
+          </w:p>
+        </w:tc>
+        <w:tc>
+          <w:tcPr/>
+          <w:p>
+            <w:pPr>
+              <w:pStyle w:val="Compact"/>
+              <w:jc w:val="left"/>
+            </w:pPr>
+            <w:r>
+              <w:t xml:space="preserve">2k f</w:t>
+            </w:r>
+            <w:r>
+              <w:rPr>
+                <w:vertAlign w:val="subscript"/>
+              </w:rPr>
+              <w:t xml:space="preserve">b</w:t>
+            </w:r>
+          </w:p>
+        </w:tc>
+        <w:tc>
+          <w:tcPr/>
+          <w:p>
+            <w:pPr>
+              <w:pStyle w:val="Compact"/>
+              <w:jc w:val="left"/>
+            </w:pPr>
+            <w:r>
+              <w:t xml:space="preserve">2 n</w:t>
+            </w:r>
+            <w:r>
+              <w:rPr>
+                <w:vertAlign w:val="subscript"/>
+              </w:rPr>
+              <w:t xml:space="preserve">b</w:t>
+            </w:r>
+            <w:r>
+              <w:t xml:space="preserve"> </w:t>
+            </w:r>
+            <w:r>
+              <w:t xml:space="preserve">k</w:t>
+            </w:r>
+            <w:r>
+              <w:rPr>
+                <w:vertAlign w:val="subscript"/>
+              </w:rPr>
+              <w:t xml:space="preserve">r</w:t>
+            </w:r>
+            <w:r>
+              <w:t xml:space="preserve"> </w:t>
+            </w:r>
+            <w:r>
+              <w:t xml:space="preserve">A</w:t>
+            </w:r>
+            <w:r>
+              <w:rPr>
+                <w:vertAlign w:val="subscript"/>
+              </w:rPr>
+              <w:t xml:space="preserve">b</w:t>
+            </w:r>
+            <w:r>
+              <w:t xml:space="preserve"> </w:t>
+            </w:r>
+            <w:r>
+              <w:t xml:space="preserve">sin α</w:t>
+            </w:r>
+          </w:p>
+        </w:tc>
+      </w:tr>
+      <w:tr>
+        <w:tc>
+          <w:tcPr/>
+          <w:p>
+            <w:pPr>
+              <w:pStyle w:val="Compact"/>
+              <w:jc w:val="left"/>
+            </w:pPr>
+            <w:r>
+              <w:t xml:space="preserve">Roller diameter variation</w:t>
+            </w:r>
+          </w:p>
+        </w:tc>
+        <w:tc>
+          <w:tcPr/>
+          <w:p>
+            <w:pPr>
+              <w:pStyle w:val="Compact"/>
+              <w:jc w:val="left"/>
+            </w:pPr>
+            <w:r>
+              <w:t xml:space="preserve">Lateral</w:t>
+            </w:r>
+          </w:p>
+        </w:tc>
+        <w:tc>
+          <w:tcPr/>
+          <w:p>
+            <w:pPr>
+              <w:pStyle w:val="Compact"/>
+              <w:jc w:val="left"/>
+            </w:pPr>
+            <w:r>
+              <w:t xml:space="preserve">f</w:t>
+            </w:r>
+            <w:r>
+              <w:rPr>
+                <w:vertAlign w:val="subscript"/>
+              </w:rPr>
+              <w:t xml:space="preserve">c</w:t>
+            </w:r>
+          </w:p>
+        </w:tc>
+        <w:tc>
+          <w:tcPr/>
+          <w:p>
+            <w:pPr>
+              <w:pStyle w:val="Compact"/>
+              <w:jc w:val="left"/>
+            </w:pPr>
+            <w:r>
+              <w:t xml:space="preserve">k</w:t>
+            </w:r>
+            <w:r>
+              <w:rPr>
+                <w:vertAlign w:val="subscript"/>
+              </w:rPr>
+              <w:t xml:space="preserve">r</w:t>
+            </w:r>
+            <w:r>
+              <w:t xml:space="preserve"> </w:t>
+            </w:r>
+            <w:r>
+              <w:t xml:space="preserve">Δ cos α</w:t>
+            </w:r>
+          </w:p>
+        </w:tc>
+      </w:tr>
+    </w:tbl>
+    <w:p>
+      <w:pPr>
+        <w:pStyle w:val="BodyText"/>
+      </w:pPr>
+      <w:r>
+        <w:t xml:space="preserve">Here n</w:t>
+      </w:r>
+      <w:r>
+        <w:rPr>
+          <w:vertAlign w:val="subscript"/>
+        </w:rPr>
+        <w:t xml:space="preserve">b</w:t>
+      </w:r>
+      <w:r>
+        <w:t xml:space="preserve"> </w:t>
+      </w:r>
+      <w:r>
+        <w:t xml:space="preserve">is Z when the waviness of all rollers is assumed in phase (worst case) or √Z when their phases are taken as random. Each blocked force is converted to the force at the shaft with Equation (26), using the lateral or axial natural frequency. Lines from bearing A and bearing B fall at the same frequencies and are added. Within each rotor, all lateral lines are added to give the bearing Fx and Fy, and all axial lines to give Fz:</w:t>
       </w:r>
     </w:p>
     <w:p>
@@ -8162,13 +11109,43 @@
               <m:rPr>
                 <m:sty m:val="p"/>
               </m:rPr>
+              <m:t>l</m:t>
+            </m:r>
+            <m:r>
+              <m:rPr>
+                <m:sty m:val="p"/>
+              </m:rPr>
               <m:t>a</m:t>
             </m:r>
             <m:r>
               <m:rPr>
                 <m:sty m:val="p"/>
               </m:rPr>
-              <m:t>x</m:t>
+              <m:t>t</m:t>
+            </m:r>
+            <m:r>
+              <m:rPr>
+                <m:sty m:val="p"/>
+              </m:rPr>
+              <m:t>,</m:t>
+            </m:r>
+            <m:r>
+              <m:rPr>
+                <m:sty m:val="p"/>
+              </m:rPr>
+              <m:t>b</m:t>
+            </m:r>
+            <m:r>
+              <m:rPr>
+                <m:sty m:val="p"/>
+              </m:rPr>
+              <m:t>r</m:t>
+            </m:r>
+            <m:r>
+              <m:rPr>
+                <m:sty m:val="p"/>
+              </m:rPr>
+              <m:t>g</m:t>
             </m:r>
           </m:sub>
         </m:sSub>
@@ -8178,46 +11155,166 @@
           </m:rPr>
           <m:t>=</m:t>
         </m:r>
-        <m:sSub>
+        <m:nary>
+          <m:naryPr>
+            <m:chr m:val="∑"/>
+            <m:limLoc m:val="undOvr"/>
+            <m:subHide m:val="off"/>
+            <m:supHide m:val="on"/>
+          </m:naryPr>
+          <m:sub>
+            <m:r>
+              <m:rPr>
+                <m:nor/>
+                <m:sty m:val="p"/>
+              </m:rPr>
+              <m:t>lateral lines</m:t>
+            </m:r>
+          </m:sub>
+          <m:sup>
+            <m:r>
+              <m:t>​</m:t>
+            </m:r>
+          </m:sup>
           <m:e>
-            <m:r>
-              <m:t>F</m:t>
-            </m:r>
+            <m:sSub>
+              <m:e>
+                <m:r>
+                  <m:t>F</m:t>
+                </m:r>
+              </m:e>
+              <m:sub>
+                <m:r>
+                  <m:t>s</m:t>
+                </m:r>
+                <m:r>
+                  <m:t>h</m:t>
+                </m:r>
+                <m:r>
+                  <m:t>a</m:t>
+                </m:r>
+                <m:r>
+                  <m:t>f</m:t>
+                </m:r>
+                <m:r>
+                  <m:t>t</m:t>
+                </m:r>
+              </m:sub>
+            </m:sSub>
           </m:e>
-          <m:sub>
-            <m:r>
-              <m:rPr>
-                <m:sty m:val="p"/>
-              </m:rPr>
-              <m:t>l</m:t>
-            </m:r>
-            <m:r>
-              <m:rPr>
-                <m:sty m:val="p"/>
-              </m:rPr>
-              <m:t>a</m:t>
-            </m:r>
-            <m:r>
-              <m:rPr>
-                <m:sty m:val="p"/>
-              </m:rPr>
-              <m:t>t</m:t>
-            </m:r>
-          </m:sub>
-        </m:sSub>
+        </m:nary>
         <m:r>
           <m:rPr>
             <m:sty m:val="p"/>
           </m:rPr>
-          <m:t>tan</m:t>
-        </m:r>
-        <m:r>
-          <m:t>α</m:t>
-        </m:r>
+          <m:t>,</m:t>
+        </m:r>
+        <m:r>
+          <m:t>  </m:t>
+        </m:r>
+        <m:sSub>
+          <m:e>
+            <m:r>
+              <m:t>F</m:t>
+            </m:r>
+          </m:e>
+          <m:sub>
+            <m:r>
+              <m:rPr>
+                <m:sty m:val="p"/>
+              </m:rPr>
+              <m:t>a</m:t>
+            </m:r>
+            <m:r>
+              <m:rPr>
+                <m:sty m:val="p"/>
+              </m:rPr>
+              <m:t>x</m:t>
+            </m:r>
+            <m:r>
+              <m:rPr>
+                <m:sty m:val="p"/>
+              </m:rPr>
+              <m:t>,</m:t>
+            </m:r>
+            <m:r>
+              <m:rPr>
+                <m:sty m:val="p"/>
+              </m:rPr>
+              <m:t>b</m:t>
+            </m:r>
+            <m:r>
+              <m:rPr>
+                <m:sty m:val="p"/>
+              </m:rPr>
+              <m:t>r</m:t>
+            </m:r>
+            <m:r>
+              <m:rPr>
+                <m:sty m:val="p"/>
+              </m:rPr>
+              <m:t>g</m:t>
+            </m:r>
+          </m:sub>
+        </m:sSub>
+        <m:r>
+          <m:rPr>
+            <m:sty m:val="p"/>
+          </m:rPr>
+          <m:t>=</m:t>
+        </m:r>
+        <m:nary>
+          <m:naryPr>
+            <m:chr m:val="∑"/>
+            <m:limLoc m:val="undOvr"/>
+            <m:subHide m:val="off"/>
+            <m:supHide m:val="on"/>
+          </m:naryPr>
+          <m:sub>
+            <m:r>
+              <m:rPr>
+                <m:nor/>
+                <m:sty m:val="p"/>
+              </m:rPr>
+              <m:t>axial lines</m:t>
+            </m:r>
+          </m:sub>
+          <m:sup>
+            <m:r>
+              <m:t>​</m:t>
+            </m:r>
+          </m:sup>
+          <m:e>
+            <m:sSub>
+              <m:e>
+                <m:r>
+                  <m:t>F</m:t>
+                </m:r>
+              </m:e>
+              <m:sub>
+                <m:r>
+                  <m:t>s</m:t>
+                </m:r>
+                <m:r>
+                  <m:t>h</m:t>
+                </m:r>
+                <m:r>
+                  <m:t>a</m:t>
+                </m:r>
+                <m:r>
+                  <m:t>f</m:t>
+                </m:r>
+                <m:r>
+                  <m:t>t</m:t>
+                </m:r>
+              </m:sub>
+            </m:sSub>
+          </m:e>
+        </m:nary>
       </m:oMath>
       <w:r>
         <w:tab/>
-        <w:t>(46)</w:t>
+        <w:t>(55)</w:t>
       </w:r>
     </w:p>
     <w:p>
@@ -8341,6 +11438,30 @@
               </m:rPr>
               <m:t>t</m:t>
             </m:r>
+            <m:r>
+              <m:rPr>
+                <m:sty m:val="p"/>
+              </m:rPr>
+              <m:t>,</m:t>
+            </m:r>
+            <m:r>
+              <m:rPr>
+                <m:sty m:val="p"/>
+              </m:rPr>
+              <m:t>b</m:t>
+            </m:r>
+            <m:r>
+              <m:rPr>
+                <m:sty m:val="p"/>
+              </m:rPr>
+              <m:t>r</m:t>
+            </m:r>
+            <m:r>
+              <m:rPr>
+                <m:sty m:val="p"/>
+              </m:rPr>
+              <m:t>g</m:t>
+            </m:r>
           </m:sub>
         </m:sSub>
         <m:r>
@@ -8352,7 +11473,15 @@
       </m:oMath>
       <w:r>
         <w:tab/>
-        <w:t>(47)</w:t>
+        <w:t>(56)</w:t>
+      </w:r>
+    </w:p>
+    <w:p>
+      <w:pPr>
+        <w:pStyle w:val="FirstParagraph"/>
+      </w:pPr>
+      <w:r>
+        <w:t xml:space="preserve">Below the natural frequency the bearing force reaches the shaft as the reaction to the rotor’s motion, so it is taken to act at the rotor’s center of mass, a distance L from the reference point. The linear model is checked by comparing the largest combined imperfection with the preload deflection δ_0 of Equation (18), and a warning is given if rollers could unload.</w:t>
       </w:r>
     </w:p>
     <w:bookmarkEnd w:id="49"/>
@@ -8370,7 +11499,7 @@
         <w:pStyle w:val="FirstParagraph"/>
       </w:pPr>
       <w:r>
-        <w:t xml:space="preserve">The six components are summed over the arm, both wheels and all bearings, following Equation (28). Forces and rocking moments are added as peak values. The twist is added with its sign, and its magnitude is reported as the net assembly twist. Loads at any other operating point follow from Equation (27), using the arm speed, since the wheels track the arm at a fixed ratio.</w:t>
+        <w:t xml:space="preserve">The six components are summed over the arm, both wheels and all bearings, following Equation (37). Forces and rocking moments are added as peak values. The twist is added with its sign, and its magnitude is reported as the net assembly twist. Loads at any other operating point follow from Equation (36), using the arm speed, since the wheels track the arm at a fixed ratio.</w:t>
       </w:r>
     </w:p>
     <w:tbl>
@@ -8456,7 +11585,7 @@
               <w:t xml:space="preserve">w</w:t>
             </w:r>
             <w:r>
-              <w:t xml:space="preserve">, Equation (39)</w:t>
+              <w:t xml:space="preserve">, Equation (48)</w:t>
             </w:r>
           </w:p>
         </w:tc>
@@ -8474,10 +11603,10 @@
               <w:rPr>
                 <w:vertAlign w:val="subscript"/>
               </w:rPr>
-              <w:t xml:space="preserve">lat</w:t>
-            </w:r>
-            <w:r>
-              <w:t xml:space="preserve">, Equation (45)</w:t>
+              <w:t xml:space="preserve">lat,brg</w:t>
+            </w:r>
+            <w:r>
+              <w:t xml:space="preserve">, Equation (55)</w:t>
             </w:r>
           </w:p>
         </w:tc>
@@ -8521,10 +11650,10 @@
               <w:rPr>
                 <w:vertAlign w:val="subscript"/>
               </w:rPr>
-              <w:t xml:space="preserve">ax</w:t>
-            </w:r>
-            <w:r>
-              <w:t xml:space="preserve">, Equation (46)</w:t>
+              <w:t xml:space="preserve">ax,brg</w:t>
+            </w:r>
+            <w:r>
+              <w:t xml:space="preserve">, Equation (55)</w:t>
             </w:r>
           </w:p>
         </w:tc>
@@ -8574,7 +11703,7 @@
               <w:t xml:space="preserve"> </w:t>
             </w:r>
             <w:r>
-              <w:t xml:space="preserve">L, Equation (42)</w:t>
+              <w:t xml:space="preserve">L, Equation (51)</w:t>
             </w:r>
           </w:p>
         </w:tc>
@@ -8592,13 +11721,13 @@
               <w:rPr>
                 <w:vertAlign w:val="subscript"/>
               </w:rPr>
-              <w:t xml:space="preserve">lat</w:t>
+              <w:t xml:space="preserve">lat,brg</w:t>
             </w:r>
             <w:r>
               <w:t xml:space="preserve"> </w:t>
             </w:r>
             <w:r>
-              <w:t xml:space="preserve">L, Equation (47)</w:t>
+              <w:t xml:space="preserve">L, Equation (56)</w:t>
             </w:r>
           </w:p>
         </w:tc>
@@ -8645,7 +11774,7 @@
               <w:t xml:space="preserve">down</w:t>
             </w:r>
             <w:r>
-              <w:t xml:space="preserve">, Equations (43) and (44)</w:t>
+              <w:t xml:space="preserve">, Equations (52) and (53)</w:t>
             </w:r>
           </w:p>
         </w:tc>
@@ -8712,7 +11841,7 @@
         <w:pStyle w:val="BodyText"/>
       </w:pPr>
       <w:r>
-        <w:t xml:space="preserve">Of the sources described in Section 2, the method includes those that can be estimated from the design data available: static imbalance, dynamic imbalance, motor reaction torque and the bearings. The remaining sources are left out for specific reasons. Motor ripple and cogging need the motor pole and slot counts and ripple data, which were not yet available. Broadband noise has no deterministic model and can only be measured. Gyroscopic moments are zero because all three shafts are stationary, and even if the assembly were carried on a moving base, the counter-rotating wheels are sized to bring its total angular momentum close to zero, as in Equation (26). Each of these can be added later without changing the rest of the method.</w:t>
+        <w:t xml:space="preserve">Of the sources described in Section 2, the method includes those that can be estimated from the design data available: static imbalance, dynamic imbalance, motor reaction torque and the bearings. The remaining sources are left out for specific reasons. Motor ripple and cogging need the motor pole and slot counts and ripple data, which were not yet available. Broadband noise has no deterministic model and can only be measured. Gyroscopic moments are zero because all three shafts are stationary, and even if the assembly were carried on a moving base, the counter-rotating wheels are sized to bring its total angular momentum close to zero, as in Equation (35). Each of these can be added later without changing the rest of the method.</w:t>
       </w:r>
     </w:p>
     <w:bookmarkEnd w:id="52"/>
@@ -8730,7 +11859,7 @@
         <w:pStyle w:val="FirstParagraph"/>
       </w:pPr>
       <w:r>
-        <w:t xml:space="preserve">Because the CAD models are symmetric, the static imbalance was taken from the eccentricity specification rather than from the geometry, using Equation (5), and the lateral force at maximum speed follows from Equation (39). This force rotates with the part. It appears at the reference point as Fx and Fy, each with the same peak value, reached a quarter of a revolution apart. It produces no axial force. Once a balance specification or a balance report is available, its value of U</w:t>
+        <w:t xml:space="preserve">Because the CAD models are symmetric, the static imbalance was taken from the eccentricity specification rather than from the geometry, using Equation (5), and the lateral force at maximum speed follows from Equation (48). This force rotates with the part. It appears at the reference point as Fx and Fy, each with the same peak value, reached a quarter of a revolution apart. It produces no axial force. Once a balance specification or a balance report is available, its value of U</w:t>
       </w:r>
       <w:r>
         <w:rPr>
@@ -8798,7 +11927,7 @@
         <w:pStyle w:val="FirstParagraph"/>
       </w:pPr>
       <w:r>
-        <w:t xml:space="preserve">Each part’s loads are moved from its center of mass to the reference point in a single step, using Equation (41), so that no lever arm is counted twice. Moving the reference point changes the moments but not the forces, which lets the same calculation report loads at whichever interface the structures team needs.</w:t>
+        <w:t xml:space="preserve">Each part’s loads are moved from its center of mass to the reference point in a single step, using Equation (50), so that no lever arm is counted twice. Moving the reference point changes the moments but not the forces, which lets the same calculation report loads at whichever interface the structures team needs.</w:t>
       </w:r>
     </w:p>
     <w:bookmarkEnd w:id="55"/>
@@ -8816,7 +11945,7 @@
         <w:pStyle w:val="FirstParagraph"/>
       </w:pPr>
       <w:r>
-        <w:t xml:space="preserve">The twist about the shaft was calculated separately for spin-up and spin-down, Equations (43) and (44), because the two ramps can have different durations. The load tables carry the larger of the two values for each part. When the twists of all three parts are added with their signs, the counter-rotating wheels largely cancel the arm, which is the purpose of the wheels. The net value is reported as the assembly’s twist, but each motor mount still carries its own full torque, and those values are reported separately so that the individual mounts can be checked.</w:t>
+        <w:t xml:space="preserve">The twist about the shaft was calculated separately for spin-up and spin-down, Equations (52) and (53), because the two ramps can have different durations. The load tables carry the larger of the two values for each part. When the twists of all three parts are added with their signs, the counter-rotating wheels largely cancel the arm, which is the purpose of the wheels. The net value is reported as the assembly’s twist, but each motor mount still carries its own full torque, and those values are reported separately so that the individual mounts can be checked.</w:t>
       </w:r>
     </w:p>
     <w:bookmarkEnd w:id="56"/>
@@ -8834,7 +11963,7 @@
         <w:pStyle w:val="FirstParagraph"/>
       </w:pPr>
       <w:r>
-        <w:t xml:space="preserve">The bearing calculation has two parts with very different levels of confidence. The frequencies are exact. For each part, the catalog geometry gives the cage, outer race pass, inner race pass and rolling element spin frequencies from Equations (11) to (14). These frequencies are reported in full because they are what a structural analyst needs to check for resonance.</w:t>
+        <w:t xml:space="preserve">The bearing model has two parts with different levels of confidence. The frequencies are exact. For each part, the catalog geometry gives the cage, outer race pass, inner race pass and rolling element spin frequencies from Equations (11) to (14), and these are reported in full because they are what a structural analyst needs to check for resonance.</w:t>
       </w:r>
     </w:p>
     <w:p>
@@ -8842,7 +11971,7 @@
         <w:pStyle w:val="BodyText"/>
       </w:pPr>
       <w:r>
-        <w:t xml:space="preserve">The amplitudes are estimated. With no supplier or test data, each bearing harmonic was assumed to produce a lateral force equal to a small fraction k of that part’s static imbalance force, Equation (45). A value of 1% was used. Tying the bearing estimate to the imbalance force keeps it in proportion to the size and speed of the part, and keeping k as a single, clearly labeled input makes it easy to change once real data arrives. Because the rollers in a tapered bearing sit at the contact angle, each lateral kick was given an axial component as well, Equation (46).</w:t>
+        <w:t xml:space="preserve">The amplitudes follow from physics, but they depend on the imperfections specified. An earlier version of the method estimated each bearing harmonic as a fixed fraction of the imbalance force and treated each bearing pair as a single source with four harmonics. That approach was replaced. The current model builds the bearing stiffness from the catalog geometry and the preload, uses the classical waviness selection rule of Equation (22) to find which imperfection orders produce a net force and at which frequency, and passes each blocked force through the rotor-bearing dynamics of Equation (26). Each bearing of a pair is treated separately, with its own imperfection amplitudes, and each source produces its own set of lines at its own frequencies, rather than a single lumped set of four.</w:t>
       </w:r>
     </w:p>
     <w:p>
@@ -8850,7 +11979,7 @@
         <w:pStyle w:val="BodyText"/>
       </w:pPr>
       <w:r>
-        <w:t xml:space="preserve">The two bearings of each back-to-back pair were treated together as a single source at the part’s position. A more detailed model would place each bearing separately and account for preload, but that refinement only becomes meaningful once the amplitudes themselves are known.</w:t>
+        <w:t xml:space="preserve">This makes the bearing loads traceable: every line can be followed back to a specific imperfection on a specific bearing, and the effect of a tighter tolerance class or a higher preload can be seen directly. Its accuracy rests on the imperfection amplitudes. Precision-class tolerances give a defensible starting value; inspection data on the actual bearings, or supplier vibration data, should replace them when available.</w:t>
       </w:r>
     </w:p>
     <w:bookmarkEnd w:id="57"/>
@@ -8892,7 +12021,7 @@
         <w:pStyle w:val="BodyText"/>
       </w:pPr>
       <w:r>
-        <w:t xml:space="preserve">An independent review of an early version raised several points about how results could be misread. In response, the output now states that Fx and Fy are peaks reached a quarter turn apart rather than simultaneous values, labels every result as a worst-case estimate, identifies which inputs are estimates, and reports spin-up and spin-down twist separately. The built-in checks are also described as checks on the arithmetic, not on the physical inputs. Among them are the bearing identities of Equations (15) and (16), which hold for any bearing geometry.</w:t>
+        <w:t xml:space="preserve">An independent review of an early version raised several points about how results could be misread. In response, the output now states that Fx and Fy are peaks reached a quarter turn apart rather than simultaneous values, labels every result as a worst-case estimate, identifies which inputs are estimates, and reports spin-up and spin-down twist separately. The built-in checks are also described as checks on the arithmetic, not on the physical inputs. Among them are the bearing identities of Equations (15) and (16), which hold for any bearing geometry, a roller-by-roller check of the bearing stiffness of Equation (20), and a numerical check of the waviness selection rule of Equation (22).</w:t>
       </w:r>
     </w:p>
     <w:bookmarkEnd w:id="58"/>
@@ -8992,7 +12121,7 @@
         <w:pStyle w:val="BodyText"/>
       </w:pPr>
       <w:r>
-        <w:t xml:space="preserve">Three inputs are estimates. The tilt of each part has no specified tolerance and was set to a small value consistent with normal machining practice; it can be removed entirely by entering U</w:t>
+        <w:t xml:space="preserve">The tilt of each part has no specified tolerance and was set to a small value consistent with normal machining practice; it can be removed entirely by entering U</w:t>
       </w:r>
       <w:r>
         <w:rPr>
@@ -9004,7 +12133,7 @@
         <w:t xml:space="preserve"> </w:t>
       </w:r>
       <w:r>
-        <w:t xml:space="preserve">from a balance specification. The bearing kick ratio of 1% stands in for supplier or test data on bearing vibration. The axial bearing force is based on the contact angle alone and treats each bearing pair as one bearing, without preload.</w:t>
+        <w:t xml:space="preserve">from a balance specification. The bearing loads are only as good as the specified imperfection amplitudes, which come from tolerance classes rather than measurement. The bearing model is linear about the preload and assumes every roller stays loaded. It uses Palmgren’s empirical line-contact relation for stiffness, includes only the rotor’s lateral and axial modes on its bearings (not its rocking mode), adds the lines of both bearings and all sources in phase, and assumes a typical damping ratio.</w:t>
       </w:r>
     </w:p>
     <w:p>
@@ -9012,7 +12141,7 @@
         <w:pStyle w:val="BodyText"/>
       </w:pPr>
       <w:r>
-        <w:t xml:space="preserve">Some effects are outside the scope of the method. It does not include structural resonance, which can raise the loads well above the hard-mounted values near a natural frequency. It does not include motor torque ripple or cogging, imbalance harmonics above the running speed, or broadband noise. It also neglects the small tangential imbalance force during speed ramps, which is under 1% of the main force for ramps of around ten seconds.</w:t>
+        <w:t xml:space="preserve">Some effects are outside the scope of the method. It does not include structural resonance, which can raise the loads well above the hard-mounted values near a natural frequency. It does not include motor torque ripple or cogging, imbalance harmonics above the running speed, or broadband noise, and it does not model localized bearing defects such as spalls, which belong to failure analysis rather than to the induced loads of a healthy bearing. It also neglects the small tangential imbalance force during speed ramps, which is under 1% of the main force for ramps of around ten seconds.</w:t>
       </w:r>
     </w:p>
     <w:bookmarkEnd w:id="64"/>
@@ -9042,7 +12171,7 @@
         <w:t xml:space="preserve"> </w:t>
       </w:r>
       <w:r>
-        <w:t xml:space="preserve">from a balance specification, and the bearing kick ratio with supplier data or a bearing test. Motor torque ripple can be added once the motor pole and slot counts and ripple data are known. The loads and the bearing frequencies will be passed to the structural analysis to check for modes close to any disturbance frequency, and once hardware is built, the assembly will be measured on a force table and compared with these estimates.</w:t>
+        <w:t xml:space="preserve">from a balance specification, and the bearing imperfection amplitudes with inspection data or supplier vibration data. Motor torque ripple can be added once the motor pole and slot counts and ripple data are known. The loads and the bearing frequencies will be passed to the structural analysis to check for modes close to any disturbance frequency, and once hardware is built, the assembly will be measured on a force table and compared with these estimates.</w:t>
       </w:r>
     </w:p>
     <w:p>
@@ -9050,7 +12179,7 @@
         <w:pStyle w:val="BodyText"/>
       </w:pPr>
       <w:r>
-        <w:t xml:space="preserve">Induced vibration from rotating machinery comes down to a short list of physical effects. A rotor whose center of mass is off its axis pushes sideways. A rotor that sits tilted rocks its shaft. A rotor that changes speed twists its mount. The bearings add small kicks at frequencies set by their geometry. For our assembly, each of these was estimated from design data alone, in a form that is conservative, can be checked by hand, and can be refined one input at a time as better data becomes available.</w:t>
+        <w:t xml:space="preserve">Induced vibration from rotating machinery comes down to a short list of physical effects. A rotor whose center of mass is off its axis pushes sideways. A rotor that sits tilted rocks its shaft. A rotor that changes speed twists its mount. The bearings add small disturbances at frequencies set by their geometry, with sizes set by their stiffness, preload and imperfections. For our assembly, each of these was estimated from design data alone, in a form that is conservative, can be checked by hand, and can be refined one input at a time as better data becomes available.</w:t>
       </w:r>
     </w:p>
     <w:bookmarkEnd w:id="65"/>
@@ -9097,6 +12226,30 @@
       </w:pPr>
       <w:r>
         <w:t xml:space="preserve">Timken. Engineering manual for tapered roller bearings.</w:t>
+      </w:r>
+    </w:p>
+    <w:p>
+      <w:pPr>
+        <w:numPr>
+          <w:ilvl w:val="0"/>
+          <w:numId w:val="1001"/>
+        </w:numPr>
+        <w:pStyle w:val="Compact"/>
+      </w:pPr>
+      <w:r>
+        <w:t xml:space="preserve">Harris, T. A., and Kotzalas, M. N. Rolling Bearing Analysis. CRC Press. (Palmgren load-deflection relation, bearing stiffness.)</w:t>
+      </w:r>
+    </w:p>
+    <w:p>
+      <w:pPr>
+        <w:numPr>
+          <w:ilvl w:val="0"/>
+          <w:numId w:val="1001"/>
+        </w:numPr>
+        <w:pStyle w:val="Compact"/>
+      </w:pPr>
+      <w:r>
+        <w:t xml:space="preserve">Wardle, F. P. Vibration forces produced by waviness of the rolling surfaces of thrust loaded ball bearings. Proceedings of the Institution of Mechanical Engineers, 1988. (Waviness order selection rule.)</w:t>
       </w:r>
     </w:p>
     <w:p>

</xml_diff>

<commit_message>
Imbalance inputs from balance spec (Us, eccentricity or grade; Ud or plane spacing); drop tilt/Ixx/Iyy; missing-input check; white paper updated
Co-Authored-By: Claude Opus 5.5 <noreply@anthropic.com>
Claude-Session: https://claude.ai/code/session_01AcuW3xSnVc4HeTATtgPH4G
</commit_message>
<xml_diff>
--- a/white_paper/Induced_Vibration_White_Paper.docx
+++ b/white_paper/Induced_Vibration_White_Paper.docx
@@ -619,13 +619,13 @@
       </w:r>
     </w:p>
     <w:bookmarkEnd w:id="23"/>
-    <w:bookmarkStart w:id="24" w:name="dynamic-imbalance"/>
+    <w:bookmarkStart w:id="24" w:name="couple-dynamic-imbalance"/>
     <w:p>
       <w:pPr>
         <w:pStyle w:val="Heading3"/>
       </w:pPr>
       <w:r>
-        <w:t xml:space="preserve">2.3 Dynamic imbalance</w:t>
+        <w:t xml:space="preserve">2.3 Couple (dynamic) imbalance</w:t>
       </w:r>
     </w:p>
     <w:p>
@@ -641,7 +641,43 @@
         <w:pStyle w:val="BodyText"/>
       </w:pPr>
       <w:r>
-        <w:t xml:space="preserve">This is dynamic imbalance, sometimes called couple imbalance. For a small tilt θ, it depends on the difference between the inertia about the spin axis, I</w:t>
+        <w:t xml:space="preserve">This is couple imbalance. In wheel and vibration work it is often called dynamic imbalance; strictly, ISO 21940 uses</w:t>
+      </w:r>
+      <w:r>
+        <w:t xml:space="preserve"> </w:t>
+      </w:r>
+      <w:r>
+        <w:t xml:space="preserve">“</w:t>
+      </w:r>
+      <w:r>
+        <w:t xml:space="preserve">dynamic unbalance</w:t>
+      </w:r>
+      <w:r>
+        <w:t xml:space="preserve">”</w:t>
+      </w:r>
+      <w:r>
+        <w:t xml:space="preserve"> </w:t>
+      </w:r>
+      <w:r>
+        <w:t xml:space="preserve">for the general case of static and couple imbalance together, so</w:t>
+      </w:r>
+      <w:r>
+        <w:t xml:space="preserve"> </w:t>
+      </w:r>
+      <w:r>
+        <w:t xml:space="preserve">“</w:t>
+      </w:r>
+      <w:r>
+        <w:t xml:space="preserve">couple</w:t>
+      </w:r>
+      <w:r>
+        <w:t xml:space="preserve">”</w:t>
+      </w:r>
+      <w:r>
+        <w:t xml:space="preserve"> </w:t>
+      </w:r>
+      <w:r>
+        <w:t xml:space="preserve">is used here for the tilt part alone. For a small tilt θ, it depends on the difference between the inertia about the spin axis, I</w:t>
       </w:r>
       <w:r>
         <w:rPr>
@@ -1006,7 +1042,7 @@
         <w:pStyle w:val="FirstParagraph"/>
       </w:pPr>
       <w:r>
-        <w:t xml:space="preserve">Dynamic imbalance only shows itself when the rotor spins, which is where the name comes from. Correcting it requires balancing in two planes along the rotor.</w:t>
+        <w:t xml:space="preserve">Couple imbalance only shows itself when the rotor spins. Correcting it requires balancing in two planes along the rotor.</w:t>
       </w:r>
     </w:p>
     <w:tbl>
@@ -1053,7 +1089,7 @@
               <w:jc w:val="left"/>
             </w:pPr>
             <w:r>
-              <w:t xml:space="preserve">Dynamic imbalance</w:t>
+              <w:t xml:space="preserve">Couple (dynamic) imbalance</w:t>
             </w:r>
           </w:p>
         </w:tc>
@@ -1376,6 +1412,199 @@
       </w:pPr>
       <w:r>
         <w:t xml:space="preserve">Real rotors almost always carry both kinds at once. They come from different manufacturing errors, so the angle between the heavy spot and the direction of tilt is effectively random and is rarely known before the rotor is balanced.</w:t>
+      </w:r>
+    </w:p>
+    <w:p>
+      <w:pPr>
+        <w:pStyle w:val="BodyText"/>
+      </w:pPr>
+      <w:r>
+        <w:rPr>
+          <w:bCs/>
+          <w:b/>
+        </w:rPr>
+        <w:t xml:space="preserve">Imbalance as a specified limit.</w:t>
+      </w:r>
+      <w:r>
+        <w:t xml:space="preserve"> </w:t>
+      </w:r>
+      <w:r>
+        <w:t xml:space="preserve">Before hardware exists, the actual imbalance of a part cannot be known: CAD and drawings describe the ideal part, and manufacturing errors are only revealed by measurement. Rotors of this kind are balanced after assembly, so what matters at the design stage is the imbalance the part is allowed to have once balanced. That limit is set by a balance specification, given directly as U</w:t>
+      </w:r>
+      <w:r>
+        <w:rPr>
+          <w:vertAlign w:val="subscript"/>
+        </w:rPr>
+        <w:t xml:space="preserve">s</w:t>
+      </w:r>
+      <w:r>
+        <w:t xml:space="preserve"> </w:t>
+      </w:r>
+      <w:r>
+        <w:t xml:space="preserve">and U</w:t>
+      </w:r>
+      <w:r>
+        <w:rPr>
+          <w:vertAlign w:val="subscript"/>
+        </w:rPr>
+        <w:t xml:space="preserve">d</w:t>
+      </w:r>
+      <w:r>
+        <w:t xml:space="preserve">, as an eccentricity, or as an ISO 21940 balance grade G. With a grade, the allowed static imbalance follows from Equation (7):</w:t>
+      </w:r>
+    </w:p>
+    <w:p>
+      <w:pPr>
+        <w:tabs>
+          <w:tab w:val="center" w:pos="4680"/>
+          <w:tab w:val="right" w:pos="9360"/>
+        </w:tabs>
+        <w:spacing w:before="120" w:after="120"/>
+      </w:pPr>
+      <w:r>
+        <w:tab/>
+      </w:r>
+      <m:oMath>
+        <m:sSub>
+          <m:e>
+            <m:r>
+              <m:t>U</m:t>
+            </m:r>
+          </m:e>
+          <m:sub>
+            <m:r>
+              <m:t>s</m:t>
+            </m:r>
+          </m:sub>
+        </m:sSub>
+        <m:r>
+          <m:rPr>
+            <m:sty m:val="p"/>
+          </m:rPr>
+          <m:t>=</m:t>
+        </m:r>
+        <m:r>
+          <m:t>m</m:t>
+        </m:r>
+        <m:r>
+          <m:t> </m:t>
+        </m:r>
+        <m:r>
+          <m:t>e</m:t>
+        </m:r>
+        <m:r>
+          <m:rPr>
+            <m:sty m:val="p"/>
+          </m:rPr>
+          <m:t>=</m:t>
+        </m:r>
+        <m:f>
+          <m:fPr>
+            <m:type m:val="bar"/>
+          </m:fPr>
+          <m:num>
+            <m:r>
+              <m:t>m</m:t>
+            </m:r>
+            <m:r>
+              <m:t> </m:t>
+            </m:r>
+            <m:r>
+              <m:t>G</m:t>
+            </m:r>
+          </m:num>
+          <m:den>
+            <m:r>
+              <m:t>Ω</m:t>
+            </m:r>
+          </m:den>
+        </m:f>
+      </m:oMath>
+      <w:r>
+        <w:tab/>
+        <w:t>(11)</w:t>
+      </w:r>
+    </w:p>
+    <w:p>
+      <w:pPr>
+        <w:pStyle w:val="FirstParagraph"/>
+      </w:pPr>
+      <w:r>
+        <w:t xml:space="preserve">When only a static limit is specified, the couple limit is commonly taken by applying the same tolerance in each of the two balancing planes, a distance b apart. The worst case is the two residuals pointing in opposite directions, which gives:</w:t>
+      </w:r>
+    </w:p>
+    <w:p>
+      <w:pPr>
+        <w:tabs>
+          <w:tab w:val="center" w:pos="4680"/>
+          <w:tab w:val="right" w:pos="9360"/>
+        </w:tabs>
+        <w:spacing w:before="120" w:after="120"/>
+      </w:pPr>
+      <w:r>
+        <w:tab/>
+      </w:r>
+      <m:oMath>
+        <m:sSub>
+          <m:e>
+            <m:r>
+              <m:t>U</m:t>
+            </m:r>
+          </m:e>
+          <m:sub>
+            <m:r>
+              <m:t>d</m:t>
+            </m:r>
+          </m:sub>
+        </m:sSub>
+        <m:r>
+          <m:rPr>
+            <m:sty m:val="p"/>
+          </m:rPr>
+          <m:t>=</m:t>
+        </m:r>
+        <m:f>
+          <m:fPr>
+            <m:type m:val="bar"/>
+          </m:fPr>
+          <m:num>
+            <m:sSub>
+              <m:e>
+                <m:r>
+                  <m:t>U</m:t>
+                </m:r>
+              </m:e>
+              <m:sub>
+                <m:r>
+                  <m:t>s</m:t>
+                </m:r>
+              </m:sub>
+            </m:sSub>
+          </m:num>
+          <m:den>
+            <m:r>
+              <m:t>2</m:t>
+            </m:r>
+          </m:den>
+        </m:f>
+        <m:r>
+          <m:t> </m:t>
+        </m:r>
+        <m:r>
+          <m:t>b</m:t>
+        </m:r>
+      </m:oMath>
+      <w:r>
+        <w:tab/>
+        <w:t>(12)</w:t>
+      </w:r>
+    </w:p>
+    <w:p>
+      <w:pPr>
+        <w:pStyle w:val="FirstParagraph"/>
+      </w:pPr>
+      <w:r>
+        <w:t xml:space="preserve">Loads calculated from these limits are the largest the balanced part can produce, and balancing to the same limits is verified on the hardware.</w:t>
       </w:r>
     </w:p>
     <w:bookmarkEnd w:id="24"/>
@@ -1537,7 +1766,7 @@
       </m:oMath>
       <w:r>
         <w:tab/>
-        <w:t>(11)</w:t>
+        <w:t>(13)</w:t>
       </w:r>
     </w:p>
     <w:p>
@@ -1652,7 +1881,7 @@
       </m:oMath>
       <w:r>
         <w:tab/>
-        <w:t>(12)</w:t>
+        <w:t>(14)</w:t>
       </w:r>
     </w:p>
     <w:p>
@@ -1767,7 +1996,7 @@
       </m:oMath>
       <w:r>
         <w:tab/>
-        <w:t>(13)</w:t>
+        <w:t>(15)</w:t>
       </w:r>
     </w:p>
     <w:p>
@@ -1916,7 +2145,7 @@
       </m:oMath>
       <w:r>
         <w:tab/>
-        <w:t>(14)</w:t>
+        <w:t>(16)</w:t>
       </w:r>
     </w:p>
     <w:p>
@@ -1924,7 +2153,7 @@
         <w:pStyle w:val="FirstParagraph"/>
       </w:pPr>
       <w:r>
-        <w:t xml:space="preserve">Equation (11) is the cage frequency, the rate at which the set of rolling elements travels around the bearing. Equation (12) is the outer race pass frequency, the rate at which elements pass a given point on the outer race. Equation (13) is the inner race pass frequency, the rate at which they pass a given point on the inner race. Equation (14) is the rolling element spin frequency. A defect on a rolling element strikes both races once per spin, so it often appears at twice f</w:t>
+        <w:t xml:space="preserve">Equation (13) is the cage frequency, the rate at which the set of rolling elements travels around the bearing. Equation (14) is the outer race pass frequency, the rate at which elements pass a given point on the outer race. Equation (15) is the inner race pass frequency, the rate at which they pass a given point on the inner race. Equation (16) is the rolling element spin frequency. A defect on a rolling element strikes both races once per spin, so it often appears at twice f</w:t>
       </w:r>
       <w:r>
         <w:rPr>
@@ -2020,7 +2249,7 @@
       </m:oMath>
       <w:r>
         <w:tab/>
-        <w:t>(15)</w:t>
+        <w:t>(17)</w:t>
       </w:r>
     </w:p>
     <w:p>
@@ -2099,7 +2328,7 @@
       </m:oMath>
       <w:r>
         <w:tab/>
-        <w:t>(16)</w:t>
+        <w:t>(18)</w:t>
       </w:r>
     </w:p>
     <w:p>
@@ -2232,7 +2461,7 @@
       </m:oMath>
       <w:r>
         <w:tab/>
-        <w:t>(17)</w:t>
+        <w:t>(19)</w:t>
       </w:r>
     </w:p>
     <w:p>
@@ -2381,7 +2610,7 @@
       </m:oMath>
       <w:r>
         <w:tab/>
-        <w:t>(18)</w:t>
+        <w:t>(20)</w:t>
       </w:r>
     </w:p>
     <w:p>
@@ -2503,7 +2732,7 @@
       </m:oMath>
       <w:r>
         <w:tab/>
-        <w:t>(19)</w:t>
+        <w:t>(21)</w:t>
       </w:r>
     </w:p>
     <w:p>
@@ -2593,7 +2822,7 @@
       </m:oMath>
       <w:r>
         <w:tab/>
-        <w:t>(20)</w:t>
+        <w:t>(22)</w:t>
       </w:r>
     </w:p>
     <w:p>
@@ -2674,7 +2903,7 @@
       </m:oMath>
       <w:r>
         <w:tab/>
-        <w:t>(21)</w:t>
+        <w:t>(23)</w:t>
       </w:r>
     </w:p>
     <w:p>
@@ -2952,7 +3181,7 @@
       </m:oMath>
       <w:r>
         <w:tab/>
-        <w:t>(22)</w:t>
+        <w:t>(24)</w:t>
       </w:r>
     </w:p>
     <w:p>
@@ -3188,7 +3417,7 @@
       </m:oMath>
       <w:r>
         <w:tab/>
-        <w:t>(23)</w:t>
+        <w:t>(25)</w:t>
       </w:r>
     </w:p>
     <w:p>
@@ -3322,7 +3551,7 @@
       </m:oMath>
       <w:r>
         <w:tab/>
-        <w:t>(24)</w:t>
+        <w:t>(26)</w:t>
       </w:r>
     </w:p>
     <w:p>
@@ -3485,7 +3714,7 @@
       </m:oMath>
       <w:r>
         <w:tab/>
-        <w:t>(25)</w:t>
+        <w:t>(27)</w:t>
       </w:r>
     </w:p>
     <w:p>
@@ -3711,7 +3940,7 @@
       </m:oMath>
       <w:r>
         <w:tab/>
-        <w:t>(26)</w:t>
+        <w:t>(28)</w:t>
       </w:r>
     </w:p>
     <w:p>
@@ -3821,7 +4050,7 @@
       </m:oMath>
       <w:r>
         <w:tab/>
-        <w:t>(27)</w:t>
+        <w:t>(29)</w:t>
       </w:r>
     </w:p>
     <w:p>
@@ -3878,7 +4107,7 @@
       </m:oMath>
       <w:r>
         <w:tab/>
-        <w:t>(28)</w:t>
+        <w:t>(30)</w:t>
       </w:r>
     </w:p>
     <w:p>
@@ -4051,7 +4280,7 @@
       </m:oMath>
       <w:r>
         <w:tab/>
-        <w:t>(29)</w:t>
+        <w:t>(31)</w:t>
       </w:r>
     </w:p>
     <w:p>
@@ -4178,7 +4407,7 @@
       </m:oMath>
       <w:r>
         <w:tab/>
-        <w:t>(30)</w:t>
+        <w:t>(32)</w:t>
       </w:r>
     </w:p>
     <w:p>
@@ -4353,7 +4582,7 @@
       </m:oMath>
       <w:r>
         <w:tab/>
-        <w:t>(31)</w:t>
+        <w:t>(33)</w:t>
       </w:r>
     </w:p>
     <w:p>
@@ -4510,7 +4739,7 @@
       </m:oMath>
       <w:r>
         <w:tab/>
-        <w:t>(32)</w:t>
+        <w:t>(34)</w:t>
       </w:r>
     </w:p>
     <w:p>
@@ -4603,7 +4832,7 @@
       </m:oMath>
       <w:r>
         <w:tab/>
-        <w:t>(33)</w:t>
+        <w:t>(35)</w:t>
       </w:r>
     </w:p>
     <w:p>
@@ -4719,7 +4948,7 @@
       </m:oMath>
       <w:r>
         <w:tab/>
-        <w:t>(34)</w:t>
+        <w:t>(36)</w:t>
       </w:r>
     </w:p>
     <w:p>
@@ -4892,7 +5121,7 @@
       </m:oMath>
       <w:r>
         <w:tab/>
-        <w:t>(35)</w:t>
+        <w:t>(37)</w:t>
       </w:r>
     </w:p>
     <w:p>
@@ -4918,7 +5147,7 @@
         <w:pStyle w:val="FirstParagraph"/>
       </w:pPr>
       <w:r>
-        <w:t xml:space="preserve">Imbalance loads grow with the square of the speed. Bearing loads well below the rotor-bearing natural frequency also grow roughly with the square of speed, through Equation (26), but are recalculated at each speed rather than scaled. An imbalance load L known at one speed can be found at any other:</w:t>
+        <w:t xml:space="preserve">Imbalance loads grow with the square of the speed. Bearing loads well below the rotor-bearing natural frequency also grow roughly with the square of speed, through Equation (28), but are recalculated at each speed rather than scaled. An imbalance load L known at one speed can be found at any other:</w:t>
       </w:r>
     </w:p>
     <w:p>
@@ -5043,7 +5272,7 @@
       </m:oMath>
       <w:r>
         <w:tab/>
-        <w:t>(36)</w:t>
+        <w:t>(38)</w:t>
       </w:r>
     </w:p>
     <w:p>
@@ -5146,7 +5375,7 @@
       </m:oMath>
       <w:r>
         <w:tab/>
-        <w:t>(37)</w:t>
+        <w:t>(39)</w:t>
       </w:r>
     </w:p>
     <w:bookmarkEnd w:id="29"/>
@@ -5284,7 +5513,7 @@
               <w:jc w:val="left"/>
             </w:pPr>
             <w:r>
-              <w:t xml:space="preserve">Dynamic imbalance</w:t>
+              <w:t xml:space="preserve">Couple (dynamic) imbalance</w:t>
             </w:r>
           </w:p>
         </w:tc>
@@ -5320,7 +5549,7 @@
               <w:jc w:val="left"/>
             </w:pPr>
             <w:r>
-              <w:t xml:space="preserve">Yes, from inertias and tilt</w:t>
+              <w:t xml:space="preserve">Yes, from the balance specification</w:t>
             </w:r>
           </w:p>
         </w:tc>
@@ -5753,7 +5982,7 @@
       </m:oMath>
       <w:r>
         <w:tab/>
-        <w:t>(38)</w:t>
+        <w:t>(40)</w:t>
       </w:r>
     </w:p>
     <w:p>
@@ -6092,7 +6321,7 @@
       </m:oMath>
       <w:r>
         <w:tab/>
-        <w:t>(39)</w:t>
+        <w:t>(41)</w:t>
       </w:r>
     </w:p>
     <w:tbl>
@@ -6306,7 +6535,7 @@
               <w:jc w:val="left"/>
             </w:pPr>
             <w:r>
-              <w:t xml:space="preserve">Dynamic imbalance, lateral forces acting at a distance</w:t>
+              <w:t xml:space="preserve">Couple imbalance, lateral forces acting at a distance</w:t>
             </w:r>
           </w:p>
         </w:tc>
@@ -6525,7 +6754,7 @@
       </m:oMath>
       <w:r>
         <w:tab/>
-        <w:t>(40)</w:t>
+        <w:t>(42)</w:t>
       </w:r>
     </w:p>
     <w:p>
@@ -6674,7 +6903,7 @@
       </m:oMath>
       <w:r>
         <w:tab/>
-        <w:t>(41)</w:t>
+        <w:t>(43)</w:t>
       </w:r>
     </w:p>
     <w:p>
@@ -6797,7 +7026,7 @@
       </m:oMath>
       <w:r>
         <w:tab/>
-        <w:t>(42)</w:t>
+        <w:t>(44)</w:t>
       </w:r>
     </w:p>
     <w:p>
@@ -6906,7 +7135,7 @@
       </m:oMath>
       <w:r>
         <w:tab/>
-        <w:t>(43)</w:t>
+        <w:t>(45)</w:t>
       </w:r>
     </w:p>
     <w:p>
@@ -6989,7 +7218,7 @@
       </m:oMath>
       <w:r>
         <w:tab/>
-        <w:t>(44)</w:t>
+        <w:t>(46)</w:t>
       </w:r>
     </w:p>
     <w:p>
@@ -7064,7 +7293,7 @@
       </m:oMath>
       <w:r>
         <w:tab/>
-        <w:t>(45)</w:t>
+        <w:t>(47)</w:t>
       </w:r>
     </w:p>
     <w:p>
@@ -7072,7 +7301,7 @@
         <w:pStyle w:val="FirstParagraph"/>
       </w:pPr>
       <w:r>
-        <w:t xml:space="preserve">For this reason, rotating loads are usually reported as peak amplitudes for each component. Fx and Fy are listed separately because a structural model needs both directions, but they should not be combined as if they happened at the same time, which would overstate the resultant by a factor of √2. The same applies to Mx and My. Where loads from several sources with unknown relative phase are combined, adding their peaks gives the upper bound of Equation (37).</w:t>
+        <w:t xml:space="preserve">For this reason, rotating loads are usually reported as peak amplitudes for each component. Fx and Fy are listed separately because a structural model needs both directions, but they should not be combined as if they happened at the same time, which would overstate the resultant by a factor of √2. The same applies to Mx and My. Where loads from several sources with unknown relative phase are combined, adding their peaks gives the upper bound of Equation (39).</w:t>
       </w:r>
     </w:p>
     <w:bookmarkEnd w:id="38"/>
@@ -7236,121 +7465,6 @@
               <w:jc w:val="left"/>
             </w:pPr>
             <w:r>
-              <w:t xml:space="preserve">Center of mass offset (eccentricity)</w:t>
-            </w:r>
-          </w:p>
-        </w:tc>
-        <w:tc>
-          <w:tcPr/>
-          <w:p>
-            <w:pPr>
-              <w:pStyle w:val="Compact"/>
-              <w:jc w:val="left"/>
-            </w:pPr>
-            <w:r>
-              <w:t xml:space="preserve">e</w:t>
-            </w:r>
-          </w:p>
-        </w:tc>
-        <w:tc>
-          <w:tcPr/>
-          <w:p>
-            <w:pPr>
-              <w:pStyle w:val="Compact"/>
-              <w:jc w:val="left"/>
-            </w:pPr>
-            <w:r>
-              <w:t xml:space="preserve">µm</w:t>
-            </w:r>
-          </w:p>
-        </w:tc>
-        <w:tc>
-          <w:tcPr/>
-          <w:p>
-            <w:pPr>
-              <w:pStyle w:val="Compact"/>
-              <w:jc w:val="left"/>
-            </w:pPr>
-            <w:r>
-              <w:t xml:space="preserve">Eccentricity specification</w:t>
-            </w:r>
-          </w:p>
-        </w:tc>
-      </w:tr>
-      <w:tr>
-        <w:tc>
-          <w:tcPr/>
-          <w:p>
-            <w:pPr>
-              <w:pStyle w:val="Compact"/>
-              <w:jc w:val="left"/>
-            </w:pPr>
-            <w:r>
-              <w:t xml:space="preserve">Transverse moments of inertia, at the center of mass</w:t>
-            </w:r>
-          </w:p>
-        </w:tc>
-        <w:tc>
-          <w:tcPr/>
-          <w:p>
-            <w:pPr>
-              <w:pStyle w:val="Compact"/>
-              <w:jc w:val="left"/>
-            </w:pPr>
-            <w:r>
-              <w:t xml:space="preserve">I</w:t>
-            </w:r>
-            <w:r>
-              <w:rPr>
-                <w:vertAlign w:val="subscript"/>
-              </w:rPr>
-              <w:t xml:space="preserve">xx</w:t>
-            </w:r>
-            <w:r>
-              <w:t xml:space="preserve">, I</w:t>
-            </w:r>
-            <w:r>
-              <w:rPr>
-                <w:vertAlign w:val="subscript"/>
-              </w:rPr>
-              <w:t xml:space="preserve">yy</w:t>
-            </w:r>
-          </w:p>
-        </w:tc>
-        <w:tc>
-          <w:tcPr/>
-          <w:p>
-            <w:pPr>
-              <w:pStyle w:val="Compact"/>
-              <w:jc w:val="left"/>
-            </w:pPr>
-            <w:r>
-              <w:t xml:space="preserve">kg·m²</w:t>
-            </w:r>
-          </w:p>
-        </w:tc>
-        <w:tc>
-          <w:tcPr/>
-          <w:p>
-            <w:pPr>
-              <w:pStyle w:val="Compact"/>
-              <w:jc w:val="left"/>
-            </w:pPr>
-            <w:r>
-              <w:t xml:space="preserve">CAD mass properties</w:t>
-            </w:r>
-          </w:p>
-        </w:tc>
-      </w:tr>
-      <w:tr>
-        <w:tc>
-          <w:tcPr/>
-          <w:p>
-            <w:pPr>
-              <w:pStyle w:val="Compact"/>
-              <w:jc w:val="left"/>
-            </w:pPr>
-            <w:r>
               <w:t xml:space="preserve">Spin moment of inertia</w:t>
             </w:r>
           </w:p>
@@ -7393,7 +7507,7 @@
               <w:jc w:val="left"/>
             </w:pPr>
             <w:r>
-              <w:t xml:space="preserve">CAD mass properties, or from stored momentum</w:t>
+              <w:t xml:space="preserve">CAD mass properties</w:t>
             </w:r>
           </w:p>
         </w:tc>
@@ -7466,69 +7580,7 @@
               <w:jc w:val="left"/>
             </w:pPr>
             <w:r>
-              <w:t xml:space="preserve">Tilt of the principal axis from the shaft</w:t>
-            </w:r>
-          </w:p>
-        </w:tc>
-        <w:tc>
-          <w:tcPr/>
-          <w:p>
-            <w:pPr>
-              <w:pStyle w:val="Compact"/>
-              <w:jc w:val="left"/>
-            </w:pPr>
-            <w:r>
-              <w:t xml:space="preserve">θ</w:t>
-            </w:r>
-          </w:p>
-        </w:tc>
-        <w:tc>
-          <w:tcPr/>
-          <w:p>
-            <w:pPr>
-              <w:pStyle w:val="Compact"/>
-              <w:jc w:val="left"/>
-            </w:pPr>
-            <w:r>
-              <w:t xml:space="preserve">deg</w:t>
-            </w:r>
-          </w:p>
-        </w:tc>
-        <w:tc>
-          <w:tcPr/>
-          <w:p>
-            <w:pPr>
-              <w:pStyle w:val="Compact"/>
-              <w:jc w:val="left"/>
-            </w:pPr>
-            <w:r>
-              <w:t xml:space="preserve">Estimate</w:t>
-            </w:r>
-          </w:p>
-        </w:tc>
-      </w:tr>
-      <w:tr>
-        <w:tc>
-          <w:tcPr/>
-          <w:p>
-            <w:pPr>
-              <w:pStyle w:val="Compact"/>
-              <w:jc w:val="left"/>
-            </w:pPr>
-            <w:r>
-              <w:t xml:space="preserve">Static imbalance (optional)</w:t>
-            </w:r>
-          </w:p>
-        </w:tc>
-        <w:tc>
-          <w:tcPr/>
-          <w:p>
-            <w:pPr>
-              <w:pStyle w:val="Compact"/>
-              <w:jc w:val="left"/>
-            </w:pPr>
-            <w:r>
-              <w:t xml:space="preserve">U</w:t>
+              <w:t xml:space="preserve">Static imbalance, one of: U</w:t>
             </w:r>
             <w:r>
               <w:rPr>
@@ -7536,29 +7588,56 @@
               </w:rPr>
               <w:t xml:space="preserve">s</w:t>
             </w:r>
-          </w:p>
-        </w:tc>
-        <w:tc>
-          <w:tcPr/>
-          <w:p>
-            <w:pPr>
-              <w:pStyle w:val="Compact"/>
-              <w:jc w:val="left"/>
-            </w:pPr>
-            <w:r>
-              <w:t xml:space="preserve">kg·m</w:t>
-            </w:r>
-          </w:p>
-        </w:tc>
-        <w:tc>
-          <w:tcPr/>
-          <w:p>
-            <w:pPr>
-              <w:pStyle w:val="Compact"/>
-              <w:jc w:val="left"/>
-            </w:pPr>
-            <w:r>
-              <w:t xml:space="preserve">Balance specification, when available</w:t>
+            <w:r>
+              <w:t xml:space="preserve"> </w:t>
+            </w:r>
+            <w:r>
+              <w:t xml:space="preserve">directly, eccentricity e, or balance grade G</w:t>
+            </w:r>
+          </w:p>
+        </w:tc>
+        <w:tc>
+          <w:tcPr/>
+          <w:p>
+            <w:pPr>
+              <w:pStyle w:val="Compact"/>
+              <w:jc w:val="left"/>
+            </w:pPr>
+            <w:r>
+              <w:t xml:space="preserve">U</w:t>
+            </w:r>
+            <w:r>
+              <w:rPr>
+                <w:vertAlign w:val="subscript"/>
+              </w:rPr>
+              <w:t xml:space="preserve">s</w:t>
+            </w:r>
+            <w:r>
+              <w:t xml:space="preserve">, e, G</w:t>
+            </w:r>
+          </w:p>
+        </w:tc>
+        <w:tc>
+          <w:tcPr/>
+          <w:p>
+            <w:pPr>
+              <w:pStyle w:val="Compact"/>
+              <w:jc w:val="left"/>
+            </w:pPr>
+            <w:r>
+              <w:t xml:space="preserve">kg·m, µm, mm/s</w:t>
+            </w:r>
+          </w:p>
+        </w:tc>
+        <w:tc>
+          <w:tcPr/>
+          <w:p>
+            <w:pPr>
+              <w:pStyle w:val="Compact"/>
+              <w:jc w:val="left"/>
+            </w:pPr>
+            <w:r>
+              <w:t xml:space="preserve">Balance specification</w:t>
             </w:r>
           </w:p>
         </w:tc>
@@ -7572,19 +7651,7 @@
               <w:jc w:val="left"/>
             </w:pPr>
             <w:r>
-              <w:t xml:space="preserve">Dynamic imbalance (optional)</w:t>
-            </w:r>
-          </w:p>
-        </w:tc>
-        <w:tc>
-          <w:tcPr/>
-          <w:p>
-            <w:pPr>
-              <w:pStyle w:val="Compact"/>
-              <w:jc w:val="left"/>
-            </w:pPr>
-            <w:r>
-              <w:t xml:space="preserve">U</w:t>
+              <w:t xml:space="preserve">Couple imbalance, one of: U</w:t>
             </w:r>
             <w:r>
               <w:rPr>
@@ -7592,29 +7659,56 @@
               </w:rPr>
               <w:t xml:space="preserve">d</w:t>
             </w:r>
-          </w:p>
-        </w:tc>
-        <w:tc>
-          <w:tcPr/>
-          <w:p>
-            <w:pPr>
-              <w:pStyle w:val="Compact"/>
-              <w:jc w:val="left"/>
-            </w:pPr>
-            <w:r>
-              <w:t xml:space="preserve">kg·m²</w:t>
-            </w:r>
-          </w:p>
-        </w:tc>
-        <w:tc>
-          <w:tcPr/>
-          <w:p>
-            <w:pPr>
-              <w:pStyle w:val="Compact"/>
-              <w:jc w:val="left"/>
-            </w:pPr>
-            <w:r>
-              <w:t xml:space="preserve">Balance specification, when available</w:t>
+            <w:r>
+              <w:t xml:space="preserve"> </w:t>
+            </w:r>
+            <w:r>
+              <w:t xml:space="preserve">directly, or balancing plane spacing b</w:t>
+            </w:r>
+          </w:p>
+        </w:tc>
+        <w:tc>
+          <w:tcPr/>
+          <w:p>
+            <w:pPr>
+              <w:pStyle w:val="Compact"/>
+              <w:jc w:val="left"/>
+            </w:pPr>
+            <w:r>
+              <w:t xml:space="preserve">U</w:t>
+            </w:r>
+            <w:r>
+              <w:rPr>
+                <w:vertAlign w:val="subscript"/>
+              </w:rPr>
+              <w:t xml:space="preserve">d</w:t>
+            </w:r>
+            <w:r>
+              <w:t xml:space="preserve">, b</w:t>
+            </w:r>
+          </w:p>
+        </w:tc>
+        <w:tc>
+          <w:tcPr/>
+          <w:p>
+            <w:pPr>
+              <w:pStyle w:val="Compact"/>
+              <w:jc w:val="left"/>
+            </w:pPr>
+            <w:r>
+              <w:t xml:space="preserve">kg·m², m</w:t>
+            </w:r>
+          </w:p>
+        </w:tc>
+        <w:tc>
+          <w:tcPr/>
+          <w:p>
+            <w:pPr>
+              <w:pStyle w:val="Compact"/>
+              <w:jc w:val="left"/>
+            </w:pPr>
+            <w:r>
+              <w:t xml:space="preserve">Balance specification; b from CAD</w:t>
             </w:r>
           </w:p>
         </w:tc>
@@ -8857,7 +8951,7 @@
         <w:pStyle w:val="FirstParagraph"/>
       </w:pPr>
       <w:r>
-        <w:t xml:space="preserve">Most inputs are taken directly from CAD, specifications or catalogs. The tilt θ has no specified tolerance, so a small value consistent with ordinary machining and assembly practice is used. The bearing imperfection amplitudes are specified values: they should be taken from the bearing precision class or the drawing tolerances, and replaced with measured values when inspection data is available. The damping ratio is an assumed typical value.</w:t>
+        <w:t xml:space="preserve">Most inputs are taken directly from CAD, specifications or catalogs. The imbalance values are specified limits rather than predictions, for the reasons given in Section 2.3. The bearing imperfection amplitudes are specified values: they should be taken from the bearing precision class or the drawing tolerances, and replaced with measured values when inspection data is available. The damping ratio is an assumed typical value.</w:t>
       </w:r>
     </w:p>
     <w:p>
@@ -8865,7 +8959,19 @@
         <w:pStyle w:val="BodyText"/>
       </w:pPr>
       <w:r>
-        <w:t xml:space="preserve">Static and dynamic imbalance can be supplied in two ways. If they are left blank, they are calculated from the other inputs using Equations (5) and (10). If a balance specification or report gives them directly, those values are entered instead and take priority. Entering U</w:t>
+        <w:t xml:space="preserve">Each imbalance can be supplied in whichever form the specification uses, and the first one given is used. Static imbalance is taken as U</w:t>
+      </w:r>
+      <w:r>
+        <w:rPr>
+          <w:vertAlign w:val="subscript"/>
+        </w:rPr>
+        <w:t xml:space="preserve">s</w:t>
+      </w:r>
+      <w:r>
+        <w:t xml:space="preserve"> </w:t>
+      </w:r>
+      <w:r>
+        <w:t xml:space="preserve">directly, or from the eccentricity by Equation (5), or from a balance grade by Equation (11). Couple imbalance is taken as U</w:t>
       </w:r>
       <w:r>
         <w:rPr>
@@ -8877,7 +8983,7 @@
         <w:t xml:space="preserve"> </w:t>
       </w:r>
       <w:r>
-        <w:t xml:space="preserve">this way removes the need for the tilt estimate. Similarly, where a datasheet gives the stored angular momentum rather than the spin inertia, I</w:t>
+        <w:t xml:space="preserve">directly or, if only a static limit exists, from the plane spacing by Equation (12). Only the spin inertia I</w:t>
       </w:r>
       <w:r>
         <w:rPr>
@@ -8889,7 +8995,19 @@
         <w:t xml:space="preserve"> </w:t>
       </w:r>
       <w:r>
-        <w:t xml:space="preserve">follows from Equation (47) in Section 6.</w:t>
+        <w:t xml:space="preserve">is needed; the transverse inertias and the tilt of Equation (8) are not required once the imbalance is specified this way. Where a datasheet gives the stored angular momentum rather than the spin inertia, I</w:t>
+      </w:r>
+      <w:r>
+        <w:rPr>
+          <w:vertAlign w:val="subscript"/>
+        </w:rPr>
+        <w:t xml:space="preserve">zz</w:t>
+      </w:r>
+      <w:r>
+        <w:t xml:space="preserve"> </w:t>
+      </w:r>
+      <w:r>
+        <w:t xml:space="preserve">follows from Equation (49) in Section 6. Any required input that is missing is reported by name and the calculation stops, so no value is silently assumed.</w:t>
       </w:r>
     </w:p>
     <w:bookmarkEnd w:id="43"/>
@@ -9063,7 +9181,7 @@
       </m:oMath>
       <w:r>
         <w:tab/>
-        <w:t>(46)</w:t>
+        <w:t>(48)</w:t>
       </w:r>
     </w:p>
     <w:p>
@@ -9135,7 +9253,7 @@
       </m:oMath>
       <w:r>
         <w:tab/>
-        <w:t>(47)</w:t>
+        <w:t>(49)</w:t>
       </w:r>
     </w:p>
     <w:bookmarkEnd w:id="45"/>
@@ -9221,7 +9339,7 @@
       </m:oMath>
       <w:r>
         <w:tab/>
-        <w:t>(48)</w:t>
+        <w:t>(50)</w:t>
       </w:r>
     </w:p>
     <w:p>
@@ -9289,7 +9407,7 @@
       </m:oMath>
       <w:r>
         <w:tab/>
-        <w:t>(49)</w:t>
+        <w:t>(51)</w:t>
       </w:r>
     </w:p>
     <w:p>
@@ -9321,7 +9439,7 @@
         <w:t xml:space="preserve"> </w:t>
       </w:r>
       <w:r>
-        <w:t xml:space="preserve">come from Equations (5) and (10) or from a balance specification. Both loads grow with the square of speed, so doubling the speed quadruples them. Seen from the stationary shaft, each appears on the two sideways axes as a pair of equal sinusoids, 90° apart, as in Equations (43) and (44).</w:t>
+        <w:t xml:space="preserve">are the specified balance limits, entered directly or found from Equations (5), (11) and (12). Both loads grow with the square of speed, so doubling the speed quadruples them. Seen from the stationary shaft, each appears on the two sideways axes as a pair of equal sinusoids, 90° apart, as in Equations (45) and (46).</w:t>
       </w:r>
     </w:p>
     <w:bookmarkEnd w:id="46"/>
@@ -9351,7 +9469,7 @@
         <w:t xml:space="preserve"> </w:t>
       </w:r>
       <w:r>
-        <w:t xml:space="preserve">along the shaft. Following Equation (40), they are moved directly to the reference point in a single step:</w:t>
+        <w:t xml:space="preserve">along the shaft. Following Equation (42), they are moved directly to the reference point in a single step:</w:t>
       </w:r>
     </w:p>
     <w:p>
@@ -9517,7 +9635,7 @@
       </m:oMath>
       <w:r>
         <w:tab/>
-        <w:t>(50)</w:t>
+        <w:t>(52)</w:t>
       </w:r>
     </w:p>
     <w:p>
@@ -9676,7 +9794,7 @@
       </m:oMath>
       <w:r>
         <w:tab/>
-        <w:t>(51)</w:t>
+        <w:t>(53)</w:t>
       </w:r>
     </w:p>
     <w:p>
@@ -9684,7 +9802,7 @@
         <w:pStyle w:val="FirstParagraph"/>
       </w:pPr>
       <w:r>
-        <w:t xml:space="preserve">All shafts are parallel to the structure z axis, so no rotation of axes is needed and R in Equations (41) and (42) is the identity matrix.</w:t>
+        <w:t xml:space="preserve">All shafts are parallel to the structure z axis, so no rotation of axes is needed and R in Equations (43) and (44) is the identity matrix.</w:t>
       </w:r>
     </w:p>
     <w:bookmarkEnd w:id="47"/>
@@ -9702,7 +9820,7 @@
         <w:pStyle w:val="FirstParagraph"/>
       </w:pPr>
       <w:r>
-        <w:t xml:space="preserve">The wheel and the arm also produce quasi-steady loads. Changing a part’s speed takes a torque, which the motor applies to the rotor and the stator passes into the shaft. From Equations (27) and (28), spin-up and spin-down are treated separately:</w:t>
+        <w:t xml:space="preserve">The wheel and the arm also produce quasi-steady loads. Changing a part’s speed takes a torque, which the motor applies to the rotor and the stator passes into the shaft. From Equations (29) and (30), spin-up and spin-down are treated separately:</w:t>
       </w:r>
     </w:p>
     <w:p>
@@ -9816,7 +9934,7 @@
       </m:oMath>
       <w:r>
         <w:tab/>
-        <w:t>(52)</w:t>
+        <w:t>(54)</w:t>
       </w:r>
     </w:p>
     <w:p>
@@ -9954,7 +10072,7 @@
       </m:oMath>
       <w:r>
         <w:tab/>
-        <w:t>(53)</w:t>
+        <w:t>(55)</w:t>
       </w:r>
     </w:p>
     <w:p>
@@ -9970,7 +10088,7 @@
         <w:pStyle w:val="BodyText"/>
       </w:pPr>
       <w:r>
-        <w:t xml:space="preserve">If the support structure rotated, each part would also apply a gyroscopic moment, Equation (34). Because all shafts are stationary, ω</w:t>
+        <w:t xml:space="preserve">If the support structure rotated, each part would also apply a gyroscopic moment, Equation (36). Because all shafts are stationary, ω</w:t>
       </w:r>
       <w:r>
         <w:rPr>
@@ -9982,7 +10100,7 @@
         <w:t xml:space="preserve"> </w:t>
       </w:r>
       <w:r>
-        <w:t xml:space="preserve">is zero and this moment does not arise. The tangential imbalance force of Equation (29) is also neglected, since it is under 1% of the main force for the ramp times used.</w:t>
+        <w:t xml:space="preserve">is zero and this moment does not arise. The tangential imbalance force of Equation (31) is also neglected, since it is under 1% of the main force for the ramp times used.</w:t>
       </w:r>
     </w:p>
     <w:bookmarkEnd w:id="48"/>
@@ -10000,7 +10118,7 @@
         <w:pStyle w:val="FirstParagraph"/>
       </w:pPr>
       <w:r>
-        <w:t xml:space="preserve">Each bearing of each pair is modeled separately. The bearing frequencies follow from Equations (11) to (14), using the outer-race-rotating forms, with f</w:t>
+        <w:t xml:space="preserve">Each bearing of each pair is modeled separately. The bearing frequencies follow from Equations (13) to (16), using the outer-race-rotating forms, with f</w:t>
       </w:r>
       <w:r>
         <w:rPr>
@@ -10012,7 +10130,7 @@
         <w:t xml:space="preserve"> </w:t>
       </w:r>
       <w:r>
-        <w:t xml:space="preserve">taken as that part’s own rotor frequency. The preload gives the roller load and stiffness through Equations (17) to (19), and the bearing radial and axial stiffness through Equations (20) and (21). If the supplier gives a radial stiffness, it is used instead and the roller stiffness is found from Equation (20).</w:t>
+        <w:t xml:space="preserve">taken as that part’s own rotor frequency. The preload gives the roller load and stiffness through Equations (19) to (21), and the bearing radial and axial stiffness through Equations (22) and (23). If the supplier gives a radial stiffness, it is used instead and the roller stiffness is found from Equation (22).</w:t>
       </w:r>
     </w:p>
     <w:p>
@@ -10246,7 +10364,7 @@
       </m:oMath>
       <w:r>
         <w:tab/>
-        <w:t>(54)</w:t>
+        <w:t>(56)</w:t>
       </w:r>
     </w:p>
     <w:p>
@@ -11083,7 +11201,7 @@
         <w:t xml:space="preserve"> </w:t>
       </w:r>
       <w:r>
-        <w:t xml:space="preserve">is Z when the waviness of all rollers is assumed in phase (worst case) or √Z when their phases are taken as random. Each blocked force is converted to the force at the shaft with Equation (26), using the lateral or axial natural frequency. Lines from bearing A and bearing B fall at the same frequencies and are added. Within each rotor, all lateral lines are added to give the bearing Fx and Fy, and all axial lines to give Fz:</w:t>
+        <w:t xml:space="preserve">is Z when the waviness of all rollers is assumed in phase (worst case) or √Z when their phases are taken as random. Each blocked force is converted to the force at the shaft with Equation (28), using the lateral or axial natural frequency. Lines from bearing A and bearing B fall at the same frequencies and are added. Within each rotor, all lateral lines are added to give the bearing Fx and Fy, and all axial lines to give Fz:</w:t>
       </w:r>
     </w:p>
     <w:p>
@@ -11314,7 +11432,7 @@
       </m:oMath>
       <w:r>
         <w:tab/>
-        <w:t>(55)</w:t>
+        <w:t>(57)</w:t>
       </w:r>
     </w:p>
     <w:p>
@@ -11473,7 +11591,7 @@
       </m:oMath>
       <w:r>
         <w:tab/>
-        <w:t>(56)</w:t>
+        <w:t>(58)</w:t>
       </w:r>
     </w:p>
     <w:p>
@@ -11481,7 +11599,7 @@
         <w:pStyle w:val="FirstParagraph"/>
       </w:pPr>
       <w:r>
-        <w:t xml:space="preserve">Below the natural frequency the bearing force reaches the shaft as the reaction to the rotor’s motion, so it is taken to act at the rotor’s center of mass, a distance L from the reference point. The linear model is checked by comparing the largest combined imperfection with the preload deflection δ_0 of Equation (18), and a warning is given if rollers could unload.</w:t>
+        <w:t xml:space="preserve">Below the natural frequency the bearing force reaches the shaft as the reaction to the rotor’s motion, so it is taken to act at the rotor’s center of mass, a distance L from the reference point. The linear model is checked by comparing the largest combined imperfection with the preload deflection δ_0 of Equation (20), and a warning is given if rollers could unload.</w:t>
       </w:r>
     </w:p>
     <w:bookmarkEnd w:id="49"/>
@@ -11499,7 +11617,7 @@
         <w:pStyle w:val="FirstParagraph"/>
       </w:pPr>
       <w:r>
-        <w:t xml:space="preserve">The six components are summed over the arm, both wheels and all bearings, following Equation (37). Forces and rocking moments are added as peak values. The twist is added with its sign, and its magnitude is reported as the net assembly twist. Loads at any other operating point follow from Equation (36), using the arm speed, since the wheels track the arm at a fixed ratio.</w:t>
+        <w:t xml:space="preserve">The six components are summed over the arm, both wheels and all bearings, following Equation (39). Forces and rocking moments are added as peak values. The twist is added with its sign, and its magnitude is reported as the net assembly twist. Loads at any other operating point follow from Equation (38), using the arm speed, since the wheels track the arm at a fixed ratio.</w:t>
       </w:r>
     </w:p>
     <w:tbl>
@@ -11585,7 +11703,7 @@
               <w:t xml:space="preserve">w</w:t>
             </w:r>
             <w:r>
-              <w:t xml:space="preserve">, Equation (48)</w:t>
+              <w:t xml:space="preserve">, Equation (50)</w:t>
             </w:r>
           </w:p>
         </w:tc>
@@ -11606,7 +11724,7 @@
               <w:t xml:space="preserve">lat,brg</w:t>
             </w:r>
             <w:r>
-              <w:t xml:space="preserve">, Equation (55)</w:t>
+              <w:t xml:space="preserve">, Equation (57)</w:t>
             </w:r>
           </w:p>
         </w:tc>
@@ -11653,7 +11771,7 @@
               <w:t xml:space="preserve">ax,brg</w:t>
             </w:r>
             <w:r>
-              <w:t xml:space="preserve">, Equation (55)</w:t>
+              <w:t xml:space="preserve">, Equation (57)</w:t>
             </w:r>
           </w:p>
         </w:tc>
@@ -11703,7 +11821,7 @@
               <w:t xml:space="preserve"> </w:t>
             </w:r>
             <w:r>
-              <w:t xml:space="preserve">L, Equation (51)</w:t>
+              <w:t xml:space="preserve">L, Equation (53)</w:t>
             </w:r>
           </w:p>
         </w:tc>
@@ -11727,7 +11845,7 @@
               <w:t xml:space="preserve"> </w:t>
             </w:r>
             <w:r>
-              <w:t xml:space="preserve">L, Equation (56)</w:t>
+              <w:t xml:space="preserve">L, Equation (58)</w:t>
             </w:r>
           </w:p>
         </w:tc>
@@ -11774,7 +11892,7 @@
               <w:t xml:space="preserve">down</w:t>
             </w:r>
             <w:r>
-              <w:t xml:space="preserve">, Equations (52) and (53)</w:t>
+              <w:t xml:space="preserve">, Equations (54) and (55)</w:t>
             </w:r>
           </w:p>
         </w:tc>
@@ -11841,7 +11959,7 @@
         <w:pStyle w:val="BodyText"/>
       </w:pPr>
       <w:r>
-        <w:t xml:space="preserve">Of the sources described in Section 2, the method includes those that can be estimated from the design data available: static imbalance, dynamic imbalance, motor reaction torque and the bearings. The remaining sources are left out for specific reasons. Motor ripple and cogging need the motor pole and slot counts and ripple data, which were not yet available. Broadband noise has no deterministic model and can only be measured. Gyroscopic moments are zero because all three shafts are stationary, and even if the assembly were carried on a moving base, the counter-rotating wheels are sized to bring its total angular momentum close to zero, as in Equation (35). Each of these can be added later without changing the rest of the method.</w:t>
+        <w:t xml:space="preserve">Of the sources described in Section 2, the method includes those that can be estimated from the design data available: static imbalance, dynamic imbalance, motor reaction torque and the bearings. The remaining sources are left out for specific reasons. Motor ripple and cogging need the motor pole and slot counts and ripple data, which were not yet available. Broadband noise has no deterministic model and can only be measured. Gyroscopic moments are zero because all three shafts are stationary, and even if the assembly were carried on a moving base, the counter-rotating wheels are sized to bring its total angular momentum close to zero, as in Equation (37). Each of these can be added later without changing the rest of the method.</w:t>
       </w:r>
     </w:p>
     <w:bookmarkEnd w:id="52"/>
@@ -11859,7 +11977,7 @@
         <w:pStyle w:val="FirstParagraph"/>
       </w:pPr>
       <w:r>
-        <w:t xml:space="preserve">Because the CAD models are symmetric, the static imbalance was taken from the eccentricity specification rather than from the geometry, using Equation (5), and the lateral force at maximum speed follows from Equation (48). This force rotates with the part. It appears at the reference point as Fx and Fy, each with the same peak value, reached a quarter of a revolution apart. It produces no axial force. Once a balance specification or a balance report is available, its value of U</w:t>
+        <w:t xml:space="preserve">Because the CAD models are symmetric, the static imbalance is taken from the balance specification rather than from the geometry: as U</w:t>
       </w:r>
       <w:r>
         <w:rPr>
@@ -11871,17 +11989,17 @@
         <w:t xml:space="preserve"> </w:t>
       </w:r>
       <w:r>
-        <w:t xml:space="preserve">replaces the one calculated from eccentricity, and the rest of the method is unchanged.</w:t>
+        <w:t xml:space="preserve">directly, from the eccentricity with Equation (5), or from a balance grade with Equation (11). The lateral force at maximum speed follows from Equation (50). This force rotates with the part. It appears at the reference point as Fx and Fy, each with the same peak value, reached a quarter of a revolution apart. It produces no axial force. Whichever form is used, the rest of the method is unchanged.</w:t>
       </w:r>
     </w:p>
     <w:bookmarkEnd w:id="53"/>
-    <w:bookmarkStart w:id="54" w:name="X993bfb4b85ccce306dc017d34e66d811f5cd28c"/>
+    <w:bookmarkStart w:id="54" w:name="X4ac1a931d712e4c778447378e5f7b92ad9218e1"/>
     <w:p>
       <w:pPr>
         <w:pStyle w:val="Heading3"/>
       </w:pPr>
       <w:r>
-        <w:t xml:space="preserve">7.3 Dynamic imbalance from inertia and an estimated tilt</w:t>
+        <w:t xml:space="preserve">7.3 Couple imbalance from the balance specification</w:t>
       </w:r>
     </w:p>
     <w:p>
@@ -11889,7 +12007,7 @@
         <w:pStyle w:val="FirstParagraph"/>
       </w:pPr>
       <w:r>
-        <w:t xml:space="preserve">Dynamic imbalance needs two inputs: the difference between the spin and transverse inertias, which comes from CAD, and the tilt of the principal axis relative to the shaft, which was not specified. A small tilt was therefore assumed for each part, of a size consistent with ordinary machining and assembly tolerances. This is the least certain input in the imbalance calculation and is flagged as such in the results.</w:t>
+        <w:t xml:space="preserve">An earlier version of the method calculated couple imbalance from the transverse inertias and an assumed tilt of each part on its shaft. That approach was dropped. The tilt has no specified value, and estimating it introduced a number with no traceable source, while the transverse inertias were needed for nothing else.</w:t>
       </w:r>
     </w:p>
     <w:p>
@@ -11897,7 +12015,7 @@
         <w:pStyle w:val="BodyText"/>
       </w:pPr>
       <w:r>
-        <w:t xml:space="preserve">The direction of the tilt is also unknown. For a rotor with equal transverse inertias, such as a wheel, this does not matter. For the arm it matters a great deal, because its inertia about one transverse axis is close to its spin inertia while its inertia about the other is very small. The method therefore uses Equation (10), which takes the worst tilt direction. As with static imbalance, U</w:t>
+        <w:t xml:space="preserve">Couple imbalance is now treated the same way as static imbalance, as a specified limit. When a couple limit is given, it is used directly. When only a static limit exists, the couple limit is taken as that static tolerance applied in each of the two balancing planes with the residuals opposed, Equation (12), which needs only the plane spacing b from CAD. This is a stated assumption, and it is reported as such in the results. The analysis can also be used the other way round: given an allowable rocking moment M at the interface, the couple limit the balancing must achieve is U</w:t>
       </w:r>
       <w:r>
         <w:rPr>
@@ -11909,7 +12027,7 @@
         <w:t xml:space="preserve"> </w:t>
       </w:r>
       <w:r>
-        <w:t xml:space="preserve">can be entered directly when a balance specification provides it, and doing so removes the need for the tilt estimate altogether.</w:t>
+        <w:t xml:space="preserve">= M / Ω².</w:t>
       </w:r>
     </w:p>
     <w:bookmarkEnd w:id="54"/>
@@ -11927,7 +12045,7 @@
         <w:pStyle w:val="FirstParagraph"/>
       </w:pPr>
       <w:r>
-        <w:t xml:space="preserve">Each part’s loads are moved from its center of mass to the reference point in a single step, using Equation (50), so that no lever arm is counted twice. Moving the reference point changes the moments but not the forces, which lets the same calculation report loads at whichever interface the structures team needs.</w:t>
+        <w:t xml:space="preserve">Each part’s loads are moved from its center of mass to the reference point in a single step, using Equation (52), so that no lever arm is counted twice. Moving the reference point changes the moments but not the forces, which lets the same calculation report loads at whichever interface the structures team needs.</w:t>
       </w:r>
     </w:p>
     <w:bookmarkEnd w:id="55"/>
@@ -11945,7 +12063,7 @@
         <w:pStyle w:val="FirstParagraph"/>
       </w:pPr>
       <w:r>
-        <w:t xml:space="preserve">The twist about the shaft was calculated separately for spin-up and spin-down, Equations (52) and (53), because the two ramps can have different durations. The load tables carry the larger of the two values for each part. When the twists of all three parts are added with their signs, the counter-rotating wheels largely cancel the arm, which is the purpose of the wheels. The net value is reported as the assembly’s twist, but each motor mount still carries its own full torque, and those values are reported separately so that the individual mounts can be checked.</w:t>
+        <w:t xml:space="preserve">The twist about the shaft was calculated separately for spin-up and spin-down, Equations (54) and (55), because the two ramps can have different durations. The load tables carry the larger of the two values for each part. When the twists of all three parts are added with their signs, the counter-rotating wheels largely cancel the arm, which is the purpose of the wheels. The net value is reported as the assembly’s twist, but each motor mount still carries its own full torque, and those values are reported separately so that the individual mounts can be checked.</w:t>
       </w:r>
     </w:p>
     <w:bookmarkEnd w:id="56"/>
@@ -11963,7 +12081,7 @@
         <w:pStyle w:val="FirstParagraph"/>
       </w:pPr>
       <w:r>
-        <w:t xml:space="preserve">The bearing model has two parts with different levels of confidence. The frequencies are exact. For each part, the catalog geometry gives the cage, outer race pass, inner race pass and rolling element spin frequencies from Equations (11) to (14), and these are reported in full because they are what a structural analyst needs to check for resonance.</w:t>
+        <w:t xml:space="preserve">The bearing model has two parts with different levels of confidence. The frequencies are exact. For each part, the catalog geometry gives the cage, outer race pass, inner race pass and rolling element spin frequencies from Equations (13) to (16), and these are reported in full because they are what a structural analyst needs to check for resonance.</w:t>
       </w:r>
     </w:p>
     <w:p>
@@ -11971,7 +12089,7 @@
         <w:pStyle w:val="BodyText"/>
       </w:pPr>
       <w:r>
-        <w:t xml:space="preserve">The amplitudes follow from physics, but they depend on the imperfections specified. An earlier version of the method estimated each bearing harmonic as a fixed fraction of the imbalance force and treated each bearing pair as a single source with four harmonics. That approach was replaced. The current model builds the bearing stiffness from the catalog geometry and the preload, uses the classical waviness selection rule of Equation (22) to find which imperfection orders produce a net force and at which frequency, and passes each blocked force through the rotor-bearing dynamics of Equation (26). Each bearing of a pair is treated separately, with its own imperfection amplitudes, and each source produces its own set of lines at its own frequencies, rather than a single lumped set of four.</w:t>
+        <w:t xml:space="preserve">The amplitudes follow from physics, but they depend on the imperfections specified. An earlier version of the method estimated each bearing harmonic as a fixed fraction of the imbalance force and treated each bearing pair as a single source with four harmonics. That approach was replaced. The current model builds the bearing stiffness from the catalog geometry and the preload, uses the classical waviness selection rule of Equation (24) to find which imperfection orders produce a net force and at which frequency, and passes each blocked force through the rotor-bearing dynamics of Equation (28). Each bearing of a pair is treated separately, with its own imperfection amplitudes, and each source produces its own set of lines at its own frequencies, rather than a single lumped set of four.</w:t>
       </w:r>
     </w:p>
     <w:p>
@@ -12021,7 +12139,7 @@
         <w:pStyle w:val="BodyText"/>
       </w:pPr>
       <w:r>
-        <w:t xml:space="preserve">An independent review of an early version raised several points about how results could be misread. In response, the output now states that Fx and Fy are peaks reached a quarter turn apart rather than simultaneous values, labels every result as a worst-case estimate, identifies which inputs are estimates, and reports spin-up and spin-down twist separately. The built-in checks are also described as checks on the arithmetic, not on the physical inputs. Among them are the bearing identities of Equations (15) and (16), which hold for any bearing geometry, a roller-by-roller check of the bearing stiffness of Equation (20), and a numerical check of the waviness selection rule of Equation (22).</w:t>
+        <w:t xml:space="preserve">An independent review of an early version raised several points about how results could be misread. In response, the output now states that Fx and Fy are peaks reached a quarter turn apart rather than simultaneous values, labels every result as a worst-case estimate, identifies which inputs are estimates, and reports spin-up and spin-down twist separately. The built-in checks are also described as checks on the arithmetic, not on the physical inputs. Among them are the bearing identities of Equations (17) and (18), which hold for any bearing geometry, a roller-by-roller check of the bearing stiffness of Equation (22), and a numerical check of the waviness selection rule of Equation (24).</w:t>
       </w:r>
     </w:p>
     <w:bookmarkEnd w:id="58"/>
@@ -12039,7 +12157,7 @@
         <w:pStyle w:val="FirstParagraph"/>
       </w:pPr>
       <w:r>
-        <w:t xml:space="preserve">The method is implemented in a single MATLAB script. The only part a user edits is the input section, where each rotating part has its own block of clearly named values. Static and dynamic imbalance may be left blank to be calculated, or entered directly from a balance specification. When the script runs, it calculates every source, sums the loads, runs a set of arithmetic checks, plots the lateral and axial force against speed, and prints the results in four parts followed by the loads at other speeds. The flow is shown in Figure 1.</w:t>
+        <w:t xml:space="preserve">The method is implemented in a single MATLAB script. The only part a user edits is the input section, where each rotating part has its own block of clearly named values. Static and couple imbalance can each be entered in whichever form the balance specification uses, and any required value left blank is reported by name before the calculation runs. When the script runs, it calculates every source, sums the loads, runs a set of arithmetic checks, plots the lateral and axial force against speed, and prints the results in four parts followed by the loads at other speeds. The flow is shown in Figure 1.</w:t>
       </w:r>
     </w:p>
     <w:p>
@@ -12113,7 +12231,7 @@
         <w:pStyle w:val="FirstParagraph"/>
       </w:pPr>
       <w:r>
-        <w:t xml:space="preserve">The method rests on a small number of assumptions, each chosen either because it is the standard convention for source loads or because it errs toward a larger, safer answer. The parts are treated as rigid and the mount as perfectly stiff, which is the hard-mounted convention. All peaks are added as though they occur together, since the phases between sources are unknown. Fx and Fy are peak values of the same rotating force, reached a quarter turn apart, so the resultant lateral force equals Fx rather than √2 times Fx, and the same is true of Mx and My. The dynamic imbalance uses the worst tilt direction. Speed changes are taken to occur at a constant rate, and the shafts do not move in space, so there is no gyroscopic load from motion of the base.</w:t>
+        <w:t xml:space="preserve">The method rests on a small number of assumptions, each chosen either because it is the standard convention for source loads or because it errs toward a larger, safer answer. The parts are treated as rigid and the mount as perfectly stiff, which is the hard-mounted convention. All peaks are added as though they occur together, since the phases between sources are unknown. Fx and Fy are peak values of the same rotating force, reached a quarter turn apart, so the resultant lateral force equals Fx rather than √2 times Fx, and the same is true of Mx and My. Speed changes are taken to occur at a constant rate, and the shafts do not move in space, so there is no gyroscopic load from motion of the base.</w:t>
       </w:r>
     </w:p>
     <w:p>
@@ -12121,19 +12239,7 @@
         <w:pStyle w:val="BodyText"/>
       </w:pPr>
       <w:r>
-        <w:t xml:space="preserve">The tilt of each part has no specified tolerance and was set to a small value consistent with normal machining practice; it can be removed entirely by entering U</w:t>
-      </w:r>
-      <w:r>
-        <w:rPr>
-          <w:vertAlign w:val="subscript"/>
-        </w:rPr>
-        <w:t xml:space="preserve">d</w:t>
-      </w:r>
-      <w:r>
-        <w:t xml:space="preserve"> </w:t>
-      </w:r>
-      <w:r>
-        <w:t xml:space="preserve">from a balance specification. The bearing loads are only as good as the specified imperfection amplitudes, which come from tolerance classes rather than measurement. The bearing model is linear about the preload and assumes every roller stays loaded. It uses Palmgren’s empirical line-contact relation for stiffness, includes only the rotor’s lateral and axial modes on its bearings (not its rocking mode), adds the lines of both bearings and all sources in phase, and assumes a typical damping ratio.</w:t>
+        <w:t xml:space="preserve">The imbalance values are specified limits, not measurements. Where no couple limit is specified, it is taken as the static tolerance in two planes with the residuals opposed, which should be confirmed or replaced by a couple requirement. The bearing loads are only as good as the specified imperfection amplitudes, which come from tolerance classes rather than measurement. The bearing model is linear about the preload and assumes every roller stays loaded. It uses Palmgren’s empirical line-contact relation for stiffness, includes only the rotor’s lateral and axial modes on its bearings (not its rocking mode), adds the lines of both bearings and all sources in phase, and assumes a typical damping ratio.</w:t>
       </w:r>
     </w:p>
     <w:p>
@@ -12159,19 +12265,7 @@
         <w:pStyle w:val="FirstParagraph"/>
       </w:pPr>
       <w:r>
-        <w:t xml:space="preserve">The next steps follow directly from the estimates and exclusions above. The final CAD mass properties, speeds, positions and bearing part numbers will be entered to produce the load values for our hardware. The tilt estimate will be replaced with U</w:t>
-      </w:r>
-      <w:r>
-        <w:rPr>
-          <w:vertAlign w:val="subscript"/>
-        </w:rPr>
-        <w:t xml:space="preserve">d</w:t>
-      </w:r>
-      <w:r>
-        <w:t xml:space="preserve"> </w:t>
-      </w:r>
-      <w:r>
-        <w:t xml:space="preserve">from a balance specification, and the bearing imperfection amplitudes with inspection data or supplier vibration data. Motor torque ripple can be added once the motor pole and slot counts and ripple data are known. The loads and the bearing frequencies will be passed to the structural analysis to check for modes close to any disturbance frequency, and once hardware is built, the assembly will be measured on a force table and compared with these estimates.</w:t>
+        <w:t xml:space="preserve">The next steps follow directly from the estimates and exclusions above. The final CAD mass properties, speeds, positions and bearing part numbers will be entered to produce the load values for our hardware. A couple imbalance requirement will be defined or confirmed with the rotor designers, and the bearing imperfection amplitudes with inspection data or supplier vibration data. Motor torque ripple can be added once the motor pole and slot counts and ripple data are known. The loads and the bearing frequencies will be passed to the structural analysis to check for modes close to any disturbance frequency, and once hardware is built, the assembly will be measured on a force table and compared with these estimates.</w:t>
       </w:r>
     </w:p>
     <w:p>
@@ -12179,7 +12273,7 @@
         <w:pStyle w:val="BodyText"/>
       </w:pPr>
       <w:r>
-        <w:t xml:space="preserve">Induced vibration from rotating machinery comes down to a short list of physical effects. A rotor whose center of mass is off its axis pushes sideways. A rotor that sits tilted rocks its shaft. A rotor that changes speed twists its mount. The bearings add small disturbances at frequencies set by their geometry, with sizes set by their stiffness, preload and imperfections. For our assembly, each of these was estimated from design data alone, in a form that is conservative, can be checked by hand, and can be refined one input at a time as better data becomes available.</w:t>
+        <w:t xml:space="preserve">Induced vibration from rotating machinery comes down to a short list of physical effects. A rotor whose center of mass is off its axis pushes sideways. A rotor whose principal axis is tilted rocks its shaft. A rotor that changes speed twists its mount. The bearings add small disturbances at frequencies set by their geometry, with sizes set by their stiffness, preload and imperfections. For our assembly, each of these was estimated from design data alone, in a form that is conservative, can be checked by hand, and can be refined one input at a time as better data becomes available.</w:t>
       </w:r>
     </w:p>
     <w:bookmarkEnd w:id="65"/>

</xml_diff>

<commit_message>
Complete source set: imbalance acceleration terms, higher harmonics, motor ripple/cogging, gyroscopic moment; 15 checks; white paper updated
Co-Authored-By: Claude Opus 5.5 <noreply@anthropic.com>
Claude-Session: https://claude.ai/code/session_01AcuW3xSnVc4HeTATtgPH4G
</commit_message>
<xml_diff>
--- a/white_paper/Induced_Vibration_White_Paper.docx
+++ b/white_paper/Induced_Vibration_White_Paper.docx
@@ -2,7 +2,7 @@
 <file path=word/document.xml><?xml version="1.0" encoding="utf-8"?>
 <w:document xmlns:w="http://schemas.openxmlformats.org/wordprocessingml/2006/main" xmlns:m="http://schemas.openxmlformats.org/officeDocument/2006/math" xmlns:r="http://schemas.openxmlformats.org/officeDocument/2006/relationships" xmlns:o="urn:schemas-microsoft-com:office:office" xmlns:v="urn:schemas-microsoft-com:vml" xmlns:w10="urn:schemas-microsoft-com:office:word" xmlns:a="http://schemas.openxmlformats.org/drawingml/2006/main" xmlns:pic="http://schemas.openxmlformats.org/drawingml/2006/picture" xmlns:wp="http://schemas.openxmlformats.org/drawingml/2006/wordprocessingDrawing">
   <w:body>
-    <w:bookmarkStart w:id="67" w:name="X29d9129c66b893fcffa0b85bbf40af794a10bea"/>
+    <w:bookmarkStart w:id="69" w:name="X29d9129c66b893fcffa0b85bbf40af794a10bea"/>
     <w:p>
       <w:pPr>
         <w:pStyle w:val="Heading1"/>
@@ -7863,6 +7863,192 @@
           </w:p>
         </w:tc>
       </w:tr>
+      <w:tr>
+        <w:tc>
+          <w:tcPr/>
+          <w:p>
+            <w:pPr>
+              <w:pStyle w:val="Compact"/>
+              <w:jc w:val="left"/>
+            </w:pPr>
+            <w:r>
+              <w:t xml:space="preserve">Higher imbalance harmonics (optional): h, C</w:t>
+            </w:r>
+            <w:r>
+              <w:rPr>
+                <w:vertAlign w:val="subscript"/>
+              </w:rPr>
+              <w:t xml:space="preserve">f</w:t>
+            </w:r>
+            <w:r>
+              <w:t xml:space="preserve">, C</w:t>
+            </w:r>
+            <w:r>
+              <w:rPr>
+                <w:vertAlign w:val="subscript"/>
+              </w:rPr>
+              <w:t xml:space="preserve">m</w:t>
+            </w:r>
+          </w:p>
+        </w:tc>
+        <w:tc>
+          <w:tcPr/>
+          <w:p>
+            <w:pPr>
+              <w:pStyle w:val="Compact"/>
+              <w:jc w:val="left"/>
+            </w:pPr>
+            <w:r>
+              <w:t xml:space="preserve">–</w:t>
+            </w:r>
+          </w:p>
+        </w:tc>
+        <w:tc>
+          <w:tcPr/>
+          <w:p>
+            <w:pPr>
+              <w:pStyle w:val="Compact"/>
+              <w:jc w:val="left"/>
+            </w:pPr>
+            <w:r>
+              <w:t xml:space="preserve">–, kg·m, kg·m²</w:t>
+            </w:r>
+          </w:p>
+        </w:tc>
+        <w:tc>
+          <w:tcPr/>
+          <w:p>
+            <w:pPr>
+              <w:pStyle w:val="Compact"/>
+              <w:jc w:val="left"/>
+            </w:pPr>
+            <w:r>
+              <w:t xml:space="preserve">Specification or test</w:t>
+            </w:r>
+          </w:p>
+        </w:tc>
+      </w:tr>
+      <w:tr>
+        <w:tc>
+          <w:tcPr/>
+          <w:p>
+            <w:pPr>
+              <w:pStyle w:val="Compact"/>
+              <w:jc w:val="left"/>
+            </w:pPr>
+            <w:r>
+              <w:t xml:space="preserve">Motor pole pairs and stator slots</w:t>
+            </w:r>
+          </w:p>
+        </w:tc>
+        <w:tc>
+          <w:tcPr/>
+          <w:p>
+            <w:pPr>
+              <w:pStyle w:val="Compact"/>
+              <w:jc w:val="left"/>
+            </w:pPr>
+            <w:r>
+              <w:t xml:space="preserve">p, N</w:t>
+            </w:r>
+            <w:r>
+              <w:rPr>
+                <w:vertAlign w:val="subscript"/>
+              </w:rPr>
+              <w:t xml:space="preserve">s</w:t>
+            </w:r>
+          </w:p>
+        </w:tc>
+        <w:tc>
+          <w:tcPr/>
+          <w:p>
+            <w:pPr>
+              <w:pStyle w:val="Compact"/>
+              <w:jc w:val="left"/>
+            </w:pPr>
+            <w:r>
+              <w:t xml:space="preserve">–</w:t>
+            </w:r>
+          </w:p>
+        </w:tc>
+        <w:tc>
+          <w:tcPr/>
+          <w:p>
+            <w:pPr>
+              <w:pStyle w:val="Compact"/>
+              <w:jc w:val="left"/>
+            </w:pPr>
+            <w:r>
+              <w:t xml:space="preserve">Motor datasheet</w:t>
+            </w:r>
+          </w:p>
+        </w:tc>
+      </w:tr>
+      <w:tr>
+        <w:tc>
+          <w:tcPr/>
+          <w:p>
+            <w:pPr>
+              <w:pStyle w:val="Compact"/>
+              <w:jc w:val="left"/>
+            </w:pPr>
+            <w:r>
+              <w:t xml:space="preserve">Motor torque ripple and cogging amplitudes, by harmonic</w:t>
+            </w:r>
+          </w:p>
+        </w:tc>
+        <w:tc>
+          <w:tcPr/>
+          <w:p>
+            <w:pPr>
+              <w:pStyle w:val="Compact"/>
+              <w:jc w:val="left"/>
+            </w:pPr>
+            <w:r>
+              <w:t xml:space="preserve">T</w:t>
+            </w:r>
+            <w:r>
+              <w:rPr>
+                <w:vertAlign w:val="subscript"/>
+              </w:rPr>
+              <w:t xml:space="preserve">ripple</w:t>
+            </w:r>
+            <w:r>
+              <w:t xml:space="preserve">, T</w:t>
+            </w:r>
+            <w:r>
+              <w:rPr>
+                <w:vertAlign w:val="subscript"/>
+              </w:rPr>
+              <w:t xml:space="preserve">cog</w:t>
+            </w:r>
+          </w:p>
+        </w:tc>
+        <w:tc>
+          <w:tcPr/>
+          <w:p>
+            <w:pPr>
+              <w:pStyle w:val="Compact"/>
+              <w:jc w:val="left"/>
+            </w:pPr>
+            <w:r>
+              <w:t xml:space="preserve">N·m</w:t>
+            </w:r>
+          </w:p>
+        </w:tc>
+        <w:tc>
+          <w:tcPr/>
+          <w:p>
+            <w:pPr>
+              <w:pStyle w:val="Compact"/>
+              <w:jc w:val="left"/>
+            </w:pPr>
+            <w:r>
+              <w:t xml:space="preserve">Motor datasheet or test</w:t>
+            </w:r>
+          </w:p>
+        </w:tc>
+      </w:tr>
     </w:tbl>
     <w:bookmarkEnd w:id="40"/>
     <w:bookmarkStart w:id="41" w:name="bearing-inputs"/>
@@ -8654,7 +8840,7 @@
     <w:tbl>
       <w:tblPr>
         <w:tblStyle w:val="Table"/>
-        <w:tblW w:type="auto" w:w="0"/>
+        <w:tblW w:type="pct" w:w="5000"/>
         <w:tblLook w:firstRow="1" w:lastRow="0" w:firstColumn="0" w:lastColumn="0" w:noHBand="0" w:noVBand="0" w:val="0020"/>
         <w:jc w:val="start"/>
       </w:tblPr>
@@ -8894,6 +9080,62 @@
               <w:jc w:val="left"/>
             </w:pPr>
             <w:r>
+              <w:t xml:space="preserve">Spacecraft angular rate about x, y, z</w:t>
+            </w:r>
+          </w:p>
+        </w:tc>
+        <w:tc>
+          <w:tcPr/>
+          <w:p>
+            <w:pPr>
+              <w:pStyle w:val="Compact"/>
+              <w:jc w:val="left"/>
+            </w:pPr>
+            <w:r>
+              <w:t xml:space="preserve">ω</w:t>
+            </w:r>
+            <w:r>
+              <w:rPr>
+                <w:vertAlign w:val="subscript"/>
+              </w:rPr>
+              <w:t xml:space="preserve">s</w:t>
+            </w:r>
+          </w:p>
+        </w:tc>
+        <w:tc>
+          <w:tcPr/>
+          <w:p>
+            <w:pPr>
+              <w:pStyle w:val="Compact"/>
+              <w:jc w:val="left"/>
+            </w:pPr>
+            <w:r>
+              <w:t xml:space="preserve">rad/s</w:t>
+            </w:r>
+          </w:p>
+        </w:tc>
+        <w:tc>
+          <w:tcPr/>
+          <w:p>
+            <w:pPr>
+              <w:pStyle w:val="Compact"/>
+              <w:jc w:val="left"/>
+            </w:pPr>
+            <w:r>
+              <w:t xml:space="preserve">Mission attitude profile (zero for a fixed base)</w:t>
+            </w:r>
+          </w:p>
+        </w:tc>
+      </w:tr>
+      <w:tr>
+        <w:tc>
+          <w:tcPr/>
+          <w:p>
+            <w:pPr>
+              <w:pStyle w:val="Compact"/>
+              <w:jc w:val="left"/>
+            </w:pPr>
+            <w:r>
               <w:t xml:space="preserve">Other speeds of interest</w:t>
             </w:r>
           </w:p>
@@ -9012,7 +9254,7 @@
     </w:p>
     <w:bookmarkEnd w:id="43"/>
     <w:bookmarkEnd w:id="44"/>
-    <w:bookmarkStart w:id="51" w:name="model-equations"/>
+    <w:bookmarkStart w:id="53" w:name="model-equations"/>
     <w:p>
       <w:pPr>
         <w:pStyle w:val="Heading2"/>
@@ -9439,7 +9681,358 @@
         <w:t xml:space="preserve"> </w:t>
       </w:r>
       <w:r>
-        <w:t xml:space="preserve">are the specified balance limits, entered directly or found from Equations (5), (11) and (12). Both loads grow with the square of speed, so doubling the speed quadruples them. Seen from the stationary shaft, each appears on the two sideways axes as a pair of equal sinusoids, 90° apart, as in Equations (45) and (46).</w:t>
+        <w:t xml:space="preserve">are the specified balance limits, entered directly or found from Equations (5), (11) and (12). Both loads grow with the square of speed, so doubling the speed quadruples them.</w:t>
+      </w:r>
+    </w:p>
+    <w:p>
+      <w:pPr>
+        <w:pStyle w:val="BodyText"/>
+      </w:pPr>
+      <w:r>
+        <w:t xml:space="preserve">While the speed is changing, each imbalance also has a tangential part, U</w:t>
+      </w:r>
+      <w:r>
+        <w:rPr>
+          <w:vertAlign w:val="subscript"/>
+        </w:rPr>
+        <w:t xml:space="preserve">s</w:t>
+      </w:r>
+      <w:r>
+        <w:t xml:space="preserve"> </w:t>
+      </w:r>
+      <w:r>
+        <w:t xml:space="preserve">Ω̇ for the force and U</w:t>
+      </w:r>
+      <w:r>
+        <w:rPr>
+          <w:vertAlign w:val="subscript"/>
+        </w:rPr>
+        <w:t xml:space="preserve">d</w:t>
+      </w:r>
+      <w:r>
+        <w:t xml:space="preserve"> </w:t>
+      </w:r>
+      <w:r>
+        <w:t xml:space="preserve">Ω̇ for the moment, at right angles to the radial part. The peak values at the top of a ramp, which are the values carried in the load tables, are therefore:</w:t>
+      </w:r>
+    </w:p>
+    <w:p>
+      <w:pPr>
+        <w:tabs>
+          <w:tab w:val="center" w:pos="4680"/>
+          <w:tab w:val="right" w:pos="9360"/>
+        </w:tabs>
+        <w:spacing w:before="120" w:after="120"/>
+      </w:pPr>
+      <w:r>
+        <w:tab/>
+      </w:r>
+      <m:oMath>
+        <m:sSub>
+          <m:e>
+            <m:r>
+              <m:t>F</m:t>
+            </m:r>
+          </m:e>
+          <m:sub>
+            <m:r>
+              <m:t>w</m:t>
+            </m:r>
+          </m:sub>
+        </m:sSub>
+        <m:r>
+          <m:rPr>
+            <m:sty m:val="p"/>
+          </m:rPr>
+          <m:t>=</m:t>
+        </m:r>
+        <m:sSub>
+          <m:e>
+            <m:r>
+              <m:t>U</m:t>
+            </m:r>
+          </m:e>
+          <m:sub>
+            <m:r>
+              <m:t>s</m:t>
+            </m:r>
+          </m:sub>
+        </m:sSub>
+        <m:rad>
+          <m:radPr>
+            <m:degHide m:val="on"/>
+          </m:radPr>
+          <m:deg/>
+          <m:e>
+            <m:sSubSup>
+              <m:e>
+                <m:r>
+                  <m:t>Ω</m:t>
+                </m:r>
+              </m:e>
+              <m:sub>
+                <m:r>
+                  <m:t>w</m:t>
+                </m:r>
+              </m:sub>
+              <m:sup>
+                <m:r>
+                  <m:t>4</m:t>
+                </m:r>
+              </m:sup>
+            </m:sSubSup>
+            <m:r>
+              <m:rPr>
+                <m:sty m:val="p"/>
+              </m:rPr>
+              <m:t>+</m:t>
+            </m:r>
+            <m:sSubSup>
+              <m:e>
+                <m:acc>
+                  <m:accPr>
+                    <m:chr m:val="̇"/>
+                  </m:accPr>
+                  <m:e>
+                    <m:r>
+                      <m:t>Ω</m:t>
+                    </m:r>
+                  </m:e>
+                </m:acc>
+              </m:e>
+              <m:sub>
+                <m:r>
+                  <m:t>w</m:t>
+                </m:r>
+              </m:sub>
+              <m:sup>
+                <m:r>
+                  <m:t>2</m:t>
+                </m:r>
+              </m:sup>
+            </m:sSubSup>
+          </m:e>
+        </m:rad>
+        <m:r>
+          <m:rPr>
+            <m:sty m:val="p"/>
+          </m:rPr>
+          <m:t>,</m:t>
+        </m:r>
+        <m:r>
+          <m:t>  </m:t>
+        </m:r>
+        <m:sSub>
+          <m:e>
+            <m:r>
+              <m:t>M</m:t>
+            </m:r>
+          </m:e>
+          <m:sub>
+            <m:r>
+              <m:t>w</m:t>
+            </m:r>
+          </m:sub>
+        </m:sSub>
+        <m:r>
+          <m:rPr>
+            <m:sty m:val="p"/>
+          </m:rPr>
+          <m:t>=</m:t>
+        </m:r>
+        <m:sSub>
+          <m:e>
+            <m:r>
+              <m:t>U</m:t>
+            </m:r>
+          </m:e>
+          <m:sub>
+            <m:r>
+              <m:t>d</m:t>
+            </m:r>
+          </m:sub>
+        </m:sSub>
+        <m:rad>
+          <m:radPr>
+            <m:degHide m:val="on"/>
+          </m:radPr>
+          <m:deg/>
+          <m:e>
+            <m:sSubSup>
+              <m:e>
+                <m:r>
+                  <m:t>Ω</m:t>
+                </m:r>
+              </m:e>
+              <m:sub>
+                <m:r>
+                  <m:t>w</m:t>
+                </m:r>
+              </m:sub>
+              <m:sup>
+                <m:r>
+                  <m:t>4</m:t>
+                </m:r>
+              </m:sup>
+            </m:sSubSup>
+            <m:r>
+              <m:rPr>
+                <m:sty m:val="p"/>
+              </m:rPr>
+              <m:t>+</m:t>
+            </m:r>
+            <m:sSubSup>
+              <m:e>
+                <m:acc>
+                  <m:accPr>
+                    <m:chr m:val="̇"/>
+                  </m:accPr>
+                  <m:e>
+                    <m:r>
+                      <m:t>Ω</m:t>
+                    </m:r>
+                  </m:e>
+                </m:acc>
+              </m:e>
+              <m:sub>
+                <m:r>
+                  <m:t>w</m:t>
+                </m:r>
+              </m:sub>
+              <m:sup>
+                <m:r>
+                  <m:t>2</m:t>
+                </m:r>
+              </m:sup>
+            </m:sSubSup>
+          </m:e>
+        </m:rad>
+      </m:oMath>
+      <w:r>
+        <w:tab/>
+        <w:t>(52)</w:t>
+      </w:r>
+    </w:p>
+    <w:p>
+      <w:pPr>
+        <w:pStyle w:val="FirstParagraph"/>
+      </w:pPr>
+      <w:r>
+        <w:t xml:space="preserve">with Ω̇</w:t>
+      </w:r>
+      <w:r>
+        <w:rPr>
+          <w:vertAlign w:val="subscript"/>
+        </w:rPr>
+        <w:t xml:space="preserve">w</w:t>
+      </w:r>
+      <w:r>
+        <w:t xml:space="preserve"> </w:t>
+      </w:r>
+      <w:r>
+        <w:t xml:space="preserve">from Equation (30) for the shorter of the two ramps. At constant speed Ω̇</w:t>
+      </w:r>
+      <w:r>
+        <w:rPr>
+          <w:vertAlign w:val="subscript"/>
+        </w:rPr>
+        <w:t xml:space="preserve">w</w:t>
+      </w:r>
+      <w:r>
+        <w:t xml:space="preserve"> </w:t>
+      </w:r>
+      <w:r>
+        <w:t xml:space="preserve">is zero and these reduce to Equations (50) and (51).</w:t>
+      </w:r>
+    </w:p>
+    <w:p>
+      <w:pPr>
+        <w:pStyle w:val="BodyText"/>
+      </w:pPr>
+      <w:r>
+        <w:rPr>
+          <w:bCs/>
+          <w:b/>
+        </w:rPr>
+        <w:t xml:space="preserve">Higher imbalance harmonics.</w:t>
+      </w:r>
+      <w:r>
+        <w:t xml:space="preserve"> </w:t>
+      </w:r>
+      <w:r>
+        <w:t xml:space="preserve">Misalignment, runout and fits can produce imbalance-like loads at whole multiples h of the running speed. When coefficients are available, from a specification or a test, each harmonic h adds a lateral force C</w:t>
+      </w:r>
+      <w:r>
+        <w:rPr>
+          <w:vertAlign w:val="subscript"/>
+        </w:rPr>
+        <w:t xml:space="preserve">f</w:t>
+      </w:r>
+      <w:r>
+        <w:t xml:space="preserve"> </w:t>
+      </w:r>
+      <w:r>
+        <w:t xml:space="preserve">Ω</w:t>
+      </w:r>
+      <w:r>
+        <w:rPr>
+          <w:vertAlign w:val="subscript"/>
+        </w:rPr>
+        <w:t xml:space="preserve">w</w:t>
+      </w:r>
+      <w:r>
+        <w:t xml:space="preserve">² and a rocking moment C</w:t>
+      </w:r>
+      <w:r>
+        <w:rPr>
+          <w:vertAlign w:val="subscript"/>
+        </w:rPr>
+        <w:t xml:space="preserve">m</w:t>
+      </w:r>
+      <w:r>
+        <w:t xml:space="preserve"> </w:t>
+      </w:r>
+      <w:r>
+        <w:t xml:space="preserve">Ω</w:t>
+      </w:r>
+      <w:r>
+        <w:rPr>
+          <w:vertAlign w:val="subscript"/>
+        </w:rPr>
+        <w:t xml:space="preserve">w</w:t>
+      </w:r>
+      <w:r>
+        <w:t xml:space="preserve">² at frequency h f</w:t>
+      </w:r>
+      <w:r>
+        <w:rPr>
+          <w:vertAlign w:val="subscript"/>
+        </w:rPr>
+        <w:t xml:space="preserve">r</w:t>
+      </w:r>
+      <w:r>
+        <w:t xml:space="preserve">, in the form of Equation (40). These are added to F</w:t>
+      </w:r>
+      <w:r>
+        <w:rPr>
+          <w:vertAlign w:val="subscript"/>
+        </w:rPr>
+        <w:t xml:space="preserve">w</w:t>
+      </w:r>
+      <w:r>
+        <w:t xml:space="preserve"> </w:t>
+      </w:r>
+      <w:r>
+        <w:t xml:space="preserve">and M</w:t>
+      </w:r>
+      <w:r>
+        <w:rPr>
+          <w:vertAlign w:val="subscript"/>
+        </w:rPr>
+        <w:t xml:space="preserve">w</w:t>
+      </w:r>
+      <w:r>
+        <w:t xml:space="preserve">. Seen from the stationary shaft, each appears on the two sideways axes as a pair of equal sinusoids, 90° apart, as in Equations (45) and (46).</w:t>
       </w:r>
     </w:p>
     <w:bookmarkEnd w:id="46"/>
@@ -9635,7 +10228,7 @@
       </m:oMath>
       <w:r>
         <w:tab/>
-        <w:t>(52)</w:t>
+        <w:t>(53)</w:t>
       </w:r>
     </w:p>
     <w:p>
@@ -9794,7 +10387,7 @@
       </m:oMath>
       <w:r>
         <w:tab/>
-        <w:t>(53)</w:t>
+        <w:t>(54)</w:t>
       </w:r>
     </w:p>
     <w:p>
@@ -9934,7 +10527,7 @@
       </m:oMath>
       <w:r>
         <w:tab/>
-        <w:t>(54)</w:t>
+        <w:t>(55)</w:t>
       </w:r>
     </w:p>
     <w:p>
@@ -10072,7 +10665,7 @@
       </m:oMath>
       <w:r>
         <w:tab/>
-        <w:t>(55)</w:t>
+        <w:t>(56)</w:t>
       </w:r>
     </w:p>
     <w:p>
@@ -10088,19 +10681,7 @@
         <w:pStyle w:val="BodyText"/>
       </w:pPr>
       <w:r>
-        <w:t xml:space="preserve">If the support structure rotated, each part would also apply a gyroscopic moment, Equation (36). Because all shafts are stationary, ω</w:t>
-      </w:r>
-      <w:r>
-        <w:rPr>
-          <w:vertAlign w:val="subscript"/>
-        </w:rPr>
-        <w:t xml:space="preserve">s</w:t>
-      </w:r>
-      <w:r>
-        <w:t xml:space="preserve"> </w:t>
-      </w:r>
-      <w:r>
-        <w:t xml:space="preserve">is zero and this moment does not arise. The tangential imbalance force of Equation (31) is also neglected, since it is under 1% of the main force for the ramp times used.</w:t>
+        <w:t xml:space="preserve">The tangential imbalance term is included through Equation (52).</w:t>
       </w:r>
     </w:p>
     <w:bookmarkEnd w:id="48"/>
@@ -10364,7 +10945,7 @@
       </m:oMath>
       <w:r>
         <w:tab/>
-        <w:t>(56)</w:t>
+        <w:t>(57)</w:t>
       </w:r>
     </w:p>
     <w:p>
@@ -11432,7 +12013,7 @@
       </m:oMath>
       <w:r>
         <w:tab/>
-        <w:t>(57)</w:t>
+        <w:t>(58)</w:t>
       </w:r>
     </w:p>
     <w:p>
@@ -11591,7 +12172,7 @@
       </m:oMath>
       <w:r>
         <w:tab/>
-        <w:t>(58)</w:t>
+        <w:t>(59)</w:t>
       </w:r>
     </w:p>
     <w:p>
@@ -11603,13 +12184,13 @@
       </w:r>
     </w:p>
     <w:bookmarkEnd w:id="49"/>
-    <w:bookmarkStart w:id="50" w:name="assembly-totals"/>
+    <w:bookmarkStart w:id="50" w:name="motor-torque-ripple-and-cogging"/>
     <w:p>
       <w:pPr>
         <w:pStyle w:val="Heading3"/>
       </w:pPr>
       <w:r>
-        <w:t xml:space="preserve">6.6 Assembly totals</w:t>
+        <w:t xml:space="preserve">6.6 Motor torque ripple and cogging</w:t>
       </w:r>
     </w:p>
     <w:p>
@@ -11617,7 +12198,544 @@
         <w:pStyle w:val="FirstParagraph"/>
       </w:pPr>
       <w:r>
-        <w:t xml:space="preserve">The six components are summed over the arm, both wheels and all bearings, following Equation (39). Forces and rocking moments are added as peak values. The twist is added with its sign, and its magnitude is reported as the net assembly twist. Loads at any other operating point follow from Equation (38), using the arm speed, since the wheels track the arm at a fixed ratio.</w:t>
+        <w:t xml:space="preserve">When the motor data is available, each motor adds torque lines about its spin axis. For a three-phase motor with p pole pairs and N</w:t>
+      </w:r>
+      <w:r>
+        <w:rPr>
+          <w:vertAlign w:val="subscript"/>
+        </w:rPr>
+        <w:t xml:space="preserve">s</w:t>
+      </w:r>
+      <w:r>
+        <w:t xml:space="preserve"> </w:t>
+      </w:r>
+      <w:r>
+        <w:t xml:space="preserve">slots, ripple lines fall at 6 n p f</w:t>
+      </w:r>
+      <w:r>
+        <w:rPr>
+          <w:vertAlign w:val="subscript"/>
+        </w:rPr>
+        <w:t xml:space="preserve">r</w:t>
+      </w:r>
+      <w:r>
+        <w:t xml:space="preserve"> </w:t>
+      </w:r>
+      <w:r>
+        <w:t xml:space="preserve">and cogging lines at n LCM(N</w:t>
+      </w:r>
+      <w:r>
+        <w:rPr>
+          <w:vertAlign w:val="subscript"/>
+        </w:rPr>
+        <w:t xml:space="preserve">s</w:t>
+      </w:r>
+      <w:r>
+        <w:t xml:space="preserve">, 2p) f</w:t>
+      </w:r>
+      <w:r>
+        <w:rPr>
+          <w:vertAlign w:val="subscript"/>
+        </w:rPr>
+        <w:t xml:space="preserve">r</w:t>
+      </w:r>
+      <w:r>
+        <w:t xml:space="preserve">, Equations (32) and (33), with amplitudes T</w:t>
+      </w:r>
+      <w:r>
+        <w:rPr>
+          <w:vertAlign w:val="subscript"/>
+        </w:rPr>
+        <w:t xml:space="preserve">ripple,n</w:t>
+      </w:r>
+      <w:r>
+        <w:t xml:space="preserve"> </w:t>
+      </w:r>
+      <w:r>
+        <w:t xml:space="preserve">and T</w:t>
+      </w:r>
+      <w:r>
+        <w:rPr>
+          <w:vertAlign w:val="subscript"/>
+        </w:rPr>
+        <w:t xml:space="preserve">cog,n</w:t>
+      </w:r>
+      <w:r>
+        <w:t xml:space="preserve"> </w:t>
+      </w:r>
+      <w:r>
+        <w:t xml:space="preserve">from the datasheet or a test. A slotless motor has no cogging. The stator reaction passes into the structure, so each amplitude is applied as a torque about z, with no reduction for the speed control loop:</w:t>
+      </w:r>
+    </w:p>
+    <w:p>
+      <w:pPr>
+        <w:tabs>
+          <w:tab w:val="center" w:pos="4680"/>
+          <w:tab w:val="right" w:pos="9360"/>
+        </w:tabs>
+        <w:spacing w:before="120" w:after="120"/>
+      </w:pPr>
+      <w:r>
+        <w:tab/>
+      </w:r>
+      <m:oMath>
+        <m:sSub>
+          <m:e>
+            <m:r>
+              <m:t>M</m:t>
+            </m:r>
+          </m:e>
+          <m:sub>
+            <m:r>
+              <m:t>z</m:t>
+            </m:r>
+            <m:r>
+              <m:rPr>
+                <m:sty m:val="p"/>
+              </m:rPr>
+              <m:t>,</m:t>
+            </m:r>
+            <m:r>
+              <m:t>m</m:t>
+            </m:r>
+            <m:r>
+              <m:t>o</m:t>
+            </m:r>
+            <m:r>
+              <m:t>t</m:t>
+            </m:r>
+            <m:r>
+              <m:t>o</m:t>
+            </m:r>
+            <m:r>
+              <m:t>r</m:t>
+            </m:r>
+          </m:sub>
+        </m:sSub>
+        <m:r>
+          <m:rPr>
+            <m:sty m:val="p"/>
+          </m:rPr>
+          <m:t>=</m:t>
+        </m:r>
+        <m:nary>
+          <m:naryPr>
+            <m:chr m:val="∑"/>
+            <m:limLoc m:val="undOvr"/>
+            <m:subHide m:val="off"/>
+            <m:supHide m:val="on"/>
+          </m:naryPr>
+          <m:sub>
+            <m:r>
+              <m:t>n</m:t>
+            </m:r>
+          </m:sub>
+          <m:sup>
+            <m:r>
+              <m:t>​</m:t>
+            </m:r>
+          </m:sup>
+          <m:e>
+            <m:sSub>
+              <m:e>
+                <m:r>
+                  <m:t>T</m:t>
+                </m:r>
+              </m:e>
+              <m:sub>
+                <m:r>
+                  <m:rPr>
+                    <m:sty m:val="p"/>
+                  </m:rPr>
+                  <m:t>r</m:t>
+                </m:r>
+                <m:r>
+                  <m:rPr>
+                    <m:sty m:val="p"/>
+                  </m:rPr>
+                  <m:t>i</m:t>
+                </m:r>
+                <m:r>
+                  <m:rPr>
+                    <m:sty m:val="p"/>
+                  </m:rPr>
+                  <m:t>p</m:t>
+                </m:r>
+                <m:r>
+                  <m:rPr>
+                    <m:sty m:val="p"/>
+                  </m:rPr>
+                  <m:t>p</m:t>
+                </m:r>
+                <m:r>
+                  <m:rPr>
+                    <m:sty m:val="p"/>
+                  </m:rPr>
+                  <m:t>l</m:t>
+                </m:r>
+                <m:r>
+                  <m:rPr>
+                    <m:sty m:val="p"/>
+                  </m:rPr>
+                  <m:t>e</m:t>
+                </m:r>
+                <m:r>
+                  <m:rPr>
+                    <m:sty m:val="p"/>
+                  </m:rPr>
+                  <m:t>,</m:t>
+                </m:r>
+                <m:r>
+                  <m:t>n</m:t>
+                </m:r>
+              </m:sub>
+            </m:sSub>
+          </m:e>
+        </m:nary>
+        <m:r>
+          <m:rPr>
+            <m:sty m:val="p"/>
+          </m:rPr>
+          <m:t>+</m:t>
+        </m:r>
+        <m:nary>
+          <m:naryPr>
+            <m:chr m:val="∑"/>
+            <m:limLoc m:val="undOvr"/>
+            <m:subHide m:val="off"/>
+            <m:supHide m:val="on"/>
+          </m:naryPr>
+          <m:sub>
+            <m:r>
+              <m:t>n</m:t>
+            </m:r>
+          </m:sub>
+          <m:sup>
+            <m:r>
+              <m:t>​</m:t>
+            </m:r>
+          </m:sup>
+          <m:e>
+            <m:sSub>
+              <m:e>
+                <m:r>
+                  <m:t>T</m:t>
+                </m:r>
+              </m:e>
+              <m:sub>
+                <m:r>
+                  <m:rPr>
+                    <m:sty m:val="p"/>
+                  </m:rPr>
+                  <m:t>c</m:t>
+                </m:r>
+                <m:r>
+                  <m:rPr>
+                    <m:sty m:val="p"/>
+                  </m:rPr>
+                  <m:t>o</m:t>
+                </m:r>
+                <m:r>
+                  <m:rPr>
+                    <m:sty m:val="p"/>
+                  </m:rPr>
+                  <m:t>g</m:t>
+                </m:r>
+                <m:r>
+                  <m:rPr>
+                    <m:sty m:val="p"/>
+                  </m:rPr>
+                  <m:t>,</m:t>
+                </m:r>
+                <m:r>
+                  <m:t>n</m:t>
+                </m:r>
+              </m:sub>
+            </m:sSub>
+          </m:e>
+        </m:nary>
+      </m:oMath>
+      <w:r>
+        <w:tab/>
+        <w:t>(60)</w:t>
+      </w:r>
+    </w:p>
+    <w:p>
+      <w:pPr>
+        <w:pStyle w:val="FirstParagraph"/>
+      </w:pPr>
+      <w:r>
+        <w:t xml:space="preserve">Until the motor data is entered, this source is reported as not included.</w:t>
+      </w:r>
+    </w:p>
+    <w:bookmarkEnd w:id="50"/>
+    <w:bookmarkStart w:id="51" w:name="gyroscopic-moment"/>
+    <w:p>
+      <w:pPr>
+        <w:pStyle w:val="Heading3"/>
+      </w:pPr>
+      <w:r>
+        <w:t xml:space="preserve">6.7 Gyroscopic moment</w:t>
+      </w:r>
+    </w:p>
+    <w:p>
+      <w:pPr>
+        <w:pStyle w:val="FirstParagraph"/>
+      </w:pPr>
+      <w:r>
+        <w:t xml:space="preserve">The stored momentum of each part is H</w:t>
+      </w:r>
+      <w:r>
+        <w:rPr>
+          <w:vertAlign w:val="subscript"/>
+        </w:rPr>
+        <w:t xml:space="preserve">i</w:t>
+      </w:r>
+      <w:r>
+        <w:t xml:space="preserve"> </w:t>
+      </w:r>
+      <w:r>
+        <w:t xml:space="preserve">= s</w:t>
+      </w:r>
+      <w:r>
+        <w:rPr>
+          <w:vertAlign w:val="subscript"/>
+        </w:rPr>
+        <w:t xml:space="preserve">i</w:t>
+      </w:r>
+      <w:r>
+        <w:t xml:space="preserve"> </w:t>
+      </w:r>
+      <w:r>
+        <w:t xml:space="preserve">I</w:t>
+      </w:r>
+      <w:r>
+        <w:rPr>
+          <w:vertAlign w:val="subscript"/>
+        </w:rPr>
+        <w:t xml:space="preserve">zz,i</w:t>
+      </w:r>
+      <w:r>
+        <w:t xml:space="preserve"> </w:t>
+      </w:r>
+      <w:r>
+        <w:t xml:space="preserve">Ω</w:t>
+      </w:r>
+      <w:r>
+        <w:rPr>
+          <w:vertAlign w:val="subscript"/>
+        </w:rPr>
+        <w:t xml:space="preserve">i</w:t>
+      </w:r>
+      <w:r>
+        <w:t xml:space="preserve"> </w:t>
+      </w:r>
+      <w:r>
+        <w:t xml:space="preserve">along z, where s</w:t>
+      </w:r>
+      <w:r>
+        <w:rPr>
+          <w:vertAlign w:val="subscript"/>
+        </w:rPr>
+        <w:t xml:space="preserve">i</w:t>
+      </w:r>
+      <w:r>
+        <w:t xml:space="preserve"> </w:t>
+      </w:r>
+      <w:r>
+        <w:t xml:space="preserve">= ±1 is its spin direction. If the supporting spacecraft rotates at ω</w:t>
+      </w:r>
+      <w:r>
+        <w:rPr>
+          <w:vertAlign w:val="subscript"/>
+        </w:rPr>
+        <w:t xml:space="preserve">s</w:t>
+      </w:r>
+      <w:r>
+        <w:t xml:space="preserve">, the assembly applies the moment of Equation (36) using the total momentum:</w:t>
+      </w:r>
+    </w:p>
+    <w:p>
+      <w:pPr>
+        <w:tabs>
+          <w:tab w:val="center" w:pos="4680"/>
+          <w:tab w:val="right" w:pos="9360"/>
+        </w:tabs>
+        <w:spacing w:before="120" w:after="120"/>
+      </w:pPr>
+      <w:r>
+        <w:tab/>
+      </w:r>
+      <m:oMath>
+        <m:sSub>
+          <m:e>
+            <m:r>
+              <m:rPr>
+                <m:sty m:val="b"/>
+              </m:rPr>
+              <m:t>M</m:t>
+            </m:r>
+          </m:e>
+          <m:sub>
+            <m:r>
+              <m:rPr>
+                <m:sty m:val="p"/>
+              </m:rPr>
+              <m:t>g</m:t>
+            </m:r>
+            <m:r>
+              <m:rPr>
+                <m:sty m:val="p"/>
+              </m:rPr>
+              <m:t>y</m:t>
+            </m:r>
+            <m:r>
+              <m:rPr>
+                <m:sty m:val="p"/>
+              </m:rPr>
+              <m:t>r</m:t>
+            </m:r>
+            <m:r>
+              <m:rPr>
+                <m:sty m:val="p"/>
+              </m:rPr>
+              <m:t>o</m:t>
+            </m:r>
+          </m:sub>
+        </m:sSub>
+        <m:r>
+          <m:rPr>
+            <m:sty m:val="p"/>
+          </m:rPr>
+          <m:t>=</m:t>
+        </m:r>
+        <m:r>
+          <m:rPr>
+            <m:sty m:val="p"/>
+          </m:rPr>
+          <m:t>−</m:t>
+        </m:r>
+        <m:r>
+          <m:t> </m:t>
+        </m:r>
+        <m:sSub>
+          <m:e>
+            <m:r>
+              <m:rPr>
+                <m:sty m:val="b"/>
+              </m:rPr>
+              <m:t>ω</m:t>
+            </m:r>
+          </m:e>
+          <m:sub>
+            <m:r>
+              <m:t>s</m:t>
+            </m:r>
+          </m:sub>
+        </m:sSub>
+        <m:r>
+          <m:rPr>
+            <m:sty m:val="p"/>
+          </m:rPr>
+          <m:t>×</m:t>
+        </m:r>
+        <m:d>
+          <m:dPr>
+            <m:begChr m:val="("/>
+            <m:endChr m:val=")"/>
+            <m:sepChr m:val=""/>
+            <m:grow/>
+          </m:dPr>
+          <m:e>
+            <m:nary>
+              <m:naryPr>
+                <m:chr m:val="∑"/>
+                <m:limLoc m:val="undOvr"/>
+                <m:subHide m:val="off"/>
+                <m:supHide m:val="on"/>
+              </m:naryPr>
+              <m:sub>
+                <m:r>
+                  <m:t>i</m:t>
+                </m:r>
+              </m:sub>
+              <m:sup>
+                <m:r>
+                  <m:t>​</m:t>
+                </m:r>
+              </m:sup>
+              <m:e>
+                <m:sSub>
+                  <m:e>
+                    <m:r>
+                      <m:t>H</m:t>
+                    </m:r>
+                  </m:e>
+                  <m:sub>
+                    <m:r>
+                      <m:t>i</m:t>
+                    </m:r>
+                  </m:sub>
+                </m:sSub>
+              </m:e>
+            </m:nary>
+          </m:e>
+        </m:d>
+        <m:acc>
+          <m:accPr>
+            <m:chr m:val="̂"/>
+          </m:accPr>
+          <m:e>
+            <m:r>
+              <m:rPr>
+                <m:sty m:val="b"/>
+              </m:rPr>
+              <m:t>z</m:t>
+            </m:r>
+          </m:e>
+        </m:acc>
+      </m:oMath>
+      <w:r>
+        <w:tab/>
+        <w:t>(61)</w:t>
+      </w:r>
+    </w:p>
+    <w:p>
+      <w:pPr>
+        <w:pStyle w:val="FirstParagraph"/>
+      </w:pPr>
+      <w:r>
+        <w:t xml:space="preserve">This moment is not rotating; it lies in the x–y plane and is added to Mx and My. With a fixed base, ω</w:t>
+      </w:r>
+      <w:r>
+        <w:rPr>
+          <w:vertAlign w:val="subscript"/>
+        </w:rPr>
+        <w:t xml:space="preserve">s</w:t>
+      </w:r>
+      <w:r>
+        <w:t xml:space="preserve"> </w:t>
+      </w:r>
+      <w:r>
+        <w:t xml:space="preserve">= 0 and it vanishes. Because the wheels are sized to cancel the arm’s momentum, the total H, and with it the gyroscopic moment, is small even when the spacecraft rotates.</w:t>
+      </w:r>
+    </w:p>
+    <w:bookmarkEnd w:id="51"/>
+    <w:bookmarkStart w:id="52" w:name="assembly-totals"/>
+    <w:p>
+      <w:pPr>
+        <w:pStyle w:val="Heading3"/>
+      </w:pPr>
+      <w:r>
+        <w:t xml:space="preserve">6.8 Assembly totals</w:t>
+      </w:r>
+    </w:p>
+    <w:p>
+      <w:pPr>
+        <w:pStyle w:val="FirstParagraph"/>
+      </w:pPr>
+      <w:r>
+        <w:t xml:space="preserve">The six components are summed over the arm, both wheels, all bearings, the motors and the gyroscopic moment, following Equation (39). Forces and rocking moments are added as peak values. The twist is added with its sign, and its magnitude is reported as the net assembly twist. The wheels track the arm at a fixed speed ratio, so a single arm speed defines each operating point.</w:t>
       </w:r>
     </w:p>
     <w:tbl>
@@ -11628,9 +12746,11 @@
         <w:jc w:val="start"/>
       </w:tblPr>
       <w:tblGrid>
-        <w:gridCol w:w="2640"/>
-        <w:gridCol w:w="2640"/>
-        <w:gridCol w:w="2640"/>
+        <w:gridCol w:w="1584"/>
+        <w:gridCol w:w="1584"/>
+        <w:gridCol w:w="1584"/>
+        <w:gridCol w:w="1584"/>
+        <w:gridCol w:w="1584"/>
       </w:tblGrid>
       <w:tr>
         <w:trPr>
@@ -11672,6 +12792,30 @@
             </w:r>
           </w:p>
         </w:tc>
+        <w:tc>
+          <w:tcPr/>
+          <w:p>
+            <w:pPr>
+              <w:pStyle w:val="Compact"/>
+              <w:jc w:val="left"/>
+            </w:pPr>
+            <w:r>
+              <w:t xml:space="preserve">Motors</w:t>
+            </w:r>
+          </w:p>
+        </w:tc>
+        <w:tc>
+          <w:tcPr/>
+          <w:p>
+            <w:pPr>
+              <w:pStyle w:val="Compact"/>
+              <w:jc w:val="left"/>
+            </w:pPr>
+            <w:r>
+              <w:t xml:space="preserve">Gyroscopic</w:t>
+            </w:r>
+          </w:p>
+        </w:tc>
       </w:tr>
       <w:tr>
         <w:tc>
@@ -11703,7 +12847,10 @@
               <w:t xml:space="preserve">w</w:t>
             </w:r>
             <w:r>
-              <w:t xml:space="preserve">, Equation (50)</w:t>
+              <w:t xml:space="preserve"> </w:t>
+            </w:r>
+            <w:r>
+              <w:t xml:space="preserve">with harmonics, Equation (52)</w:t>
             </w:r>
           </w:p>
         </w:tc>
@@ -11724,7 +12871,31 @@
               <w:t xml:space="preserve">lat,brg</w:t>
             </w:r>
             <w:r>
-              <w:t xml:space="preserve">, Equation (57)</w:t>
+              <w:t xml:space="preserve">, Equation (58)</w:t>
+            </w:r>
+          </w:p>
+        </w:tc>
+        <w:tc>
+          <w:tcPr/>
+          <w:p>
+            <w:pPr>
+              <w:pStyle w:val="Compact"/>
+              <w:jc w:val="left"/>
+            </w:pPr>
+            <w:r>
+              <w:t xml:space="preserve">0</w:t>
+            </w:r>
+          </w:p>
+        </w:tc>
+        <w:tc>
+          <w:tcPr/>
+          <w:p>
+            <w:pPr>
+              <w:pStyle w:val="Compact"/>
+              <w:jc w:val="left"/>
+            </w:pPr>
+            <w:r>
+              <w:t xml:space="preserve">0</w:t>
             </w:r>
           </w:p>
         </w:tc>
@@ -11771,7 +12942,31 @@
               <w:t xml:space="preserve">ax,brg</w:t>
             </w:r>
             <w:r>
-              <w:t xml:space="preserve">, Equation (57)</w:t>
+              <w:t xml:space="preserve">, Equation (58)</w:t>
+            </w:r>
+          </w:p>
+        </w:tc>
+        <w:tc>
+          <w:tcPr/>
+          <w:p>
+            <w:pPr>
+              <w:pStyle w:val="Compact"/>
+              <w:jc w:val="left"/>
+            </w:pPr>
+            <w:r>
+              <w:t xml:space="preserve">0</w:t>
+            </w:r>
+          </w:p>
+        </w:tc>
+        <w:tc>
+          <w:tcPr/>
+          <w:p>
+            <w:pPr>
+              <w:pStyle w:val="Compact"/>
+              <w:jc w:val="left"/>
+            </w:pPr>
+            <w:r>
+              <w:t xml:space="preserve">0</w:t>
             </w:r>
           </w:p>
         </w:tc>
@@ -11821,7 +13016,7 @@
               <w:t xml:space="preserve"> </w:t>
             </w:r>
             <w:r>
-              <w:t xml:space="preserve">L, Equation (53)</w:t>
+              <w:t xml:space="preserve">L, Equation (54)</w:t>
             </w:r>
           </w:p>
         </w:tc>
@@ -11845,7 +13040,31 @@
               <w:t xml:space="preserve"> </w:t>
             </w:r>
             <w:r>
-              <w:t xml:space="preserve">L, Equation (58)</w:t>
+              <w:t xml:space="preserve">L, Equation (59)</w:t>
+            </w:r>
+          </w:p>
+        </w:tc>
+        <w:tc>
+          <w:tcPr/>
+          <w:p>
+            <w:pPr>
+              <w:pStyle w:val="Compact"/>
+              <w:jc w:val="left"/>
+            </w:pPr>
+            <w:r>
+              <w:t xml:space="preserve">0</w:t>
+            </w:r>
+          </w:p>
+        </w:tc>
+        <w:tc>
+          <w:tcPr/>
+          <w:p>
+            <w:pPr>
+              <w:pStyle w:val="Compact"/>
+              <w:jc w:val="left"/>
+            </w:pPr>
+            <w:r>
+              <w:t xml:space="preserve">Equation (61)</w:t>
             </w:r>
           </w:p>
         </w:tc>
@@ -11892,7 +13111,7 @@
               <w:t xml:space="preserve">down</w:t>
             </w:r>
             <w:r>
-              <w:t xml:space="preserve">, Equations (54) and (55)</w:t>
+              <w:t xml:space="preserve">, Equations (55) and (56), summed with sign</w:t>
             </w:r>
           </w:p>
         </w:tc>
@@ -11905,14 +13124,46 @@
             </w:pPr>
             <w:r>
               <w:t xml:space="preserve">0, since bearing drag is reacted inside the assembly by the motor</w:t>
+            </w:r>
+          </w:p>
+        </w:tc>
+        <w:tc>
+          <w:tcPr/>
+          <w:p>
+            <w:pPr>
+              <w:pStyle w:val="Compact"/>
+              <w:jc w:val="left"/>
+            </w:pPr>
+            <w:r>
+              <w:t xml:space="preserve">Equation (60)</w:t>
+            </w:r>
+          </w:p>
+        </w:tc>
+        <w:tc>
+          <w:tcPr/>
+          <w:p>
+            <w:pPr>
+              <w:pStyle w:val="Compact"/>
+              <w:jc w:val="left"/>
+            </w:pPr>
+            <w:r>
+              <w:t xml:space="preserve">0</w:t>
             </w:r>
           </w:p>
         </w:tc>
       </w:tr>
     </w:tbl>
-    <w:bookmarkEnd w:id="50"/>
-    <w:bookmarkEnd w:id="51"/>
-    <w:bookmarkStart w:id="63" w:name="analysis-method"/>
+    <w:p>
+      <w:pPr>
+        <w:pStyle w:val="BodyText"/>
+      </w:pPr>
+      <w:r>
+        <w:t xml:space="preserve">The net twist of the three parts is added to the motor ripple and cogging to give the total Mz. Loads at other constant speeds are found with the imbalance terms scaled by Equation (38), the bearing lines recalculated at the new frequencies, and the gyroscopic moment scaled linearly with speed, since H grows with speed.</w:t>
+      </w:r>
+    </w:p>
+    <w:bookmarkEnd w:id="52"/>
+    <w:bookmarkEnd w:id="53"/>
+    <w:bookmarkStart w:id="65" w:name="analysis-method"/>
     <w:p>
       <w:pPr>
         <w:pStyle w:val="Heading2"/>
@@ -11921,7 +13172,7 @@
         <w:t xml:space="preserve">7. Analysis Method</w:t>
       </w:r>
     </w:p>
-    <w:bookmarkStart w:id="52" w:name="overall-approach"/>
+    <w:bookmarkStart w:id="54" w:name="overall-approach"/>
     <w:p>
       <w:pPr>
         <w:pStyle w:val="Heading3"/>
@@ -11959,11 +13210,11 @@
         <w:pStyle w:val="BodyText"/>
       </w:pPr>
       <w:r>
-        <w:t xml:space="preserve">Of the sources described in Section 2, the method includes those that can be estimated from the design data available: static imbalance, dynamic imbalance, motor reaction torque and the bearings. The remaining sources are left out for specific reasons. Motor ripple and cogging need the motor pole and slot counts and ripple data, which were not yet available. Broadband noise has no deterministic model and can only be measured. Gyroscopic moments are zero because all three shafts are stationary, and even if the assembly were carried on a moving base, the counter-rotating wheels are sized to bring its total angular momentum close to zero, as in Equation (37). Each of these can be added later without changing the rest of the method.</w:t>
-      </w:r>
-    </w:p>
-    <w:bookmarkEnd w:id="52"/>
-    <w:bookmarkStart w:id="53" w:name="Xe8372f8e242c03dd3b138f24a79bf6b1d10ef27"/>
+        <w:t xml:space="preserve">The method is built around the full calculation first, with every input it needs defined in advance, so that values can be entered as they become available. It includes every source of Section 2 that has a deterministic model: static and couple imbalance with their acceleration terms, higher imbalance harmonics, motor reaction torque, the tapered roller bearings, motor torque ripple and cogging, and the gyroscopic moment from motion of the spacecraft. Sources whose data has not yet been entered, such as motor ripple or imbalance harmonics, are reported as not included rather than estimated. Broadband noise is the one source left out entirely, because it has no deterministic model and can only be measured.</w:t>
+      </w:r>
+    </w:p>
+    <w:bookmarkEnd w:id="54"/>
+    <w:bookmarkStart w:id="55" w:name="Xe8372f8e242c03dd3b138f24a79bf6b1d10ef27"/>
     <w:p>
       <w:pPr>
         <w:pStyle w:val="Heading3"/>
@@ -11992,8 +13243,8 @@
         <w:t xml:space="preserve">directly, from the eccentricity with Equation (5), or from a balance grade with Equation (11). The lateral force at maximum speed follows from Equation (50). This force rotates with the part. It appears at the reference point as Fx and Fy, each with the same peak value, reached a quarter of a revolution apart. It produces no axial force. Whichever form is used, the rest of the method is unchanged.</w:t>
       </w:r>
     </w:p>
-    <w:bookmarkEnd w:id="53"/>
-    <w:bookmarkStart w:id="54" w:name="X4ac1a931d712e4c778447378e5f7b92ad9218e1"/>
+    <w:bookmarkEnd w:id="55"/>
+    <w:bookmarkStart w:id="56" w:name="X4ac1a931d712e4c778447378e5f7b92ad9218e1"/>
     <w:p>
       <w:pPr>
         <w:pStyle w:val="Heading3"/>
@@ -12030,8 +13281,8 @@
         <w:t xml:space="preserve">= M / Ω².</w:t>
       </w:r>
     </w:p>
-    <w:bookmarkEnd w:id="54"/>
-    <w:bookmarkStart w:id="55" w:name="moments-at-the-reference-point-1"/>
+    <w:bookmarkEnd w:id="56"/>
+    <w:bookmarkStart w:id="57" w:name="moments-at-the-reference-point-1"/>
     <w:p>
       <w:pPr>
         <w:pStyle w:val="Heading3"/>
@@ -12045,11 +13296,11 @@
         <w:pStyle w:val="FirstParagraph"/>
       </w:pPr>
       <w:r>
-        <w:t xml:space="preserve">Each part’s loads are moved from its center of mass to the reference point in a single step, using Equation (52), so that no lever arm is counted twice. Moving the reference point changes the moments but not the forces, which lets the same calculation report loads at whichever interface the structures team needs.</w:t>
-      </w:r>
-    </w:p>
-    <w:bookmarkEnd w:id="55"/>
-    <w:bookmarkStart w:id="56" w:name="twist-during-spin-up-and-spin-down"/>
+        <w:t xml:space="preserve">Each part’s loads are moved from its center of mass to the reference point in a single step, using Equation (53), so that no lever arm is counted twice. Moving the reference point changes the moments but not the forces, which lets the same calculation report loads at whichever interface the structures team needs.</w:t>
+      </w:r>
+    </w:p>
+    <w:bookmarkEnd w:id="57"/>
+    <w:bookmarkStart w:id="58" w:name="twist-during-spin-up-and-spin-down"/>
     <w:p>
       <w:pPr>
         <w:pStyle w:val="Heading3"/>
@@ -12063,11 +13314,11 @@
         <w:pStyle w:val="FirstParagraph"/>
       </w:pPr>
       <w:r>
-        <w:t xml:space="preserve">The twist about the shaft was calculated separately for spin-up and spin-down, Equations (54) and (55), because the two ramps can have different durations. The load tables carry the larger of the two values for each part. When the twists of all three parts are added with their signs, the counter-rotating wheels largely cancel the arm, which is the purpose of the wheels. The net value is reported as the assembly’s twist, but each motor mount still carries its own full torque, and those values are reported separately so that the individual mounts can be checked.</w:t>
-      </w:r>
-    </w:p>
-    <w:bookmarkEnd w:id="56"/>
-    <w:bookmarkStart w:id="57" w:name="bearings"/>
+        <w:t xml:space="preserve">The twist about the shaft was calculated separately for spin-up and spin-down, Equations (55) and (56), because the two ramps can have different durations. The load tables carry the larger of the two values for each part. When the twists of all three parts are added with their signs, the counter-rotating wheels largely cancel the arm, which is the purpose of the wheels. The net value is reported as the assembly’s twist, but each motor mount still carries its own full torque, and those values are reported separately so that the individual mounts can be checked.</w:t>
+      </w:r>
+    </w:p>
+    <w:bookmarkEnd w:id="58"/>
+    <w:bookmarkStart w:id="59" w:name="bearings"/>
     <w:p>
       <w:pPr>
         <w:pStyle w:val="Heading3"/>
@@ -12100,8 +13351,8 @@
         <w:t xml:space="preserve">This makes the bearing loads traceable: every line can be followed back to a specific imperfection on a specific bearing, and the effect of a tighter tolerance class or a higher preload can be seen directly. Its accuracy rests on the imperfection amplitudes. Precision-class tolerances give a defensible starting value; inspection data on the actual bearings, or supplier vibration data, should replace them when available.</w:t>
       </w:r>
     </w:p>
-    <w:bookmarkEnd w:id="57"/>
-    <w:bookmarkStart w:id="58" w:name="how-the-method-was-developed"/>
+    <w:bookmarkEnd w:id="59"/>
+    <w:bookmarkStart w:id="60" w:name="how-the-method-was-developed"/>
     <w:p>
       <w:pPr>
         <w:pStyle w:val="Heading3"/>
@@ -12142,8 +13393,8 @@
         <w:t xml:space="preserve">An independent review of an early version raised several points about how results could be misread. In response, the output now states that Fx and Fy are peaks reached a quarter turn apart rather than simultaneous values, labels every result as a worst-case estimate, identifies which inputs are estimates, and reports spin-up and spin-down twist separately. The built-in checks are also described as checks on the arithmetic, not on the physical inputs. Among them are the bearing identities of Equations (17) and (18), which hold for any bearing geometry, a roller-by-roller check of the bearing stiffness of Equation (22), and a numerical check of the waviness selection rule of Equation (24).</w:t>
       </w:r>
     </w:p>
-    <w:bookmarkEnd w:id="58"/>
-    <w:bookmarkStart w:id="62" w:name="implementation"/>
+    <w:bookmarkEnd w:id="60"/>
+    <w:bookmarkStart w:id="64" w:name="implementation"/>
     <w:p>
       <w:pPr>
         <w:pStyle w:val="Heading3"/>
@@ -12169,18 +13420,18 @@
           <wp:inline>
             <wp:extent cx="5334000" cy="3929062"/>
             <wp:effectExtent b="0" l="0" r="0" t="0"/>
-            <wp:docPr descr="Figure 1. Calculation flow of the analysis method." title="" id="60" name="Picture"/>
+            <wp:docPr descr="Figure 1. Calculation flow of the analysis method." title="" id="62" name="Picture"/>
             <a:graphic>
               <a:graphicData uri="http://schemas.openxmlformats.org/drawingml/2006/picture">
                 <pic:pic>
                   <pic:nvPicPr>
-                    <pic:cNvPr descr="flow.png" id="61" name="Picture"/>
+                    <pic:cNvPr descr="flow.png" id="63" name="Picture"/>
                     <pic:cNvPicPr>
                       <a:picLocks noChangeArrowheads="1" noChangeAspect="1"/>
                     </pic:cNvPicPr>
                   </pic:nvPicPr>
                   <pic:blipFill>
-                    <a:blip r:embed="rId59"/>
+                    <a:blip r:embed="rId61"/>
                     <a:stretch>
                       <a:fillRect/>
                     </a:stretch>
@@ -12215,9 +13466,9 @@
         <w:t xml:space="preserve">Figure 1. Calculation flow of the analysis method.</w:t>
       </w:r>
     </w:p>
-    <w:bookmarkEnd w:id="62"/>
-    <w:bookmarkEnd w:id="63"/>
-    <w:bookmarkStart w:id="64" w:name="assumptions-and-limitations"/>
+    <w:bookmarkEnd w:id="64"/>
+    <w:bookmarkEnd w:id="65"/>
+    <w:bookmarkStart w:id="66" w:name="assumptions-and-limitations"/>
     <w:p>
       <w:pPr>
         <w:pStyle w:val="Heading2"/>
@@ -12231,7 +13482,7 @@
         <w:pStyle w:val="FirstParagraph"/>
       </w:pPr>
       <w:r>
-        <w:t xml:space="preserve">The method rests on a small number of assumptions, each chosen either because it is the standard convention for source loads or because it errs toward a larger, safer answer. The parts are treated as rigid and the mount as perfectly stiff, which is the hard-mounted convention. All peaks are added as though they occur together, since the phases between sources are unknown. Fx and Fy are peak values of the same rotating force, reached a quarter turn apart, so the resultant lateral force equals Fx rather than √2 times Fx, and the same is true of Mx and My. Speed changes are taken to occur at a constant rate, and the shafts do not move in space, so there is no gyroscopic load from motion of the base.</w:t>
+        <w:t xml:space="preserve">The method rests on a small number of assumptions, each chosen either because it is the standard convention for source loads or because it errs toward a larger, safer answer. The parts are treated as rigid and the mount as perfectly stiff, which is the hard-mounted convention. All peaks are added as though they occur together, since the phases between sources are unknown. Fx and Fy are peak values of the same rotating force, reached a quarter turn apart, so the resultant lateral force equals Fx rather than √2 times Fx, and the same is true of Mx and My. Speed changes are taken to occur at a constant rate. Motor ripple and cogging are applied at full amplitude with no reduction for the speed control loop.</w:t>
       </w:r>
     </w:p>
     <w:p>
@@ -12247,11 +13498,11 @@
         <w:pStyle w:val="BodyText"/>
       </w:pPr>
       <w:r>
-        <w:t xml:space="preserve">Some effects are outside the scope of the method. It does not include structural resonance, which can raise the loads well above the hard-mounted values near a natural frequency. It does not include motor torque ripple or cogging, imbalance harmonics above the running speed, or broadband noise, and it does not model localized bearing defects such as spalls, which belong to failure analysis rather than to the induced loads of a healthy bearing. It also neglects the small tangential imbalance force during speed ramps, which is under 1% of the main force for ramps of around ten seconds.</w:t>
-      </w:r>
-    </w:p>
-    <w:bookmarkEnd w:id="64"/>
-    <w:bookmarkStart w:id="65" w:name="next-steps-and-conclusion"/>
+        <w:t xml:space="preserve">Some effects are outside the scope of the method. It does not include structural resonance, which can raise the loads well above the hard-mounted values near a natural frequency. It does not include broadband noise, which can only be measured, flexibility of the rotors themselves, small radial magnetic forces inside the motors, or localized bearing defects such as spalls, which belong to failure analysis rather than to the induced loads of a healthy bearing. Motor ripple, cogging and higher imbalance harmonics are included in the method but contribute only once their data is entered.</w:t>
+      </w:r>
+    </w:p>
+    <w:bookmarkEnd w:id="66"/>
+    <w:bookmarkStart w:id="67" w:name="next-steps-and-conclusion"/>
     <w:p>
       <w:pPr>
         <w:pStyle w:val="Heading2"/>
@@ -12265,7 +13516,7 @@
         <w:pStyle w:val="FirstParagraph"/>
       </w:pPr>
       <w:r>
-        <w:t xml:space="preserve">The next steps follow directly from the estimates and exclusions above. The final CAD mass properties, speeds, positions and bearing part numbers will be entered to produce the load values for our hardware. A couple imbalance requirement will be defined or confirmed with the rotor designers, and the bearing imperfection amplitudes with inspection data or supplier vibration data. Motor torque ripple can be added once the motor pole and slot counts and ripple data are known. The loads and the bearing frequencies will be passed to the structural analysis to check for modes close to any disturbance frequency, and once hardware is built, the assembly will be measured on a force table and compared with these estimates.</w:t>
+        <w:t xml:space="preserve">The next steps follow directly from the estimates and exclusions above. The final CAD mass properties, speeds, positions and bearing part numbers will be entered to produce the load values for our hardware. A couple imbalance requirement will be defined or confirmed with the rotor designers, and the bearing imperfection amplitudes with inspection data or supplier vibration data. The motor pole and slot counts and ripple and cogging amplitudes will be entered from the motor datasheets, and the spacecraft angular rates from the attitude profile. The loads and the bearing frequencies will be passed to the structural analysis to check for modes close to any disturbance frequency, and once hardware is built, the assembly will be measured on a force table and compared with these estimates.</w:t>
       </w:r>
     </w:p>
     <w:p>
@@ -12276,8 +13527,8 @@
         <w:t xml:space="preserve">Induced vibration from rotating machinery comes down to a short list of physical effects. A rotor whose center of mass is off its axis pushes sideways. A rotor whose principal axis is tilted rocks its shaft. A rotor that changes speed twists its mount. The bearings add small disturbances at frequencies set by their geometry, with sizes set by their stiffness, preload and imperfections. For our assembly, each of these was estimated from design data alone, in a form that is conservative, can be checked by hand, and can be refined one input at a time as better data becomes available.</w:t>
       </w:r>
     </w:p>
-    <w:bookmarkEnd w:id="65"/>
-    <w:bookmarkStart w:id="66" w:name="references"/>
+    <w:bookmarkEnd w:id="67"/>
+    <w:bookmarkStart w:id="68" w:name="references"/>
     <w:p>
       <w:pPr>
         <w:pStyle w:val="Heading2"/>
@@ -12370,8 +13621,8 @@
         <w:t xml:space="preserve">Reference documents provided for this task on induced vibration and disturbance modeling.</w:t>
       </w:r>
     </w:p>
-    <w:bookmarkEnd w:id="66"/>
-    <w:bookmarkEnd w:id="67"/>
+    <w:bookmarkEnd w:id="68"/>
+    <w:bookmarkEnd w:id="69"/>
     <w:sectPr/>
   </w:body>
 </w:document>

</xml_diff>

<commit_message>
White paper: match final script (motor ripple/cogging only, one waviness value at 0.1 um, no imbalance harmonics or stiffness override, varying compliance noted, new flow diagram)
Co-Authored-By: Claude Opus 5.5 <noreply@anthropic.com>
Claude-Session: https://claude.ai/code/session_01AcuW3xSnVc4HeTATtgPH4G
</commit_message>
<xml_diff>
--- a/white_paper/Induced_Vibration_White_Paper.docx
+++ b/white_paper/Induced_Vibration_White_Paper.docx
@@ -41,7 +41,7 @@
         <w:pStyle w:val="BodyText"/>
       </w:pPr>
       <w:r>
-        <w:t xml:space="preserve">The second part applies those ideas to our assembly, which consists of two momentum wheels and a rotating arm, each on its own stationary shaft with a pair of tapered roller bearings. With no test data available, a purely analytical method was developed that estimates the six load components Fx, Fy, Fz, Mx, My and Mz from CAD mass properties, the eccentricity specification, the operating speeds, and the bearing geometry, preload and specified imperfections. The paper describes the model, the choices made along the way and the reasons for them, and what the method does not cover. The resulting loads are conservative, hard-mounted estimates intended for early design, and they are meant to be refined as balance data, supplier data and test results become available.</w:t>
+        <w:t xml:space="preserve">The second part applies those ideas to our assembly, which consists of two momentum wheels and a rotating arm, each on its own stationary shaft with a pair of tapered roller bearings. With no test data available, a purely analytical method was developed that estimates the six load components Fx, Fy, Fz, Mx, My and Mz from CAD mass properties, the eccentricity specification, the operating speeds, and the bearing geometry, preload and waviness. The paper describes the model, the choices made along the way and the reasons for them, and what the method does not cover. The resulting loads are conservative, hard-mounted estimates intended for early design, and they are meant to be refined as balance data, supplier data and test results become available.</w:t>
       </w:r>
     </w:p>
     <w:bookmarkEnd w:id="20"/>
@@ -3458,19 +3458,7 @@
         <w:t xml:space="preserve">b</w:t>
       </w:r>
       <w:r>
-        <w:t xml:space="preserve">. An element that is oversize by Δ carries extra load and travels with the cage, giving a lateral force k</w:t>
-      </w:r>
-      <w:r>
-        <w:rPr>
-          <w:vertAlign w:val="subscript"/>
-        </w:rPr>
-        <w:t xml:space="preserve">r</w:t>
-      </w:r>
-      <w:r>
-        <w:t xml:space="preserve"> </w:t>
-      </w:r>
-      <w:r>
-        <w:t xml:space="preserve">Δ cos α at the cage frequency. Because the elements sit at the contact angle, every lateral disturbance has an axial partner:</w:t>
+        <w:t xml:space="preserve">. Because the elements sit at the contact angle, every lateral disturbance has an axial partner:</w:t>
       </w:r>
     </w:p>
     <w:p>
@@ -3960,7 +3948,15 @@
         <w:t xml:space="preserve"> </w:t>
       </w:r>
       <w:r>
-        <w:t xml:space="preserve">is usually several kilohertz, far above the bearing frequencies, and the transmitted force is a small fraction of the blocked force. The model is linear about the preloaded state and is valid only while the imperfections are small compared with the preload deflection δ_0, so that no rolling element unloads.</w:t>
+        <w:t xml:space="preserve">is usually several kilohertz, far above the bearing frequencies, and the transmitted force is a small fraction of the blocked force. The model is linear about the preloaded state and is valid only while the waviness is small compared with the preload deflection δ_0, so that no rolling element unloads.</w:t>
+      </w:r>
+    </w:p>
+    <w:p>
+      <w:pPr>
+        <w:pStyle w:val="BodyText"/>
+      </w:pPr>
+      <w:r>
+        <w:t xml:space="preserve">Even a perfectly made bearing is not entirely quiet. When it carries a sideways load, the number of rolling elements sharing that load changes as they move around, so the bearing stiffness varies slightly at the race pass frequency. This is known as varying compliance. In an axially preloaded pair every element is loaded evenly by the preload, and the sideways loads from imbalance are small by comparison, so this effect is small and is usually neglected.</w:t>
       </w:r>
     </w:p>
     <w:bookmarkEnd w:id="25"/>
@@ -5599,7 +5595,7 @@
               <w:jc w:val="left"/>
             </w:pPr>
             <w:r>
-              <w:t xml:space="preserve">Frequencies yes; amplitudes from geometry, preload and specified imperfections</w:t>
+              <w:t xml:space="preserve">Frequencies yes; amplitudes from geometry, preload and waviness</w:t>
             </w:r>
           </w:p>
         </w:tc>
@@ -7872,128 +7868,7 @@
               <w:jc w:val="left"/>
             </w:pPr>
             <w:r>
-              <w:t xml:space="preserve">Higher imbalance harmonics (optional): h, C</w:t>
-            </w:r>
-            <w:r>
-              <w:rPr>
-                <w:vertAlign w:val="subscript"/>
-              </w:rPr>
-              <w:t xml:space="preserve">f</w:t>
-            </w:r>
-            <w:r>
-              <w:t xml:space="preserve">, C</w:t>
-            </w:r>
-            <w:r>
-              <w:rPr>
-                <w:vertAlign w:val="subscript"/>
-              </w:rPr>
-              <w:t xml:space="preserve">m</w:t>
-            </w:r>
-          </w:p>
-        </w:tc>
-        <w:tc>
-          <w:tcPr/>
-          <w:p>
-            <w:pPr>
-              <w:pStyle w:val="Compact"/>
-              <w:jc w:val="left"/>
-            </w:pPr>
-            <w:r>
-              <w:t xml:space="preserve">–</w:t>
-            </w:r>
-          </w:p>
-        </w:tc>
-        <w:tc>
-          <w:tcPr/>
-          <w:p>
-            <w:pPr>
-              <w:pStyle w:val="Compact"/>
-              <w:jc w:val="left"/>
-            </w:pPr>
-            <w:r>
-              <w:t xml:space="preserve">–, kg·m, kg·m²</w:t>
-            </w:r>
-          </w:p>
-        </w:tc>
-        <w:tc>
-          <w:tcPr/>
-          <w:p>
-            <w:pPr>
-              <w:pStyle w:val="Compact"/>
-              <w:jc w:val="left"/>
-            </w:pPr>
-            <w:r>
-              <w:t xml:space="preserve">Specification or test</w:t>
-            </w:r>
-          </w:p>
-        </w:tc>
-      </w:tr>
-      <w:tr>
-        <w:tc>
-          <w:tcPr/>
-          <w:p>
-            <w:pPr>
-              <w:pStyle w:val="Compact"/>
-              <w:jc w:val="left"/>
-            </w:pPr>
-            <w:r>
-              <w:t xml:space="preserve">Motor pole pairs and stator slots</w:t>
-            </w:r>
-          </w:p>
-        </w:tc>
-        <w:tc>
-          <w:tcPr/>
-          <w:p>
-            <w:pPr>
-              <w:pStyle w:val="Compact"/>
-              <w:jc w:val="left"/>
-            </w:pPr>
-            <w:r>
-              <w:t xml:space="preserve">p, N</w:t>
-            </w:r>
-            <w:r>
-              <w:rPr>
-                <w:vertAlign w:val="subscript"/>
-              </w:rPr>
-              <w:t xml:space="preserve">s</w:t>
-            </w:r>
-          </w:p>
-        </w:tc>
-        <w:tc>
-          <w:tcPr/>
-          <w:p>
-            <w:pPr>
-              <w:pStyle w:val="Compact"/>
-              <w:jc w:val="left"/>
-            </w:pPr>
-            <w:r>
-              <w:t xml:space="preserve">–</w:t>
-            </w:r>
-          </w:p>
-        </w:tc>
-        <w:tc>
-          <w:tcPr/>
-          <w:p>
-            <w:pPr>
-              <w:pStyle w:val="Compact"/>
-              <w:jc w:val="left"/>
-            </w:pPr>
-            <w:r>
-              <w:t xml:space="preserve">Motor datasheet</w:t>
-            </w:r>
-          </w:p>
-        </w:tc>
-      </w:tr>
-      <w:tr>
-        <w:tc>
-          <w:tcPr/>
-          <w:p>
-            <w:pPr>
-              <w:pStyle w:val="Compact"/>
-              <w:jc w:val="left"/>
-            </w:pPr>
-            <w:r>
-              <w:t xml:space="preserve">Motor torque ripple and cogging amplitudes, by harmonic</w:t>
+              <w:t xml:space="preserve">Motor torque ripple, peak</w:t>
             </w:r>
           </w:p>
         </w:tc>
@@ -8013,8 +7888,55 @@
               </w:rPr>
               <w:t xml:space="preserve">ripple</w:t>
             </w:r>
-            <w:r>
-              <w:t xml:space="preserve">, T</w:t>
+          </w:p>
+        </w:tc>
+        <w:tc>
+          <w:tcPr/>
+          <w:p>
+            <w:pPr>
+              <w:pStyle w:val="Compact"/>
+              <w:jc w:val="left"/>
+            </w:pPr>
+            <w:r>
+              <w:t xml:space="preserve">N·m</w:t>
+            </w:r>
+          </w:p>
+        </w:tc>
+        <w:tc>
+          <w:tcPr/>
+          <w:p>
+            <w:pPr>
+              <w:pStyle w:val="Compact"/>
+              <w:jc w:val="left"/>
+            </w:pPr>
+            <w:r>
+              <w:t xml:space="preserve">Motor datasheet</w:t>
+            </w:r>
+          </w:p>
+        </w:tc>
+      </w:tr>
+      <w:tr>
+        <w:tc>
+          <w:tcPr/>
+          <w:p>
+            <w:pPr>
+              <w:pStyle w:val="Compact"/>
+              <w:jc w:val="left"/>
+            </w:pPr>
+            <w:r>
+              <w:t xml:space="preserve">Motor cogging torque, peak</w:t>
+            </w:r>
+          </w:p>
+        </w:tc>
+        <w:tc>
+          <w:tcPr/>
+          <w:p>
+            <w:pPr>
+              <w:pStyle w:val="Compact"/>
+              <w:jc w:val="left"/>
+            </w:pPr>
+            <w:r>
+              <w:t xml:space="preserve">T</w:t>
             </w:r>
             <w:r>
               <w:rPr>
@@ -8044,7 +7966,7 @@
               <w:jc w:val="left"/>
             </w:pPr>
             <w:r>
-              <w:t xml:space="preserve">Motor datasheet or test</w:t>
+              <w:t xml:space="preserve">Motor datasheet</w:t>
             </w:r>
           </w:p>
         </w:tc>
@@ -8065,7 +7987,7 @@
         <w:pStyle w:val="FirstParagraph"/>
       </w:pPr>
       <w:r>
-        <w:t xml:space="preserve">Each rotating part has its own pair of tapered roller bearings, bearing A and bearing B. Their geometry comes from the manufacturer’s catalog for the selected part number, and the imperfection amplitudes are entered separately for each bearing.</w:t>
+        <w:t xml:space="preserve">Each rotating part has its own pair of tapered roller bearings, bearing A and bearing B. Their geometry comes from the manufacturer’s catalog for the selected part number. A single waviness value is entered for each pair.</w:t>
       </w:r>
     </w:p>
     <w:tbl>
@@ -8455,63 +8377,7 @@
               <w:jc w:val="left"/>
             </w:pPr>
             <w:r>
-              <w:t xml:space="preserve">Bearing radial stiffness (optional)</w:t>
-            </w:r>
-          </w:p>
-        </w:tc>
-        <w:tc>
-          <w:tcPr/>
-          <w:p>
-            <w:pPr>
-              <w:pStyle w:val="Compact"/>
-              <w:jc w:val="left"/>
-            </w:pPr>
-            <w:r>
-              <w:t xml:space="preserve">K</w:t>
-            </w:r>
-            <w:r>
-              <w:rPr>
-                <w:vertAlign w:val="subscript"/>
-              </w:rPr>
-              <w:t xml:space="preserve">rad</w:t>
-            </w:r>
-          </w:p>
-        </w:tc>
-        <w:tc>
-          <w:tcPr/>
-          <w:p>
-            <w:pPr>
-              <w:pStyle w:val="Compact"/>
-              <w:jc w:val="left"/>
-            </w:pPr>
-            <w:r>
-              <w:t xml:space="preserve">N/m</w:t>
-            </w:r>
-          </w:p>
-        </w:tc>
-        <w:tc>
-          <w:tcPr/>
-          <w:p>
-            <w:pPr>
-              <w:pStyle w:val="Compact"/>
-              <w:jc w:val="left"/>
-            </w:pPr>
-            <w:r>
-              <w:t xml:space="preserve">Supplier, when available</w:t>
-            </w:r>
-          </w:p>
-        </w:tc>
-      </w:tr>
-      <w:tr>
-        <w:tc>
-          <w:tcPr/>
-          <w:p>
-            <w:pPr>
-              <w:pStyle w:val="Compact"/>
-              <w:jc w:val="left"/>
-            </w:pPr>
-            <w:r>
-              <w:t xml:space="preserve">Outer race waviness, bearing A and B</w:t>
+              <w:t xml:space="preserve">Waviness of the races and rollers</w:t>
             </w:r>
           </w:p>
         </w:tc>
@@ -8525,12 +8391,6 @@
             <w:r>
               <w:t xml:space="preserve">A</w:t>
             </w:r>
-            <w:r>
-              <w:rPr>
-                <w:vertAlign w:val="subscript"/>
-              </w:rPr>
-              <w:t xml:space="preserve">o</w:t>
-            </w:r>
           </w:p>
         </w:tc>
         <w:tc>
@@ -8553,280 +8413,20 @@
               <w:jc w:val="left"/>
             </w:pPr>
             <w:r>
-              <w:t xml:space="preserve">Bearing precision class or drawing</w:t>
-            </w:r>
-          </w:p>
-        </w:tc>
-      </w:tr>
-      <w:tr>
-        <w:tc>
-          <w:tcPr/>
-          <w:p>
-            <w:pPr>
-              <w:pStyle w:val="Compact"/>
-              <w:jc w:val="left"/>
-            </w:pPr>
-            <w:r>
-              <w:t xml:space="preserve">Inner race waviness, bearing A and B</w:t>
-            </w:r>
-          </w:p>
-        </w:tc>
-        <w:tc>
-          <w:tcPr/>
-          <w:p>
-            <w:pPr>
-              <w:pStyle w:val="Compact"/>
-              <w:jc w:val="left"/>
-            </w:pPr>
-            <w:r>
-              <w:t xml:space="preserve">A</w:t>
-            </w:r>
-            <w:r>
-              <w:rPr>
-                <w:vertAlign w:val="subscript"/>
-              </w:rPr>
-              <w:t xml:space="preserve">i</w:t>
-            </w:r>
-          </w:p>
-        </w:tc>
-        <w:tc>
-          <w:tcPr/>
-          <w:p>
-            <w:pPr>
-              <w:pStyle w:val="Compact"/>
-              <w:jc w:val="left"/>
-            </w:pPr>
-            <w:r>
-              <w:t xml:space="preserve">µm</w:t>
-            </w:r>
-          </w:p>
-        </w:tc>
-        <w:tc>
-          <w:tcPr/>
-          <w:p>
-            <w:pPr>
-              <w:pStyle w:val="Compact"/>
-              <w:jc w:val="left"/>
-            </w:pPr>
-            <w:r>
-              <w:t xml:space="preserve">Bearing precision class or drawing</w:t>
-            </w:r>
-          </w:p>
-        </w:tc>
-      </w:tr>
-      <w:tr>
-        <w:tc>
-          <w:tcPr/>
-          <w:p>
-            <w:pPr>
-              <w:pStyle w:val="Compact"/>
-              <w:jc w:val="left"/>
-            </w:pPr>
-            <w:r>
-              <w:t xml:space="preserve">Roller waviness, bearing A and B</w:t>
-            </w:r>
-          </w:p>
-        </w:tc>
-        <w:tc>
-          <w:tcPr/>
-          <w:p>
-            <w:pPr>
-              <w:pStyle w:val="Compact"/>
-              <w:jc w:val="left"/>
-            </w:pPr>
-            <w:r>
-              <w:t xml:space="preserve">A</w:t>
-            </w:r>
-            <w:r>
-              <w:rPr>
-                <w:vertAlign w:val="subscript"/>
-              </w:rPr>
-              <w:t xml:space="preserve">b</w:t>
-            </w:r>
-          </w:p>
-        </w:tc>
-        <w:tc>
-          <w:tcPr/>
-          <w:p>
-            <w:pPr>
-              <w:pStyle w:val="Compact"/>
-              <w:jc w:val="left"/>
-            </w:pPr>
-            <w:r>
-              <w:t xml:space="preserve">µm</w:t>
-            </w:r>
-          </w:p>
-        </w:tc>
-        <w:tc>
-          <w:tcPr/>
-          <w:p>
-            <w:pPr>
-              <w:pStyle w:val="Compact"/>
-              <w:jc w:val="left"/>
-            </w:pPr>
-            <w:r>
-              <w:t xml:space="preserve">Bearing precision class or drawing</w:t>
-            </w:r>
-          </w:p>
-        </w:tc>
-      </w:tr>
-      <w:tr>
-        <w:tc>
-          <w:tcPr/>
-          <w:p>
-            <w:pPr>
-              <w:pStyle w:val="Compact"/>
-              <w:jc w:val="left"/>
-            </w:pPr>
-            <w:r>
-              <w:t xml:space="preserve">Roller diameter variation, bearing A and B</w:t>
-            </w:r>
-          </w:p>
-        </w:tc>
-        <w:tc>
-          <w:tcPr/>
-          <w:p>
-            <w:pPr>
-              <w:pStyle w:val="Compact"/>
-              <w:jc w:val="left"/>
-            </w:pPr>
-            <w:r>
-              <w:t xml:space="preserve">Δ</w:t>
-            </w:r>
-          </w:p>
-        </w:tc>
-        <w:tc>
-          <w:tcPr/>
-          <w:p>
-            <w:pPr>
-              <w:pStyle w:val="Compact"/>
-              <w:jc w:val="left"/>
-            </w:pPr>
-            <w:r>
-              <w:t xml:space="preserve">µm</w:t>
-            </w:r>
-          </w:p>
-        </w:tc>
-        <w:tc>
-          <w:tcPr/>
-          <w:p>
-            <w:pPr>
-              <w:pStyle w:val="Compact"/>
-              <w:jc w:val="left"/>
-            </w:pPr>
-            <w:r>
-              <w:t xml:space="preserve">Bearing precision class or drawing</w:t>
-            </w:r>
-          </w:p>
-        </w:tc>
-      </w:tr>
-      <w:tr>
-        <w:tc>
-          <w:tcPr/>
-          <w:p>
-            <w:pPr>
-              <w:pStyle w:val="Compact"/>
-              <w:jc w:val="left"/>
-            </w:pPr>
-            <w:r>
-              <w:t xml:space="preserve">Number of harmonics included</w:t>
-            </w:r>
-          </w:p>
-        </w:tc>
-        <w:tc>
-          <w:tcPr/>
-          <w:p>
-            <w:pPr>
-              <w:pStyle w:val="Compact"/>
-              <w:jc w:val="left"/>
-            </w:pPr>
-            <w:r>
-              <w:t xml:space="preserve">k</w:t>
-            </w:r>
-            <w:r>
-              <w:rPr>
-                <w:vertAlign w:val="subscript"/>
-              </w:rPr>
-              <w:t xml:space="preserve">max</w:t>
-            </w:r>
-          </w:p>
-        </w:tc>
-        <w:tc>
-          <w:tcPr/>
-          <w:p>
-            <w:pPr>
-              <w:pStyle w:val="Compact"/>
-              <w:jc w:val="left"/>
-            </w:pPr>
-            <w:r>
-              <w:t xml:space="preserve">–</w:t>
-            </w:r>
-          </w:p>
-        </w:tc>
-        <w:tc>
-          <w:tcPr/>
-          <w:p>
-            <w:pPr>
-              <w:pStyle w:val="Compact"/>
-              <w:jc w:val="left"/>
-            </w:pPr>
-            <w:r>
-              <w:t xml:space="preserve">Analysis setting (2)</w:t>
-            </w:r>
-          </w:p>
-        </w:tc>
-      </w:tr>
-      <w:tr>
-        <w:tc>
-          <w:tcPr/>
-          <w:p>
-            <w:pPr>
-              <w:pStyle w:val="Compact"/>
-              <w:jc w:val="left"/>
-            </w:pPr>
-            <w:r>
-              <w:t xml:space="preserve">Damping ratio of the rotor-bearing modes</w:t>
-            </w:r>
-          </w:p>
-        </w:tc>
-        <w:tc>
-          <w:tcPr/>
-          <w:p>
-            <w:pPr>
-              <w:pStyle w:val="Compact"/>
-              <w:jc w:val="left"/>
-            </w:pPr>
-            <w:r>
-              <w:t xml:space="preserve">ζ</w:t>
-            </w:r>
-          </w:p>
-        </w:tc>
-        <w:tc>
-          <w:tcPr/>
-          <w:p>
-            <w:pPr>
-              <w:pStyle w:val="Compact"/>
-              <w:jc w:val="left"/>
-            </w:pPr>
-            <w:r>
-              <w:t xml:space="preserve">–</w:t>
-            </w:r>
-          </w:p>
-        </w:tc>
-        <w:tc>
-          <w:tcPr/>
-          <w:p>
-            <w:pPr>
-              <w:pStyle w:val="Compact"/>
-              <w:jc w:val="left"/>
-            </w:pPr>
-            <w:r>
-              <w:t xml:space="preserve">Assumed (0.03)</w:t>
+              <w:t xml:space="preserve">Bearing supplier (0.1 µm assumed until available)</w:t>
             </w:r>
           </w:p>
         </w:tc>
       </w:tr>
     </w:tbl>
+    <w:p>
+      <w:pPr>
+        <w:pStyle w:val="BodyText"/>
+      </w:pPr>
+      <w:r>
+        <w:t xml:space="preserve">Two further values are fixed inside the analysis rather than entered: the number of bearing harmonics, k = 1 and 2, and the damping ratio of the rotor-bearing modes, ζ = 0.03.</w:t>
+      </w:r>
+    </w:p>
     <w:bookmarkEnd w:id="41"/>
     <w:bookmarkStart w:id="42" w:name="operating-and-reporting-inputs"/>
     <w:p>
@@ -9193,7 +8793,7 @@
         <w:pStyle w:val="FirstParagraph"/>
       </w:pPr>
       <w:r>
-        <w:t xml:space="preserve">Most inputs are taken directly from CAD, specifications or catalogs. The imbalance values are specified limits rather than predictions, for the reasons given in Section 2.3. The bearing imperfection amplitudes are specified values: they should be taken from the bearing precision class or the drawing tolerances, and replaced with measured values when inspection data is available. The damping ratio is an assumed typical value.</w:t>
+        <w:t xml:space="preserve">Most inputs are taken directly from CAD, specifications or catalogs. The imbalance values are specified limits rather than predictions, for the reasons given in Section 2.3. Bearing waviness is not normally listed in a catalog. Until the supplier provides a value, it is taken as 0.1 µm, the upper end of the range of about 0.01 to 0.1 µm typical for precision bearings, so that the bearing loads err on the high side. The same value is used for the outer race, the inner race and the rollers of both bearings in a pair. The damping ratio is an assumed typical value.</w:t>
       </w:r>
     </w:p>
     <w:p>
@@ -9945,96 +9545,6 @@
         <w:t xml:space="preserve">is zero and these reduce to Equations (50) and (51).</w:t>
       </w:r>
     </w:p>
-    <w:p>
-      <w:pPr>
-        <w:pStyle w:val="BodyText"/>
-      </w:pPr>
-      <w:r>
-        <w:rPr>
-          <w:bCs/>
-          <w:b/>
-        </w:rPr>
-        <w:t xml:space="preserve">Higher imbalance harmonics.</w:t>
-      </w:r>
-      <w:r>
-        <w:t xml:space="preserve"> </w:t>
-      </w:r>
-      <w:r>
-        <w:t xml:space="preserve">Misalignment, runout and fits can produce imbalance-like loads at whole multiples h of the running speed. When coefficients are available, from a specification or a test, each harmonic h adds a lateral force C</w:t>
-      </w:r>
-      <w:r>
-        <w:rPr>
-          <w:vertAlign w:val="subscript"/>
-        </w:rPr>
-        <w:t xml:space="preserve">f</w:t>
-      </w:r>
-      <w:r>
-        <w:t xml:space="preserve"> </w:t>
-      </w:r>
-      <w:r>
-        <w:t xml:space="preserve">Ω</w:t>
-      </w:r>
-      <w:r>
-        <w:rPr>
-          <w:vertAlign w:val="subscript"/>
-        </w:rPr>
-        <w:t xml:space="preserve">w</w:t>
-      </w:r>
-      <w:r>
-        <w:t xml:space="preserve">² and a rocking moment C</w:t>
-      </w:r>
-      <w:r>
-        <w:rPr>
-          <w:vertAlign w:val="subscript"/>
-        </w:rPr>
-        <w:t xml:space="preserve">m</w:t>
-      </w:r>
-      <w:r>
-        <w:t xml:space="preserve"> </w:t>
-      </w:r>
-      <w:r>
-        <w:t xml:space="preserve">Ω</w:t>
-      </w:r>
-      <w:r>
-        <w:rPr>
-          <w:vertAlign w:val="subscript"/>
-        </w:rPr>
-        <w:t xml:space="preserve">w</w:t>
-      </w:r>
-      <w:r>
-        <w:t xml:space="preserve">² at frequency h f</w:t>
-      </w:r>
-      <w:r>
-        <w:rPr>
-          <w:vertAlign w:val="subscript"/>
-        </w:rPr>
-        <w:t xml:space="preserve">r</w:t>
-      </w:r>
-      <w:r>
-        <w:t xml:space="preserve">, in the form of Equation (40). These are added to F</w:t>
-      </w:r>
-      <w:r>
-        <w:rPr>
-          <w:vertAlign w:val="subscript"/>
-        </w:rPr>
-        <w:t xml:space="preserve">w</w:t>
-      </w:r>
-      <w:r>
-        <w:t xml:space="preserve"> </w:t>
-      </w:r>
-      <w:r>
-        <w:t xml:space="preserve">and M</w:t>
-      </w:r>
-      <w:r>
-        <w:rPr>
-          <w:vertAlign w:val="subscript"/>
-        </w:rPr>
-        <w:t xml:space="preserve">w</w:t>
-      </w:r>
-      <w:r>
-        <w:t xml:space="preserve">. Seen from the stationary shaft, each appears on the two sideways axes as a pair of equal sinusoids, 90° apart, as in Equations (45) and (46).</w:t>
-      </w:r>
-    </w:p>
     <w:bookmarkEnd w:id="46"/>
     <w:bookmarkStart w:id="47" w:name="moments-at-the-reference-point"/>
     <w:p>
@@ -10711,7 +10221,7 @@
         <w:t xml:space="preserve"> </w:t>
       </w:r>
       <w:r>
-        <w:t xml:space="preserve">taken as that part’s own rotor frequency. The preload gives the roller load and stiffness through Equations (19) to (21), and the bearing radial and axial stiffness through Equations (22) and (23). If the supplier gives a radial stiffness, it is used instead and the roller stiffness is found from Equation (22).</w:t>
+        <w:t xml:space="preserve">taken as that part’s own rotor frequency. The preload gives the roller load and stiffness through Equations (19) to (21), and the bearing radial and axial stiffness through Equations (22) and (23).</w:t>
       </w:r>
     </w:p>
     <w:p>
@@ -10953,16 +10463,7 @@
         <w:pStyle w:val="FirstParagraph"/>
       </w:pPr>
       <w:r>
-        <w:t xml:space="preserve">For each bearing and each harmonic k = 1 to k</w:t>
-      </w:r>
-      <w:r>
-        <w:rPr>
-          <w:vertAlign w:val="subscript"/>
-        </w:rPr>
-        <w:t xml:space="preserve">max</w:t>
-      </w:r>
-      <w:r>
-        <w:t xml:space="preserve">, the specified imperfections give the following disturbance lines, with f</w:t>
+        <w:t xml:space="preserve">For each bearing and each harmonic k = 1 and 2, the waviness A gives the following disturbance lines, with f</w:t>
       </w:r>
       <w:r>
         <w:rPr>
@@ -11136,7 +10637,45 @@
               <w:t xml:space="preserve"> </w:t>
             </w:r>
             <w:r>
-              <w:t xml:space="preserve">A</w:t>
+              <w:t xml:space="preserve">A cos α</w:t>
+            </w:r>
+          </w:p>
+        </w:tc>
+      </w:tr>
+      <w:tr>
+        <w:tc>
+          <w:tcPr/>
+          <w:p>
+            <w:pPr>
+              <w:pStyle w:val="Compact"/>
+              <w:jc w:val="left"/>
+            </w:pPr>
+            <w:r>
+              <w:t xml:space="preserve">Inner race waviness, q = kZ</w:t>
+            </w:r>
+          </w:p>
+        </w:tc>
+        <w:tc>
+          <w:tcPr/>
+          <w:p>
+            <w:pPr>
+              <w:pStyle w:val="Compact"/>
+              <w:jc w:val="left"/>
+            </w:pPr>
+            <w:r>
+              <w:t xml:space="preserve">Axial</w:t>
+            </w:r>
+          </w:p>
+        </w:tc>
+        <w:tc>
+          <w:tcPr/>
+          <w:p>
+            <w:pPr>
+              <w:pStyle w:val="Compact"/>
+              <w:jc w:val="left"/>
+            </w:pPr>
+            <w:r>
+              <w:t xml:space="preserve">k f</w:t>
             </w:r>
             <w:r>
               <w:rPr>
@@ -11144,56 +10683,6 @@
               </w:rPr>
               <w:t xml:space="preserve">i</w:t>
             </w:r>
-            <w:r>
-              <w:t xml:space="preserve"> </w:t>
-            </w:r>
-            <w:r>
-              <w:t xml:space="preserve">cos α</w:t>
-            </w:r>
-          </w:p>
-        </w:tc>
-      </w:tr>
-      <w:tr>
-        <w:tc>
-          <w:tcPr/>
-          <w:p>
-            <w:pPr>
-              <w:pStyle w:val="Compact"/>
-              <w:jc w:val="left"/>
-            </w:pPr>
-            <w:r>
-              <w:t xml:space="preserve">Inner race waviness, q = kZ</w:t>
-            </w:r>
-          </w:p>
-        </w:tc>
-        <w:tc>
-          <w:tcPr/>
-          <w:p>
-            <w:pPr>
-              <w:pStyle w:val="Compact"/>
-              <w:jc w:val="left"/>
-            </w:pPr>
-            <w:r>
-              <w:t xml:space="preserve">Axial</w:t>
-            </w:r>
-          </w:p>
-        </w:tc>
-        <w:tc>
-          <w:tcPr/>
-          <w:p>
-            <w:pPr>
-              <w:pStyle w:val="Compact"/>
-              <w:jc w:val="left"/>
-            </w:pPr>
-            <w:r>
-              <w:t xml:space="preserve">k f</w:t>
-            </w:r>
-            <w:r>
-              <w:rPr>
-                <w:vertAlign w:val="subscript"/>
-              </w:rPr>
-              <w:t xml:space="preserve">i</w:t>
-            </w:r>
           </w:p>
         </w:tc>
         <w:tc>
@@ -11216,19 +10705,7 @@
               <w:t xml:space="preserve"> </w:t>
             </w:r>
             <w:r>
-              <w:t xml:space="preserve">A</w:t>
-            </w:r>
-            <w:r>
-              <w:rPr>
-                <w:vertAlign w:val="subscript"/>
-              </w:rPr>
-              <w:t xml:space="preserve">i</w:t>
-            </w:r>
-            <w:r>
-              <w:t xml:space="preserve"> </w:t>
-            </w:r>
-            <w:r>
-              <w:t xml:space="preserve">sin α</w:t>
+              <w:t xml:space="preserve">A sin α</w:t>
             </w:r>
           </w:p>
         </w:tc>
@@ -11308,7 +10785,45 @@
               <w:t xml:space="preserve"> </w:t>
             </w:r>
             <w:r>
-              <w:t xml:space="preserve">A</w:t>
+              <w:t xml:space="preserve">A cos α</w:t>
+            </w:r>
+          </w:p>
+        </w:tc>
+      </w:tr>
+      <w:tr>
+        <w:tc>
+          <w:tcPr/>
+          <w:p>
+            <w:pPr>
+              <w:pStyle w:val="Compact"/>
+              <w:jc w:val="left"/>
+            </w:pPr>
+            <w:r>
+              <w:t xml:space="preserve">Outer race waviness, q = kZ − 1</w:t>
+            </w:r>
+          </w:p>
+        </w:tc>
+        <w:tc>
+          <w:tcPr/>
+          <w:p>
+            <w:pPr>
+              <w:pStyle w:val="Compact"/>
+              <w:jc w:val="left"/>
+            </w:pPr>
+            <w:r>
+              <w:t xml:space="preserve">Lateral</w:t>
+            </w:r>
+          </w:p>
+        </w:tc>
+        <w:tc>
+          <w:tcPr/>
+          <w:p>
+            <w:pPr>
+              <w:pStyle w:val="Compact"/>
+              <w:jc w:val="left"/>
+            </w:pPr>
+            <w:r>
+              <w:t xml:space="preserve">|k f</w:t>
             </w:r>
             <w:r>
               <w:rPr>
@@ -11320,7 +10835,40 @@
               <w:t xml:space="preserve"> </w:t>
             </w:r>
             <w:r>
-              <w:t xml:space="preserve">cos α</w:t>
+              <w:t xml:space="preserve">− f</w:t>
+            </w:r>
+            <w:r>
+              <w:rPr>
+                <w:vertAlign w:val="subscript"/>
+              </w:rPr>
+              <w:t xml:space="preserve">r</w:t>
+            </w:r>
+            <w:r>
+              <w:t xml:space="preserve">|</w:t>
+            </w:r>
+          </w:p>
+        </w:tc>
+        <w:tc>
+          <w:tcPr/>
+          <w:p>
+            <w:pPr>
+              <w:pStyle w:val="Compact"/>
+              <w:jc w:val="left"/>
+            </w:pPr>
+            <w:r>
+              <w:t xml:space="preserve">(Z/2) k</w:t>
+            </w:r>
+            <w:r>
+              <w:rPr>
+                <w:vertAlign w:val="subscript"/>
+              </w:rPr>
+              <w:t xml:space="preserve">r</w:t>
+            </w:r>
+            <w:r>
+              <w:t xml:space="preserve"> </w:t>
+            </w:r>
+            <w:r>
+              <w:t xml:space="preserve">A cos α</w:t>
             </w:r>
           </w:p>
         </w:tc>
@@ -11334,31 +10882,31 @@
               <w:jc w:val="left"/>
             </w:pPr>
             <w:r>
-              <w:t xml:space="preserve">Outer race waviness, q = kZ − 1</w:t>
-            </w:r>
-          </w:p>
-        </w:tc>
-        <w:tc>
-          <w:tcPr/>
-          <w:p>
-            <w:pPr>
-              <w:pStyle w:val="Compact"/>
-              <w:jc w:val="left"/>
-            </w:pPr>
-            <w:r>
-              <w:t xml:space="preserve">Lateral</w:t>
-            </w:r>
-          </w:p>
-        </w:tc>
-        <w:tc>
-          <w:tcPr/>
-          <w:p>
-            <w:pPr>
-              <w:pStyle w:val="Compact"/>
-              <w:jc w:val="left"/>
-            </w:pPr>
-            <w:r>
-              <w:t xml:space="preserve">|k f</w:t>
+              <w:t xml:space="preserve">Outer race waviness, q = kZ</w:t>
+            </w:r>
+          </w:p>
+        </w:tc>
+        <w:tc>
+          <w:tcPr/>
+          <w:p>
+            <w:pPr>
+              <w:pStyle w:val="Compact"/>
+              <w:jc w:val="left"/>
+            </w:pPr>
+            <w:r>
+              <w:t xml:space="preserve">Axial</w:t>
+            </w:r>
+          </w:p>
+        </w:tc>
+        <w:tc>
+          <w:tcPr/>
+          <w:p>
+            <w:pPr>
+              <w:pStyle w:val="Compact"/>
+              <w:jc w:val="left"/>
+            </w:pPr>
+            <w:r>
+              <w:t xml:space="preserve">k f</w:t>
             </w:r>
             <w:r>
               <w:rPr>
@@ -11366,11 +10914,17 @@
               </w:rPr>
               <w:t xml:space="preserve">o</w:t>
             </w:r>
-            <w:r>
-              <w:t xml:space="preserve"> </w:t>
-            </w:r>
-            <w:r>
-              <w:t xml:space="preserve">− f</w:t>
+          </w:p>
+        </w:tc>
+        <w:tc>
+          <w:tcPr/>
+          <w:p>
+            <w:pPr>
+              <w:pStyle w:val="Compact"/>
+              <w:jc w:val="left"/>
+            </w:pPr>
+            <w:r>
+              <w:t xml:space="preserve">Z k</w:t>
             </w:r>
             <w:r>
               <w:rPr>
@@ -11379,19 +10933,78 @@
               <w:t xml:space="preserve">r</w:t>
             </w:r>
             <w:r>
-              <w:t xml:space="preserve">|</w:t>
-            </w:r>
-          </w:p>
-        </w:tc>
-        <w:tc>
-          <w:tcPr/>
-          <w:p>
-            <w:pPr>
-              <w:pStyle w:val="Compact"/>
-              <w:jc w:val="left"/>
-            </w:pPr>
-            <w:r>
-              <w:t xml:space="preserve">(Z/2) k</w:t>
+              <w:t xml:space="preserve"> </w:t>
+            </w:r>
+            <w:r>
+              <w:t xml:space="preserve">A sin α</w:t>
+            </w:r>
+          </w:p>
+        </w:tc>
+      </w:tr>
+      <w:tr>
+        <w:tc>
+          <w:tcPr/>
+          <w:p>
+            <w:pPr>
+              <w:pStyle w:val="Compact"/>
+              <w:jc w:val="left"/>
+            </w:pPr>
+            <w:r>
+              <w:t xml:space="preserve">Roller waviness, q = 2k</w:t>
+            </w:r>
+          </w:p>
+        </w:tc>
+        <w:tc>
+          <w:tcPr/>
+          <w:p>
+            <w:pPr>
+              <w:pStyle w:val="Compact"/>
+              <w:jc w:val="left"/>
+            </w:pPr>
+            <w:r>
+              <w:t xml:space="preserve">Lateral</w:t>
+            </w:r>
+          </w:p>
+        </w:tc>
+        <w:tc>
+          <w:tcPr/>
+          <w:p>
+            <w:pPr>
+              <w:pStyle w:val="Compact"/>
+              <w:jc w:val="left"/>
+            </w:pPr>
+            <w:r>
+              <w:t xml:space="preserve">2k f</w:t>
+            </w:r>
+            <w:r>
+              <w:rPr>
+                <w:vertAlign w:val="subscript"/>
+              </w:rPr>
+              <w:t xml:space="preserve">b</w:t>
+            </w:r>
+            <w:r>
+              <w:t xml:space="preserve"> </w:t>
+            </w:r>
+            <w:r>
+              <w:t xml:space="preserve">± f</w:t>
+            </w:r>
+            <w:r>
+              <w:rPr>
+                <w:vertAlign w:val="subscript"/>
+              </w:rPr>
+              <w:t xml:space="preserve">c</w:t>
+            </w:r>
+          </w:p>
+        </w:tc>
+        <w:tc>
+          <w:tcPr/>
+          <w:p>
+            <w:pPr>
+              <w:pStyle w:val="Compact"/>
+              <w:jc w:val="left"/>
+            </w:pPr>
+            <w:r>
+              <w:t xml:space="preserve">Z k</w:t>
             </w:r>
             <w:r>
               <w:rPr>
@@ -11403,75 +11016,63 @@
               <w:t xml:space="preserve"> </w:t>
             </w:r>
             <w:r>
-              <w:t xml:space="preserve">A</w:t>
+              <w:t xml:space="preserve">A cos α</w:t>
+            </w:r>
+          </w:p>
+        </w:tc>
+      </w:tr>
+      <w:tr>
+        <w:tc>
+          <w:tcPr/>
+          <w:p>
+            <w:pPr>
+              <w:pStyle w:val="Compact"/>
+              <w:jc w:val="left"/>
+            </w:pPr>
+            <w:r>
+              <w:t xml:space="preserve">Roller waviness, q = 2k</w:t>
+            </w:r>
+          </w:p>
+        </w:tc>
+        <w:tc>
+          <w:tcPr/>
+          <w:p>
+            <w:pPr>
+              <w:pStyle w:val="Compact"/>
+              <w:jc w:val="left"/>
+            </w:pPr>
+            <w:r>
+              <w:t xml:space="preserve">Axial</w:t>
+            </w:r>
+          </w:p>
+        </w:tc>
+        <w:tc>
+          <w:tcPr/>
+          <w:p>
+            <w:pPr>
+              <w:pStyle w:val="Compact"/>
+              <w:jc w:val="left"/>
+            </w:pPr>
+            <w:r>
+              <w:t xml:space="preserve">2k f</w:t>
             </w:r>
             <w:r>
               <w:rPr>
                 <w:vertAlign w:val="subscript"/>
               </w:rPr>
-              <w:t xml:space="preserve">o</w:t>
-            </w:r>
-            <w:r>
-              <w:t xml:space="preserve"> </w:t>
-            </w:r>
-            <w:r>
-              <w:t xml:space="preserve">cos α</w:t>
-            </w:r>
-          </w:p>
-        </w:tc>
-      </w:tr>
-      <w:tr>
-        <w:tc>
-          <w:tcPr/>
-          <w:p>
-            <w:pPr>
-              <w:pStyle w:val="Compact"/>
-              <w:jc w:val="left"/>
-            </w:pPr>
-            <w:r>
-              <w:t xml:space="preserve">Outer race waviness, q = kZ</w:t>
-            </w:r>
-          </w:p>
-        </w:tc>
-        <w:tc>
-          <w:tcPr/>
-          <w:p>
-            <w:pPr>
-              <w:pStyle w:val="Compact"/>
-              <w:jc w:val="left"/>
-            </w:pPr>
-            <w:r>
-              <w:t xml:space="preserve">Axial</w:t>
-            </w:r>
-          </w:p>
-        </w:tc>
-        <w:tc>
-          <w:tcPr/>
-          <w:p>
-            <w:pPr>
-              <w:pStyle w:val="Compact"/>
-              <w:jc w:val="left"/>
-            </w:pPr>
-            <w:r>
-              <w:t xml:space="preserve">k f</w:t>
-            </w:r>
-            <w:r>
-              <w:rPr>
-                <w:vertAlign w:val="subscript"/>
-              </w:rPr>
-              <w:t xml:space="preserve">o</w:t>
-            </w:r>
-          </w:p>
-        </w:tc>
-        <w:tc>
-          <w:tcPr/>
-          <w:p>
-            <w:pPr>
-              <w:pStyle w:val="Compact"/>
-              <w:jc w:val="left"/>
-            </w:pPr>
-            <w:r>
-              <w:t xml:space="preserve">Z k</w:t>
+              <w:t xml:space="preserve">b</w:t>
+            </w:r>
+          </w:p>
+        </w:tc>
+        <w:tc>
+          <w:tcPr/>
+          <w:p>
+            <w:pPr>
+              <w:pStyle w:val="Compact"/>
+              <w:jc w:val="left"/>
+            </w:pPr>
+            <w:r>
+              <w:t xml:space="preserve">2 Z k</w:t>
             </w:r>
             <w:r>
               <w:rPr>
@@ -11483,283 +11084,7 @@
               <w:t xml:space="preserve"> </w:t>
             </w:r>
             <w:r>
-              <w:t xml:space="preserve">A</w:t>
-            </w:r>
-            <w:r>
-              <w:rPr>
-                <w:vertAlign w:val="subscript"/>
-              </w:rPr>
-              <w:t xml:space="preserve">o</w:t>
-            </w:r>
-            <w:r>
-              <w:t xml:space="preserve"> </w:t>
-            </w:r>
-            <w:r>
-              <w:t xml:space="preserve">sin α</w:t>
-            </w:r>
-          </w:p>
-        </w:tc>
-      </w:tr>
-      <w:tr>
-        <w:tc>
-          <w:tcPr/>
-          <w:p>
-            <w:pPr>
-              <w:pStyle w:val="Compact"/>
-              <w:jc w:val="left"/>
-            </w:pPr>
-            <w:r>
-              <w:t xml:space="preserve">Roller waviness, q = 2k</w:t>
-            </w:r>
-          </w:p>
-        </w:tc>
-        <w:tc>
-          <w:tcPr/>
-          <w:p>
-            <w:pPr>
-              <w:pStyle w:val="Compact"/>
-              <w:jc w:val="left"/>
-            </w:pPr>
-            <w:r>
-              <w:t xml:space="preserve">Lateral</w:t>
-            </w:r>
-          </w:p>
-        </w:tc>
-        <w:tc>
-          <w:tcPr/>
-          <w:p>
-            <w:pPr>
-              <w:pStyle w:val="Compact"/>
-              <w:jc w:val="left"/>
-            </w:pPr>
-            <w:r>
-              <w:t xml:space="preserve">2k f</w:t>
-            </w:r>
-            <w:r>
-              <w:rPr>
-                <w:vertAlign w:val="subscript"/>
-              </w:rPr>
-              <w:t xml:space="preserve">b</w:t>
-            </w:r>
-            <w:r>
-              <w:t xml:space="preserve"> </w:t>
-            </w:r>
-            <w:r>
-              <w:t xml:space="preserve">± f</w:t>
-            </w:r>
-            <w:r>
-              <w:rPr>
-                <w:vertAlign w:val="subscript"/>
-              </w:rPr>
-              <w:t xml:space="preserve">c</w:t>
-            </w:r>
-          </w:p>
-        </w:tc>
-        <w:tc>
-          <w:tcPr/>
-          <w:p>
-            <w:pPr>
-              <w:pStyle w:val="Compact"/>
-              <w:jc w:val="left"/>
-            </w:pPr>
-            <w:r>
-              <w:t xml:space="preserve">n</w:t>
-            </w:r>
-            <w:r>
-              <w:rPr>
-                <w:vertAlign w:val="subscript"/>
-              </w:rPr>
-              <w:t xml:space="preserve">b</w:t>
-            </w:r>
-            <w:r>
-              <w:t xml:space="preserve"> </w:t>
-            </w:r>
-            <w:r>
-              <w:t xml:space="preserve">k</w:t>
-            </w:r>
-            <w:r>
-              <w:rPr>
-                <w:vertAlign w:val="subscript"/>
-              </w:rPr>
-              <w:t xml:space="preserve">r</w:t>
-            </w:r>
-            <w:r>
-              <w:t xml:space="preserve"> </w:t>
-            </w:r>
-            <w:r>
-              <w:t xml:space="preserve">A</w:t>
-            </w:r>
-            <w:r>
-              <w:rPr>
-                <w:vertAlign w:val="subscript"/>
-              </w:rPr>
-              <w:t xml:space="preserve">b</w:t>
-            </w:r>
-            <w:r>
-              <w:t xml:space="preserve"> </w:t>
-            </w:r>
-            <w:r>
-              <w:t xml:space="preserve">cos α</w:t>
-            </w:r>
-          </w:p>
-        </w:tc>
-      </w:tr>
-      <w:tr>
-        <w:tc>
-          <w:tcPr/>
-          <w:p>
-            <w:pPr>
-              <w:pStyle w:val="Compact"/>
-              <w:jc w:val="left"/>
-            </w:pPr>
-            <w:r>
-              <w:t xml:space="preserve">Roller waviness, q = 2k</w:t>
-            </w:r>
-          </w:p>
-        </w:tc>
-        <w:tc>
-          <w:tcPr/>
-          <w:p>
-            <w:pPr>
-              <w:pStyle w:val="Compact"/>
-              <w:jc w:val="left"/>
-            </w:pPr>
-            <w:r>
-              <w:t xml:space="preserve">Axial</w:t>
-            </w:r>
-          </w:p>
-        </w:tc>
-        <w:tc>
-          <w:tcPr/>
-          <w:p>
-            <w:pPr>
-              <w:pStyle w:val="Compact"/>
-              <w:jc w:val="left"/>
-            </w:pPr>
-            <w:r>
-              <w:t xml:space="preserve">2k f</w:t>
-            </w:r>
-            <w:r>
-              <w:rPr>
-                <w:vertAlign w:val="subscript"/>
-              </w:rPr>
-              <w:t xml:space="preserve">b</w:t>
-            </w:r>
-          </w:p>
-        </w:tc>
-        <w:tc>
-          <w:tcPr/>
-          <w:p>
-            <w:pPr>
-              <w:pStyle w:val="Compact"/>
-              <w:jc w:val="left"/>
-            </w:pPr>
-            <w:r>
-              <w:t xml:space="preserve">2 n</w:t>
-            </w:r>
-            <w:r>
-              <w:rPr>
-                <w:vertAlign w:val="subscript"/>
-              </w:rPr>
-              <w:t xml:space="preserve">b</w:t>
-            </w:r>
-            <w:r>
-              <w:t xml:space="preserve"> </w:t>
-            </w:r>
-            <w:r>
-              <w:t xml:space="preserve">k</w:t>
-            </w:r>
-            <w:r>
-              <w:rPr>
-                <w:vertAlign w:val="subscript"/>
-              </w:rPr>
-              <w:t xml:space="preserve">r</w:t>
-            </w:r>
-            <w:r>
-              <w:t xml:space="preserve"> </w:t>
-            </w:r>
-            <w:r>
-              <w:t xml:space="preserve">A</w:t>
-            </w:r>
-            <w:r>
-              <w:rPr>
-                <w:vertAlign w:val="subscript"/>
-              </w:rPr>
-              <w:t xml:space="preserve">b</w:t>
-            </w:r>
-            <w:r>
-              <w:t xml:space="preserve"> </w:t>
-            </w:r>
-            <w:r>
-              <w:t xml:space="preserve">sin α</w:t>
-            </w:r>
-          </w:p>
-        </w:tc>
-      </w:tr>
-      <w:tr>
-        <w:tc>
-          <w:tcPr/>
-          <w:p>
-            <w:pPr>
-              <w:pStyle w:val="Compact"/>
-              <w:jc w:val="left"/>
-            </w:pPr>
-            <w:r>
-              <w:t xml:space="preserve">Roller diameter variation</w:t>
-            </w:r>
-          </w:p>
-        </w:tc>
-        <w:tc>
-          <w:tcPr/>
-          <w:p>
-            <w:pPr>
-              <w:pStyle w:val="Compact"/>
-              <w:jc w:val="left"/>
-            </w:pPr>
-            <w:r>
-              <w:t xml:space="preserve">Lateral</w:t>
-            </w:r>
-          </w:p>
-        </w:tc>
-        <w:tc>
-          <w:tcPr/>
-          <w:p>
-            <w:pPr>
-              <w:pStyle w:val="Compact"/>
-              <w:jc w:val="left"/>
-            </w:pPr>
-            <w:r>
-              <w:t xml:space="preserve">f</w:t>
-            </w:r>
-            <w:r>
-              <w:rPr>
-                <w:vertAlign w:val="subscript"/>
-              </w:rPr>
-              <w:t xml:space="preserve">c</w:t>
-            </w:r>
-          </w:p>
-        </w:tc>
-        <w:tc>
-          <w:tcPr/>
-          <w:p>
-            <w:pPr>
-              <w:pStyle w:val="Compact"/>
-              <w:jc w:val="left"/>
-            </w:pPr>
-            <w:r>
-              <w:t xml:space="preserve">k</w:t>
-            </w:r>
-            <w:r>
-              <w:rPr>
-                <w:vertAlign w:val="subscript"/>
-              </w:rPr>
-              <w:t xml:space="preserve">r</w:t>
-            </w:r>
-            <w:r>
-              <w:t xml:space="preserve"> </w:t>
-            </w:r>
-            <w:r>
-              <w:t xml:space="preserve">Δ cos α</w:t>
+              <w:t xml:space="preserve">A sin α</w:t>
             </w:r>
           </w:p>
         </w:tc>
@@ -11770,19 +11095,7 @@
         <w:pStyle w:val="BodyText"/>
       </w:pPr>
       <w:r>
-        <w:t xml:space="preserve">Here n</w:t>
-      </w:r>
-      <w:r>
-        <w:rPr>
-          <w:vertAlign w:val="subscript"/>
-        </w:rPr>
-        <w:t xml:space="preserve">b</w:t>
-      </w:r>
-      <w:r>
-        <w:t xml:space="preserve"> </w:t>
-      </w:r>
-      <w:r>
-        <w:t xml:space="preserve">is Z when the waviness of all rollers is assumed in phase (worst case) or √Z when their phases are taken as random. Each blocked force is converted to the force at the shaft with Equation (28), using the lateral or axial natural frequency. Lines from bearing A and bearing B fall at the same frequencies and are added. Within each rotor, all lateral lines are added to give the bearing Fx and Fy, and all axial lines to give Fz:</w:t>
+        <w:t xml:space="preserve">The waviness of all Z rollers is taken in phase, which is the worst case. Each blocked force is converted to the force at the shaft with Equation (28), using the lateral or axial natural frequency. Lines from bearing A and bearing B fall at the same frequencies and are added. Within each rotor, all lateral lines are added to give the bearing Fx and Fy, and all axial lines to give Fz:</w:t>
       </w:r>
     </w:p>
     <w:p>
@@ -12180,7 +11493,7 @@
         <w:pStyle w:val="FirstParagraph"/>
       </w:pPr>
       <w:r>
-        <w:t xml:space="preserve">Below the natural frequency the bearing force reaches the shaft as the reaction to the rotor’s motion, so it is taken to act at the rotor’s center of mass, a distance L from the reference point. The linear model is checked by comparing the largest combined imperfection with the preload deflection δ_0 of Equation (20), and a warning is given if rollers could unload.</w:t>
+        <w:t xml:space="preserve">Below the natural frequency the bearing force reaches the shaft as the reaction to the rotor’s motion, so it is taken to act at the rotor’s center of mass, a distance L from the reference point. The linear model is checked by comparing the largest combined waviness with the preload deflection δ_0 of Equation (20), and a warning is given if rollers could unload.</w:t>
       </w:r>
     </w:p>
     <w:bookmarkEnd w:id="49"/>
@@ -12198,73 +11511,31 @@
         <w:pStyle w:val="FirstParagraph"/>
       </w:pPr>
       <w:r>
-        <w:t xml:space="preserve">When the motor data is available, each motor adds torque lines about its spin axis. For a three-phase motor with p pole pairs and N</w:t>
+        <w:t xml:space="preserve">When the motor data is available, each motor adds a twist about its spin axis. Only the peak torque ripple T</w:t>
       </w:r>
       <w:r>
         <w:rPr>
           <w:vertAlign w:val="subscript"/>
         </w:rPr>
-        <w:t xml:space="preserve">s</w:t>
+        <w:t xml:space="preserve">ripple</w:t>
       </w:r>
       <w:r>
         <w:t xml:space="preserve"> </w:t>
       </w:r>
       <w:r>
-        <w:t xml:space="preserve">slots, ripple lines fall at 6 n p f</w:t>
+        <w:t xml:space="preserve">and peak cogging torque T</w:t>
       </w:r>
       <w:r>
         <w:rPr>
           <w:vertAlign w:val="subscript"/>
         </w:rPr>
-        <w:t xml:space="preserve">r</w:t>
+        <w:t xml:space="preserve">cog</w:t>
       </w:r>
       <w:r>
         <w:t xml:space="preserve"> </w:t>
       </w:r>
       <w:r>
-        <w:t xml:space="preserve">and cogging lines at n LCM(N</w:t>
-      </w:r>
-      <w:r>
-        <w:rPr>
-          <w:vertAlign w:val="subscript"/>
-        </w:rPr>
-        <w:t xml:space="preserve">s</w:t>
-      </w:r>
-      <w:r>
-        <w:t xml:space="preserve">, 2p) f</w:t>
-      </w:r>
-      <w:r>
-        <w:rPr>
-          <w:vertAlign w:val="subscript"/>
-        </w:rPr>
-        <w:t xml:space="preserve">r</w:t>
-      </w:r>
-      <w:r>
-        <w:t xml:space="preserve">, Equations (32) and (33), with amplitudes T</w:t>
-      </w:r>
-      <w:r>
-        <w:rPr>
-          <w:vertAlign w:val="subscript"/>
-        </w:rPr>
-        <w:t xml:space="preserve">ripple,n</w:t>
-      </w:r>
-      <w:r>
-        <w:t xml:space="preserve"> </w:t>
-      </w:r>
-      <w:r>
-        <w:t xml:space="preserve">and T</w:t>
-      </w:r>
-      <w:r>
-        <w:rPr>
-          <w:vertAlign w:val="subscript"/>
-        </w:rPr>
-        <w:t xml:space="preserve">cog,n</w:t>
-      </w:r>
-      <w:r>
-        <w:t xml:space="preserve"> </w:t>
-      </w:r>
-      <w:r>
-        <w:t xml:space="preserve">from the datasheet or a test. A slotless motor has no cogging. The stator reaction passes into the structure, so each amplitude is applied as a torque about z, with no reduction for the speed control loop:</w:t>
+        <w:t xml:space="preserve">from the motor datasheet are needed; their frequencies follow from Equations (32) and (33) but are not required for the load values. The stator reaction passes into the structure, so both are applied as a torque about z, added at full value with no reduction for the speed control loop:</w:t>
       </w:r>
     </w:p>
     <w:p>
@@ -12318,142 +11589,84 @@
           </m:rPr>
           <m:t>=</m:t>
         </m:r>
-        <m:nary>
-          <m:naryPr>
-            <m:chr m:val="∑"/>
-            <m:limLoc m:val="undOvr"/>
-            <m:subHide m:val="off"/>
-            <m:supHide m:val="on"/>
-          </m:naryPr>
+        <m:sSub>
+          <m:e>
+            <m:r>
+              <m:t>T</m:t>
+            </m:r>
+          </m:e>
           <m:sub>
             <m:r>
-              <m:t>n</m:t>
+              <m:rPr>
+                <m:sty m:val="p"/>
+              </m:rPr>
+              <m:t>r</m:t>
+            </m:r>
+            <m:r>
+              <m:rPr>
+                <m:sty m:val="p"/>
+              </m:rPr>
+              <m:t>i</m:t>
+            </m:r>
+            <m:r>
+              <m:rPr>
+                <m:sty m:val="p"/>
+              </m:rPr>
+              <m:t>p</m:t>
+            </m:r>
+            <m:r>
+              <m:rPr>
+                <m:sty m:val="p"/>
+              </m:rPr>
+              <m:t>p</m:t>
+            </m:r>
+            <m:r>
+              <m:rPr>
+                <m:sty m:val="p"/>
+              </m:rPr>
+              <m:t>l</m:t>
+            </m:r>
+            <m:r>
+              <m:rPr>
+                <m:sty m:val="p"/>
+              </m:rPr>
+              <m:t>e</m:t>
             </m:r>
           </m:sub>
-          <m:sup>
-            <m:r>
-              <m:t>​</m:t>
-            </m:r>
-          </m:sup>
-          <m:e>
-            <m:sSub>
-              <m:e>
-                <m:r>
-                  <m:t>T</m:t>
-                </m:r>
-              </m:e>
-              <m:sub>
-                <m:r>
-                  <m:rPr>
-                    <m:sty m:val="p"/>
-                  </m:rPr>
-                  <m:t>r</m:t>
-                </m:r>
-                <m:r>
-                  <m:rPr>
-                    <m:sty m:val="p"/>
-                  </m:rPr>
-                  <m:t>i</m:t>
-                </m:r>
-                <m:r>
-                  <m:rPr>
-                    <m:sty m:val="p"/>
-                  </m:rPr>
-                  <m:t>p</m:t>
-                </m:r>
-                <m:r>
-                  <m:rPr>
-                    <m:sty m:val="p"/>
-                  </m:rPr>
-                  <m:t>p</m:t>
-                </m:r>
-                <m:r>
-                  <m:rPr>
-                    <m:sty m:val="p"/>
-                  </m:rPr>
-                  <m:t>l</m:t>
-                </m:r>
-                <m:r>
-                  <m:rPr>
-                    <m:sty m:val="p"/>
-                  </m:rPr>
-                  <m:t>e</m:t>
-                </m:r>
-                <m:r>
-                  <m:rPr>
-                    <m:sty m:val="p"/>
-                  </m:rPr>
-                  <m:t>,</m:t>
-                </m:r>
-                <m:r>
-                  <m:t>n</m:t>
-                </m:r>
-              </m:sub>
-            </m:sSub>
-          </m:e>
-        </m:nary>
+        </m:sSub>
         <m:r>
           <m:rPr>
             <m:sty m:val="p"/>
           </m:rPr>
           <m:t>+</m:t>
         </m:r>
-        <m:nary>
-          <m:naryPr>
-            <m:chr m:val="∑"/>
-            <m:limLoc m:val="undOvr"/>
-            <m:subHide m:val="off"/>
-            <m:supHide m:val="on"/>
-          </m:naryPr>
+        <m:sSub>
+          <m:e>
+            <m:r>
+              <m:t>T</m:t>
+            </m:r>
+          </m:e>
           <m:sub>
             <m:r>
-              <m:t>n</m:t>
+              <m:rPr>
+                <m:sty m:val="p"/>
+              </m:rPr>
+              <m:t>c</m:t>
+            </m:r>
+            <m:r>
+              <m:rPr>
+                <m:sty m:val="p"/>
+              </m:rPr>
+              <m:t>o</m:t>
+            </m:r>
+            <m:r>
+              <m:rPr>
+                <m:sty m:val="p"/>
+              </m:rPr>
+              <m:t>g</m:t>
             </m:r>
           </m:sub>
-          <m:sup>
-            <m:r>
-              <m:t>​</m:t>
-            </m:r>
-          </m:sup>
-          <m:e>
-            <m:sSub>
-              <m:e>
-                <m:r>
-                  <m:t>T</m:t>
-                </m:r>
-              </m:e>
-              <m:sub>
-                <m:r>
-                  <m:rPr>
-                    <m:sty m:val="p"/>
-                  </m:rPr>
-                  <m:t>c</m:t>
-                </m:r>
-                <m:r>
-                  <m:rPr>
-                    <m:sty m:val="p"/>
-                  </m:rPr>
-                  <m:t>o</m:t>
-                </m:r>
-                <m:r>
-                  <m:rPr>
-                    <m:sty m:val="p"/>
-                  </m:rPr>
-                  <m:t>g</m:t>
-                </m:r>
-                <m:r>
-                  <m:rPr>
-                    <m:sty m:val="p"/>
-                  </m:rPr>
-                  <m:t>,</m:t>
-                </m:r>
-                <m:r>
-                  <m:t>n</m:t>
-                </m:r>
-              </m:sub>
-            </m:sSub>
-          </m:e>
-        </m:nary>
+        </m:sSub>
       </m:oMath>
       <w:r>
         <w:tab/>
@@ -12847,10 +12060,7 @@
               <w:t xml:space="preserve">w</w:t>
             </w:r>
             <w:r>
-              <w:t xml:space="preserve"> </w:t>
-            </w:r>
-            <w:r>
-              <w:t xml:space="preserve">with harmonics, Equation (52)</w:t>
+              <w:t xml:space="preserve">, Equation (52)</w:t>
             </w:r>
           </w:p>
         </w:tc>
@@ -13210,7 +12420,7 @@
         <w:pStyle w:val="BodyText"/>
       </w:pPr>
       <w:r>
-        <w:t xml:space="preserve">The method is built around the full calculation first, with every input it needs defined in advance, so that values can be entered as they become available. It includes every source of Section 2 that has a deterministic model: static and couple imbalance with their acceleration terms, higher imbalance harmonics, motor reaction torque, the tapered roller bearings, motor torque ripple and cogging, and the gyroscopic moment from motion of the spacecraft. Sources whose data has not yet been entered, such as motor ripple or imbalance harmonics, are reported as not included rather than estimated. Broadband noise is the one source left out entirely, because it has no deterministic model and can only be measured.</w:t>
+        <w:t xml:space="preserve">The method is built around the full calculation first, with every input it needs defined in advance, so that values can be entered as they become available. It includes every source of Section 2 that has a deterministic model: static and couple imbalance with their acceleration terms, motor reaction torque, the tapered roller bearings, motor torque ripple and cogging, and the gyroscopic moment from motion of the spacecraft. Sources whose data has not yet been entered, such as motor ripple and cogging, are reported as not included rather than estimated. Broadband noise is the one source left out entirely, because it has no deterministic model and can only be measured.</w:t>
       </w:r>
     </w:p>
     <w:bookmarkEnd w:id="54"/>
@@ -13340,7 +12550,7 @@
         <w:pStyle w:val="BodyText"/>
       </w:pPr>
       <w:r>
-        <w:t xml:space="preserve">The amplitudes follow from physics, but they depend on the imperfections specified. An earlier version of the method estimated each bearing harmonic as a fixed fraction of the imbalance force and treated each bearing pair as a single source with four harmonics. That approach was replaced. The current model builds the bearing stiffness from the catalog geometry and the preload, uses the classical waviness selection rule of Equation (24) to find which imperfection orders produce a net force and at which frequency, and passes each blocked force through the rotor-bearing dynamics of Equation (28). Each bearing of a pair is treated separately, with its own imperfection amplitudes, and each source produces its own set of lines at its own frequencies, rather than a single lumped set of four.</w:t>
+        <w:t xml:space="preserve">The amplitudes follow from physics, but they depend on the waviness. An earlier version of the method estimated each bearing harmonic as a fixed fraction of the imbalance force and treated each bearing pair as a single source with four harmonics. That approach was replaced. The current model builds the bearing stiffness from the catalog geometry and the preload, uses the classical waviness selection rule of Equation (24) to find which waviness orders produce a net force and at which frequency, and passes each blocked force through the rotor-bearing dynamics of Equation (28). Each bearing of a pair is treated separately, and the outer race, inner race and rollers each produce their own lines at their own frequencies, rather than a single lumped set of four.</w:t>
       </w:r>
     </w:p>
     <w:p>
@@ -13348,7 +12558,7 @@
         <w:pStyle w:val="BodyText"/>
       </w:pPr>
       <w:r>
-        <w:t xml:space="preserve">This makes the bearing loads traceable: every line can be followed back to a specific imperfection on a specific bearing, and the effect of a tighter tolerance class or a higher preload can be seen directly. Its accuracy rests on the imperfection amplitudes. Precision-class tolerances give a defensible starting value; inspection data on the actual bearings, or supplier vibration data, should replace them when available.</w:t>
+        <w:t xml:space="preserve">This makes the bearing loads traceable: every line can be followed back to a specific bearing surface, and the effect of a smaller waviness or a higher preload can be seen directly. Its accuracy rests on the waviness value. The assumed 0.1 µm is a conservative starting point; the supplier’s waviness limit, or supplier vibration data, should replace it when available. The bearing forces scale directly with the waviness, so halving it halves them.</w:t>
       </w:r>
     </w:p>
     <w:bookmarkEnd w:id="59"/>
@@ -13408,7 +12618,7 @@
         <w:pStyle w:val="FirstParagraph"/>
       </w:pPr>
       <w:r>
-        <w:t xml:space="preserve">The method is implemented in a single MATLAB script. The only part a user edits is the input section, where each rotating part has its own block of clearly named values. Static and couple imbalance can each be entered in whichever form the balance specification uses, and any required value left blank is reported by name before the calculation runs. When the script runs, it calculates every source, sums the loads, runs a set of arithmetic checks, plots the lateral and axial force against speed, and prints the results in four parts followed by the loads at other speeds. The flow is shown in Figure 1.</w:t>
+        <w:t xml:space="preserve">The method is implemented in a single MATLAB script. The only part a user edits is the input section, where each rotating part has its own block of clearly named values. Static and couple imbalance can each be entered in whichever form the balance specification uses, and any required value left blank is reported by name before the calculation runs. When the script runs, it calculates every source, sums the loads, runs a set of arithmetic checks, plots the lateral and axial force against speed, and prints the results in five parts followed by the loads at other speeds. The flow is shown in Figure 1.</w:t>
       </w:r>
     </w:p>
     <w:p>
@@ -13418,7 +12628,7 @@
       <w:r>
         <w:drawing>
           <wp:inline>
-            <wp:extent cx="5334000" cy="3929062"/>
+            <wp:extent cx="5334000" cy="4000500"/>
             <wp:effectExtent b="0" l="0" r="0" t="0"/>
             <wp:docPr descr="Figure 1. Calculation flow of the analysis method." title="" id="62" name="Picture"/>
             <a:graphic>
@@ -13439,7 +12649,7 @@
                   <pic:spPr bwMode="auto">
                     <a:xfrm>
                       <a:off x="0" y="0"/>
-                      <a:ext cx="5334000" cy="3929062"/>
+                      <a:ext cx="5334000" cy="4000500"/>
                     </a:xfrm>
                     <a:prstGeom prst="rect">
                       <a:avLst/>
@@ -13490,7 +12700,7 @@
         <w:pStyle w:val="BodyText"/>
       </w:pPr>
       <w:r>
-        <w:t xml:space="preserve">The imbalance values are specified limits, not measurements. Where no couple limit is specified, it is taken as the static tolerance in two planes with the residuals opposed, which should be confirmed or replaced by a couple requirement. The bearing loads are only as good as the specified imperfection amplitudes, which come from tolerance classes rather than measurement. The bearing model is linear about the preload and assumes every roller stays loaded. It uses Palmgren’s empirical line-contact relation for stiffness, includes only the rotor’s lateral and axial modes on its bearings (not its rocking mode), adds the lines of both bearings and all sources in phase, and assumes a typical damping ratio.</w:t>
+        <w:t xml:space="preserve">The imbalance values are specified limits, not measurements. Where no couple limit is specified, it is taken as the static tolerance in two planes with the residuals opposed, which should be confirmed or replaced by a couple requirement. The bearing loads are only as good as the waviness value, which is assumed at 0.1 µm until supplier data is available. The bearing model is linear about the preload and assumes every roller stays loaded. It uses Palmgren’s empirical line-contact relation for stiffness, includes only the rotor’s lateral and axial modes on its bearings (not its rocking mode), adds the lines of both bearings and all sources in phase, and assumes a typical damping ratio.</w:t>
       </w:r>
     </w:p>
     <w:p>
@@ -13498,7 +12708,7 @@
         <w:pStyle w:val="BodyText"/>
       </w:pPr>
       <w:r>
-        <w:t xml:space="preserve">Some effects are outside the scope of the method. It does not include structural resonance, which can raise the loads well above the hard-mounted values near a natural frequency. It does not include broadband noise, which can only be measured, flexibility of the rotors themselves, small radial magnetic forces inside the motors, or localized bearing defects such as spalls, which belong to failure analysis rather than to the induced loads of a healthy bearing. Motor ripple, cogging and higher imbalance harmonics are included in the method but contribute only once their data is entered.</w:t>
+        <w:t xml:space="preserve">Some effects are outside the scope of the method. It does not include structural resonance, which can raise the loads well above the hard-mounted values near a natural frequency. It does not include broadband noise, which can only be measured, flexibility of the rotors themselves, small radial magnetic forces inside the motors, or localized bearing defects such as spalls, which belong to failure analysis rather than to the induced loads of a healthy bearing. Imbalance harmonics above once per revolution and bearing varying compliance are not included; the latter is small because the bearings are preloaded and the sideways loads are small compared with the preload. Motor ripple and cogging are included in the method but contribute only once their data is entered.</w:t>
       </w:r>
     </w:p>
     <w:bookmarkEnd w:id="66"/>
@@ -13516,7 +12726,7 @@
         <w:pStyle w:val="FirstParagraph"/>
       </w:pPr>
       <w:r>
-        <w:t xml:space="preserve">The next steps follow directly from the estimates and exclusions above. The final CAD mass properties, speeds, positions and bearing part numbers will be entered to produce the load values for our hardware. A couple imbalance requirement will be defined or confirmed with the rotor designers, and the bearing imperfection amplitudes with inspection data or supplier vibration data. The motor pole and slot counts and ripple and cogging amplitudes will be entered from the motor datasheets, and the spacecraft angular rates from the attitude profile. The loads and the bearing frequencies will be passed to the structural analysis to check for modes close to any disturbance frequency, and once hardware is built, the assembly will be measured on a force table and compared with these estimates.</w:t>
+        <w:t xml:space="preserve">The next steps follow directly from the estimates and exclusions above. The final CAD mass properties, speeds, positions and bearing part numbers will be entered to produce the load values for our hardware. A couple imbalance requirement will be defined or confirmed with the rotor designers, and the assumed bearing waviness replaced with the supplier’s value. The motor ripple and cogging torques will be entered from the motor datasheets, and the spacecraft angular rates from the attitude profile. The loads and the bearing frequencies will be passed to the structural analysis to check for modes close to any disturbance frequency, and once hardware is built, the assembly will be measured on a force table and compared with these estimates.</w:t>
       </w:r>
     </w:p>
     <w:p>
@@ -13524,7 +12734,7 @@
         <w:pStyle w:val="BodyText"/>
       </w:pPr>
       <w:r>
-        <w:t xml:space="preserve">Induced vibration from rotating machinery comes down to a short list of physical effects. A rotor whose center of mass is off its axis pushes sideways. A rotor whose principal axis is tilted rocks its shaft. A rotor that changes speed twists its mount. The bearings add small disturbances at frequencies set by their geometry, with sizes set by their stiffness, preload and imperfections. For our assembly, each of these was estimated from design data alone, in a form that is conservative, can be checked by hand, and can be refined one input at a time as better data becomes available.</w:t>
+        <w:t xml:space="preserve">Induced vibration from rotating machinery comes down to a short list of physical effects. A rotor whose center of mass is off its axis pushes sideways. A rotor whose principal axis is tilted rocks its shaft. A rotor that changes speed twists its mount. The bearings add small disturbances at frequencies set by their geometry, with sizes set by their stiffness, preload and waviness. For our assembly, each of these was estimated from design data alone, in a form that is conservative, can be checked by hand, and can be refined one input at a time as better data becomes available.</w:t>
       </w:r>
     </w:p>
     <w:bookmarkEnd w:id="67"/>

</xml_diff>